<commit_message>
finished module02 + reto
</commit_message>
<xml_diff>
--- a/subjects/subject_words/java04_es_subject.docx
+++ b/subjects/subject_words/java04_es_subject.docx
@@ -430,7 +430,7 @@
           </mc:Choice>
           <mc:Fallback>
             <w:pict>
-              <v:shape w14:anchorId="2772CF19" id="Graphic 3" o:spid="_x0000_s1026" style="position:absolute;margin-left:86.45pt;margin-top:20.05pt;width:476.5pt;height:25.2pt;z-index:-251655680;visibility:visible;mso-wrap-style:square;mso-wrap-distance-left:0;mso-wrap-distance-top:0;mso-wrap-distance-right:0;mso-wrap-distance-bottom:0;mso-position-horizontal:absolute;mso-position-horizontal-relative:page;mso-position-vertical:absolute;mso-position-vertical-relative:text;v-text-anchor:top" coordsize="6051550,320040" o:gfxdata="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" path="m6051397,l5594197,,,12,,18605r5594197,l5594197,320040r457200,l6051397,xe" fillcolor="black" stroked="f">
+              <v:shape w14:anchorId="35DAF45D" id="Graphic 3" o:spid="_x0000_s1026" style="position:absolute;margin-left:86.45pt;margin-top:20.05pt;width:476.5pt;height:25.2pt;z-index:-251655680;visibility:visible;mso-wrap-style:square;mso-wrap-distance-left:0;mso-wrap-distance-top:0;mso-wrap-distance-right:0;mso-wrap-distance-bottom:0;mso-position-horizontal:absolute;mso-position-horizontal-relative:page;mso-position-vertical:absolute;mso-position-vertical-relative:text;v-text-anchor:top" coordsize="6051550,320040" o:gfxdata="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" path="m6051397,l5594197,,,12,,18605r5594197,l5594197,320040r457200,l6051397,xe" fillcolor="black" stroked="f">
                 <v:path arrowok="t"/>
                 <w10:wrap type="topAndBottom" anchorx="page"/>
               </v:shape>
@@ -456,7 +456,7 @@
         </w:sectPr>
       </w:pPr>
     </w:p>
-    <w:bookmarkStart w:id="0" w:name="_Toc234303995" w:displacedByCustomXml="next"/>
+    <w:bookmarkStart w:id="0" w:name="_Toc234312449" w:displacedByCustomXml="next"/>
     <w:sdt>
       <w:sdtPr>
         <w:rPr>
@@ -513,7 +513,7 @@
           <w:r>
             <w:fldChar w:fldCharType="separate"/>
           </w:r>
-          <w:hyperlink w:anchor="_Toc234303995" w:history="1">
+          <w:hyperlink w:anchor="_Toc234312449" w:history="1">
             <w:r>
               <w:rPr>
                 <w:rStyle w:val="Hipervnculo"/>
@@ -540,7 +540,7 @@
                 <w:noProof/>
                 <w:webHidden/>
               </w:rPr>
-              <w:instrText xml:space="preserve"> PAGEREF _Toc234303995 \h </w:instrText>
+              <w:instrText xml:space="preserve"> PAGEREF _Toc234312449 \h </w:instrText>
             </w:r>
             <w:r>
               <w:rPr>
@@ -586,7 +586,7 @@
               <w14:ligatures w14:val="standardContextual"/>
             </w:rPr>
           </w:pPr>
-          <w:hyperlink w:anchor="_Toc234303996" w:history="1">
+          <w:hyperlink w:anchor="_Toc234312450" w:history="1">
             <w:r>
               <w:rPr>
                 <w:rStyle w:val="Hipervnculo"/>
@@ -630,7 +630,7 @@
                 <w:noProof/>
                 <w:webHidden/>
               </w:rPr>
-              <w:instrText xml:space="preserve"> PAGEREF _Toc234303996 \h </w:instrText>
+              <w:instrText xml:space="preserve"> PAGEREF _Toc234312450 \h </w:instrText>
             </w:r>
             <w:r>
               <w:rPr>
@@ -676,7 +676,7 @@
               <w14:ligatures w14:val="standardContextual"/>
             </w:rPr>
           </w:pPr>
-          <w:hyperlink w:anchor="_Toc234303997" w:history="1">
+          <w:hyperlink w:anchor="_Toc234312451" w:history="1">
             <w:r>
               <w:rPr>
                 <w:rStyle w:val="Hipervnculo"/>
@@ -720,7 +720,7 @@
                 <w:noProof/>
                 <w:webHidden/>
               </w:rPr>
-              <w:instrText xml:space="preserve"> PAGEREF _Toc234303997 \h </w:instrText>
+              <w:instrText xml:space="preserve"> PAGEREF _Toc234312451 \h </w:instrText>
             </w:r>
             <w:r>
               <w:rPr>
@@ -766,7 +766,7 @@
               <w14:ligatures w14:val="standardContextual"/>
             </w:rPr>
           </w:pPr>
-          <w:hyperlink w:anchor="_Toc234303998" w:history="1">
+          <w:hyperlink w:anchor="_Toc234312452" w:history="1">
             <w:r>
               <w:rPr>
                 <w:rStyle w:val="Hipervnculo"/>
@@ -810,7 +810,7 @@
                 <w:noProof/>
                 <w:webHidden/>
               </w:rPr>
-              <w:instrText xml:space="preserve"> PAGEREF _Toc234303998 \h </w:instrText>
+              <w:instrText xml:space="preserve"> PAGEREF _Toc234312452 \h </w:instrText>
             </w:r>
             <w:r>
               <w:rPr>
@@ -856,7 +856,7 @@
               <w14:ligatures w14:val="standardContextual"/>
             </w:rPr>
           </w:pPr>
-          <w:hyperlink w:anchor="_Toc234303999" w:history="1">
+          <w:hyperlink w:anchor="_Toc234312453" w:history="1">
             <w:r>
               <w:rPr>
                 <w:rStyle w:val="Hipervnculo"/>
@@ -914,7 +914,23 @@
                 <w:noProof/>
                 <w:w w:val="90"/>
               </w:rPr>
-              <w:t>El Guion de la Misión</w:t>
+              <w:t>El</w:t>
+            </w:r>
+            <w:r>
+              <w:rPr>
+                <w:rStyle w:val="Hipervnculo"/>
+                <w:noProof/>
+                <w:w w:val="90"/>
+              </w:rPr>
+              <w:t xml:space="preserve"> </w:t>
+            </w:r>
+            <w:r>
+              <w:rPr>
+                <w:rStyle w:val="Hipervnculo"/>
+                <w:noProof/>
+                <w:w w:val="90"/>
+              </w:rPr>
+              <w:t>Guion de la Misión</w:t>
             </w:r>
             <w:r>
               <w:rPr>
@@ -935,7 +951,7 @@
                 <w:noProof/>
                 <w:webHidden/>
               </w:rPr>
-              <w:instrText xml:space="preserve"> PAGEREF _Toc234303999 \h </w:instrText>
+              <w:instrText xml:space="preserve"> PAGEREF _Toc234312453 \h </w:instrText>
             </w:r>
             <w:r>
               <w:rPr>
@@ -981,7 +997,7 @@
               <w14:ligatures w14:val="standardContextual"/>
             </w:rPr>
           </w:pPr>
-          <w:hyperlink w:anchor="_Toc234304000" w:history="1">
+          <w:hyperlink w:anchor="_Toc234312454" w:history="1">
             <w:r>
               <w:rPr>
                 <w:rStyle w:val="Hipervnculo"/>
@@ -1052,7 +1068,7 @@
                 <w:noProof/>
                 <w:webHidden/>
               </w:rPr>
-              <w:instrText xml:space="preserve"> PAGEREF _Toc234304000 \h </w:instrText>
+              <w:instrText xml:space="preserve"> PAGEREF _Toc234312454 \h </w:instrText>
             </w:r>
             <w:r>
               <w:rPr>
@@ -1098,7 +1114,7 @@
               <w14:ligatures w14:val="standardContextual"/>
             </w:rPr>
           </w:pPr>
-          <w:hyperlink w:anchor="_Toc234304001" w:history="1">
+          <w:hyperlink w:anchor="_Toc234312455" w:history="1">
             <w:r>
               <w:rPr>
                 <w:rStyle w:val="Hipervnculo"/>
@@ -1177,7 +1193,7 @@
                 <w:noProof/>
                 <w:webHidden/>
               </w:rPr>
-              <w:instrText xml:space="preserve"> PAGEREF _Toc234304001 \h </w:instrText>
+              <w:instrText xml:space="preserve"> PAGEREF _Toc234312455 \h </w:instrText>
             </w:r>
             <w:r>
               <w:rPr>
@@ -1223,7 +1239,7 @@
               <w14:ligatures w14:val="standardContextual"/>
             </w:rPr>
           </w:pPr>
-          <w:hyperlink w:anchor="_Toc234304002" w:history="1">
+          <w:hyperlink w:anchor="_Toc234312456" w:history="1">
             <w:r>
               <w:rPr>
                 <w:rStyle w:val="Hipervnculo"/>
@@ -1302,7 +1318,7 @@
                 <w:noProof/>
                 <w:webHidden/>
               </w:rPr>
-              <w:instrText xml:space="preserve"> PAGEREF _Toc234304002 \h </w:instrText>
+              <w:instrText xml:space="preserve"> PAGEREF _Toc234312456 \h </w:instrText>
             </w:r>
             <w:r>
               <w:rPr>
@@ -1348,7 +1364,7 @@
               <w14:ligatures w14:val="standardContextual"/>
             </w:rPr>
           </w:pPr>
-          <w:hyperlink w:anchor="_Toc234304003" w:history="1">
+          <w:hyperlink w:anchor="_Toc234312457" w:history="1">
             <w:r>
               <w:rPr>
                 <w:rStyle w:val="Hipervnculo"/>
@@ -1419,7 +1435,7 @@
                 <w:noProof/>
                 <w:webHidden/>
               </w:rPr>
-              <w:instrText xml:space="preserve"> PAGEREF _Toc234304003 \h </w:instrText>
+              <w:instrText xml:space="preserve"> PAGEREF _Toc234312457 \h </w:instrText>
             </w:r>
             <w:r>
               <w:rPr>
@@ -1465,7 +1481,7 @@
               <w14:ligatures w14:val="standardContextual"/>
             </w:rPr>
           </w:pPr>
-          <w:hyperlink w:anchor="_Toc234304004" w:history="1">
+          <w:hyperlink w:anchor="_Toc234312458" w:history="1">
             <w:r>
               <w:rPr>
                 <w:rStyle w:val="Hipervnculo"/>
@@ -1544,7 +1560,7 @@
                 <w:noProof/>
                 <w:webHidden/>
               </w:rPr>
-              <w:instrText xml:space="preserve"> PAGEREF _Toc234304004 \h </w:instrText>
+              <w:instrText xml:space="preserve"> PAGEREF _Toc234312458 \h </w:instrText>
             </w:r>
             <w:r>
               <w:rPr>
@@ -1590,7 +1606,7 @@
               <w14:ligatures w14:val="standardContextual"/>
             </w:rPr>
           </w:pPr>
-          <w:hyperlink w:anchor="_Toc234304005" w:history="1">
+          <w:hyperlink w:anchor="_Toc234312459" w:history="1">
             <w:r>
               <w:rPr>
                 <w:rStyle w:val="Hipervnculo"/>
@@ -1652,7 +1668,7 @@
                 <w:noProof/>
                 <w:webHidden/>
               </w:rPr>
-              <w:instrText xml:space="preserve"> PAGEREF _Toc234304005 \h </w:instrText>
+              <w:instrText xml:space="preserve"> PAGEREF _Toc234312459 \h </w:instrText>
             </w:r>
             <w:r>
               <w:rPr>
@@ -1698,7 +1714,7 @@
               <w14:ligatures w14:val="standardContextual"/>
             </w:rPr>
           </w:pPr>
-          <w:hyperlink w:anchor="_Toc234304006" w:history="1">
+          <w:hyperlink w:anchor="_Toc234312460" w:history="1">
             <w:r>
               <w:rPr>
                 <w:rStyle w:val="Hipervnculo"/>
@@ -1760,7 +1776,7 @@
                 <w:noProof/>
                 <w:webHidden/>
               </w:rPr>
-              <w:instrText xml:space="preserve"> PAGEREF _Toc234304006 \h </w:instrText>
+              <w:instrText xml:space="preserve"> PAGEREF _Toc234312460 \h </w:instrText>
             </w:r>
             <w:r>
               <w:rPr>
@@ -1806,7 +1822,7 @@
               <w14:ligatures w14:val="standardContextual"/>
             </w:rPr>
           </w:pPr>
-          <w:hyperlink w:anchor="_Toc234304007" w:history="1">
+          <w:hyperlink w:anchor="_Toc234312461" w:history="1">
             <w:r>
               <w:rPr>
                 <w:rStyle w:val="Hipervnculo"/>
@@ -1868,7 +1884,7 @@
                 <w:noProof/>
                 <w:webHidden/>
               </w:rPr>
-              <w:instrText xml:space="preserve"> PAGEREF _Toc234304007 \h </w:instrText>
+              <w:instrText xml:space="preserve"> PAGEREF _Toc234312461 \h </w:instrText>
             </w:r>
             <w:r>
               <w:rPr>
@@ -1914,7 +1930,7 @@
               <w14:ligatures w14:val="standardContextual"/>
             </w:rPr>
           </w:pPr>
-          <w:hyperlink w:anchor="_Toc234304008" w:history="1">
+          <w:hyperlink w:anchor="_Toc234312462" w:history="1">
             <w:r>
               <w:rPr>
                 <w:rStyle w:val="Hipervnculo"/>
@@ -1959,7 +1975,7 @@
                 <w:noProof/>
                 <w:webHidden/>
               </w:rPr>
-              <w:instrText xml:space="preserve"> PAGEREF _Toc234304008 \h </w:instrText>
+              <w:instrText xml:space="preserve"> PAGEREF _Toc234312462 \h </w:instrText>
             </w:r>
             <w:r>
               <w:rPr>
@@ -2005,7 +2021,7 @@
               <w14:ligatures w14:val="standardContextual"/>
             </w:rPr>
           </w:pPr>
-          <w:hyperlink w:anchor="_Toc234304009" w:history="1">
+          <w:hyperlink w:anchor="_Toc234312463" w:history="1">
             <w:r>
               <w:rPr>
                 <w:rStyle w:val="Hipervnculo"/>
@@ -2050,7 +2066,7 @@
                 <w:noProof/>
                 <w:webHidden/>
               </w:rPr>
-              <w:instrText xml:space="preserve"> PAGEREF _Toc234304009 \h </w:instrText>
+              <w:instrText xml:space="preserve"> PAGEREF _Toc234312463 \h </w:instrText>
             </w:r>
             <w:r>
               <w:rPr>
@@ -2096,7 +2112,7 @@
               <w14:ligatures w14:val="standardContextual"/>
             </w:rPr>
           </w:pPr>
-          <w:hyperlink w:anchor="_Toc234304010" w:history="1">
+          <w:hyperlink w:anchor="_Toc234312464" w:history="1">
             <w:r>
               <w:rPr>
                 <w:rStyle w:val="Hipervnculo"/>
@@ -2160,7 +2176,7 @@
                 <w:noProof/>
                 <w:webHidden/>
               </w:rPr>
-              <w:instrText xml:space="preserve"> PAGEREF _Toc234304010 \h </w:instrText>
+              <w:instrText xml:space="preserve"> PAGEREF _Toc234312464 \h </w:instrText>
             </w:r>
             <w:r>
               <w:rPr>
@@ -2205,7 +2221,7 @@
               <w14:ligatures w14:val="standardContextual"/>
             </w:rPr>
           </w:pPr>
-          <w:hyperlink w:anchor="_Toc234304011" w:history="1">
+          <w:hyperlink w:anchor="_Toc234312465" w:history="1">
             <w:r>
               <w:rPr>
                 <w:rStyle w:val="Hipervnculo"/>
@@ -2232,7 +2248,7 @@
                 <w:noProof/>
                 <w:webHidden/>
               </w:rPr>
-              <w:instrText xml:space="preserve"> PAGEREF _Toc234304011 \h </w:instrText>
+              <w:instrText xml:space="preserve"> PAGEREF _Toc234312465 \h </w:instrText>
             </w:r>
             <w:r>
               <w:rPr>
@@ -2294,7 +2310,7 @@
           <w:numId w:val="17"/>
         </w:numPr>
       </w:pPr>
-      <w:bookmarkStart w:id="1" w:name="_Toc234303996"/>
+      <w:bookmarkStart w:id="1" w:name="_Toc234312450"/>
       <w:r>
         <w:lastRenderedPageBreak/>
         <w:t>El Sindicato de la Resiliencia</w:t>
@@ -3373,7 +3389,7 @@
         </w:numPr>
       </w:pPr>
       <w:bookmarkStart w:id="2" w:name="_bookmark1"/>
-      <w:bookmarkStart w:id="3" w:name="_Toc234303997"/>
+      <w:bookmarkStart w:id="3" w:name="_Toc234312451"/>
       <w:bookmarkEnd w:id="2"/>
       <w:r>
         <w:rPr>
@@ -3759,7 +3775,7 @@
         </w:numPr>
       </w:pPr>
       <w:bookmarkStart w:id="4" w:name="_bookmark2"/>
-      <w:bookmarkStart w:id="5" w:name="_Toc234303998"/>
+      <w:bookmarkStart w:id="5" w:name="_Toc234312452"/>
       <w:bookmarkEnd w:id="4"/>
       <w:r>
         <w:lastRenderedPageBreak/>
@@ -4408,7 +4424,7 @@
           </mc:Choice>
           <mc:Fallback>
             <w:pict>
-              <v:group w14:anchorId="0D2BCBA7" id="Group 15" o:spid="_x0000_s1026" style="width:442.05pt;height:1.6pt;mso-position-horizontal-relative:char;mso-position-vertical-relative:line" coordsize="56140,203" o:gfxdata="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">
+              <v:group w14:anchorId="640C72A9" id="Group 15" o:spid="_x0000_s1026" style="width:442.05pt;height:1.6pt;mso-position-horizontal-relative:char;mso-position-vertical-relative:line" coordsize="56140,203" o:gfxdata="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">
                 <v:shape id="Graphic 16" o:spid="_x0000_s1027" style="position:absolute;width:56127;height:196;visibility:visible;mso-wrap-style:square;v-text-anchor:top" coordsize="5612765,19685" o:gfxdata="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" path="m5612765,l,,,19685r5612765,l5612765,xe" fillcolor="#9f9f9f" stroked="f">
                   <v:path arrowok="t"/>
                 </v:shape>
@@ -4453,7 +4469,7 @@
         </w:numPr>
         <w:jc w:val="left"/>
       </w:pPr>
-      <w:bookmarkStart w:id="7" w:name="_Toc234303999"/>
+      <w:bookmarkStart w:id="7" w:name="_Toc234312453"/>
       <w:r>
         <w:rPr>
           <w:w w:val="90"/>
@@ -5027,7 +5043,7 @@
         <w:jc w:val="left"/>
       </w:pPr>
       <w:bookmarkStart w:id="8" w:name="_bookmark4"/>
-      <w:bookmarkStart w:id="9" w:name="_Toc234304000"/>
+      <w:bookmarkStart w:id="9" w:name="_Toc234312454"/>
       <w:bookmarkEnd w:id="8"/>
       <w:r>
         <w:rPr>
@@ -5668,7 +5684,7 @@
         <w:jc w:val="left"/>
       </w:pPr>
       <w:bookmarkStart w:id="10" w:name="_bookmark5"/>
-      <w:bookmarkStart w:id="11" w:name="_Toc234304001"/>
+      <w:bookmarkStart w:id="11" w:name="_Toc234312455"/>
       <w:bookmarkEnd w:id="10"/>
       <w:r>
         <w:rPr>
@@ -6264,7 +6280,7 @@
         <w:jc w:val="left"/>
       </w:pPr>
       <w:bookmarkStart w:id="12" w:name="_bookmark6"/>
-      <w:bookmarkStart w:id="13" w:name="_Toc234304002"/>
+      <w:bookmarkStart w:id="13" w:name="_Toc234312456"/>
       <w:bookmarkEnd w:id="12"/>
       <w:r>
         <w:rPr>
@@ -6903,7 +6919,7 @@
         <w:jc w:val="left"/>
       </w:pPr>
       <w:bookmarkStart w:id="14" w:name="_bookmark7"/>
-      <w:bookmarkStart w:id="15" w:name="_Toc234304003"/>
+      <w:bookmarkStart w:id="15" w:name="_Toc234312457"/>
       <w:bookmarkEnd w:id="14"/>
       <w:r>
         <w:rPr>
@@ -7445,7 +7461,7 @@
         <w:jc w:val="left"/>
       </w:pPr>
       <w:bookmarkStart w:id="16" w:name="_bookmark8"/>
-      <w:bookmarkStart w:id="17" w:name="_Toc234304004"/>
+      <w:bookmarkStart w:id="17" w:name="_Toc234312458"/>
       <w:bookmarkEnd w:id="16"/>
       <w:r>
         <w:rPr>
@@ -8205,7 +8221,7 @@
         <w:jc w:val="left"/>
       </w:pPr>
       <w:bookmarkStart w:id="18" w:name="_bookmark9"/>
-      <w:bookmarkStart w:id="19" w:name="_Toc234304005"/>
+      <w:bookmarkStart w:id="19" w:name="_Toc234312459"/>
       <w:bookmarkEnd w:id="18"/>
       <w:r>
         <w:rPr>
@@ -8939,7 +8955,7 @@
         <w:lastRenderedPageBreak/>
         <w:tab/>
       </w:r>
-      <w:bookmarkStart w:id="20" w:name="_Toc234304006"/>
+      <w:bookmarkStart w:id="20" w:name="_Toc234312460"/>
       <w:r>
         <w:rPr>
           <w:w w:val="90"/>
@@ -9634,7 +9650,7 @@
       <w:r>
         <w:tab/>
       </w:r>
-      <w:bookmarkStart w:id="21" w:name="_Toc234304007"/>
+      <w:bookmarkStart w:id="21" w:name="_Toc234312461"/>
       <w:r>
         <w:rPr>
           <w:w w:val="90"/>
@@ -10355,7 +10371,7 @@
         <w:lastRenderedPageBreak/>
         <w:tab/>
       </w:r>
-      <w:bookmarkStart w:id="22" w:name="_Toc234304008"/>
+      <w:bookmarkStart w:id="22" w:name="_Toc234312462"/>
       <w:proofErr w:type="gramStart"/>
       <w:r>
         <w:rPr>
@@ -10629,41 +10645,15 @@
       <w:pPr>
         <w:pStyle w:val="Sinespaciado"/>
         <w:ind w:left="982"/>
-      </w:pPr>
-      <w:r>
-        <w:t xml:space="preserve">No uses bucles </w:t>
-      </w:r>
-      <w:proofErr w:type="spellStart"/>
-      <w:r>
-        <w:t>for</w:t>
-      </w:r>
-      <w:proofErr w:type="spellEnd"/>
-      <w:r>
-        <w:t xml:space="preserve"> para agrupar manualmente. Todo </w:t>
-      </w:r>
-      <w:proofErr w:type="spellStart"/>
-      <w:r>
-        <w:t>debe</w:t>
-      </w:r>
-      <w:proofErr w:type="spellEnd"/>
-      <w:r>
-        <w:t xml:space="preserve"> </w:t>
-      </w:r>
-      <w:proofErr w:type="spellStart"/>
-      <w:r>
-        <w:t>resolverse</w:t>
-      </w:r>
-      <w:proofErr w:type="spellEnd"/>
-      <w:r>
-        <w:t xml:space="preserve"> con </w:t>
-      </w:r>
-      <w:proofErr w:type="spellStart"/>
-      <w:r>
-        <w:t>Collectors.groupingBy</w:t>
-      </w:r>
-      <w:proofErr w:type="spellEnd"/>
-      <w:r>
-        <w:t>().</w:t>
+        <w:rPr>
+          <w:lang w:val="es-ES"/>
+        </w:rPr>
+      </w:pPr>
+      <w:r>
+        <w:rPr>
+          <w:lang w:val="es-ES"/>
+        </w:rPr>
+        <w:t>No uses bucles for para agrupar manualmente. Todo debe resolverse con Collectors.groupingBy().</w:t>
       </w:r>
     </w:p>
     <w:p>
@@ -10672,6 +10662,7 @@
         <w:ind w:left="982"/>
         <w:rPr>
           <w:spacing w:val="-2"/>
+          <w:lang w:val="es-ES"/>
         </w:rPr>
       </w:pPr>
     </w:p>
@@ -11114,7 +11105,7 @@
         <w:lastRenderedPageBreak/>
         <w:tab/>
       </w:r>
-      <w:bookmarkStart w:id="23" w:name="_Toc234304009"/>
+      <w:bookmarkStart w:id="23" w:name="_Toc234312463"/>
       <w:proofErr w:type="gramStart"/>
       <w:r>
         <w:rPr>
@@ -11785,10 +11776,13 @@
         </w:rPr>
       </w:pPr>
       <w:r>
+        <w:rPr>
+          <w:lang w:val="en-US"/>
+        </w:rPr>
         <w:lastRenderedPageBreak/>
         <w:tab/>
       </w:r>
-      <w:bookmarkStart w:id="24" w:name="_Toc234304010"/>
+      <w:bookmarkStart w:id="24" w:name="_Toc234312464"/>
       <w:r>
         <w:rPr>
           <w:w w:val="90"/>
@@ -12666,7 +12660,7 @@
         <w:ind w:left="0" w:firstLine="622"/>
       </w:pPr>
       <w:bookmarkStart w:id="25" w:name="_bookmark11"/>
-      <w:bookmarkStart w:id="26" w:name="_Toc234304011"/>
+      <w:bookmarkStart w:id="26" w:name="_Toc234312465"/>
       <w:bookmarkEnd w:id="25"/>
       <w:r>
         <w:lastRenderedPageBreak/>
@@ -13824,7 +13818,7 @@
         </mc:Choice>
         <mc:Fallback>
           <w:pict>
-            <v:shape w14:anchorId="49B29794" id="Graphic 4" o:spid="_x0000_s1026" style="position:absolute;margin-left:86.45pt;margin-top:719.75pt;width:476.5pt;height:25.2pt;z-index:-251660288;visibility:visible;mso-wrap-style:square;mso-wrap-distance-left:0;mso-wrap-distance-top:0;mso-wrap-distance-right:0;mso-wrap-distance-bottom:0;mso-position-horizontal:absolute;mso-position-horizontal-relative:page;mso-position-vertical:absolute;mso-position-vertical-relative:page;v-text-anchor:top" coordsize="6051550,320040" o:gfxdata="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" path="m6051397,l5594197,,,12,,18605r5594197,l5594197,320040r457200,l6051397,xe" fillcolor="black" stroked="f">
+            <v:shape w14:anchorId="69160F5D" id="Graphic 4" o:spid="_x0000_s1026" style="position:absolute;margin-left:86.45pt;margin-top:719.75pt;width:476.5pt;height:25.2pt;z-index:-251660288;visibility:visible;mso-wrap-style:square;mso-wrap-distance-left:0;mso-wrap-distance-top:0;mso-wrap-distance-right:0;mso-wrap-distance-bottom:0;mso-position-horizontal:absolute;mso-position-horizontal-relative:page;mso-position-vertical:absolute;mso-position-vertical-relative:page;v-text-anchor:top" coordsize="6051550,320040" o:gfxdata="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" path="m6051397,l5594197,,,12,,18605r5594197,l5594197,320040r457200,l6051397,xe" fillcolor="black" stroked="f">
               <v:path arrowok="t"/>
               <w10:wrap anchorx="page" anchory="page"/>
             </v:shape>
@@ -17485,6 +17479,7 @@
   <w:style w:type="character" w:default="1" w:styleId="Fuentedeprrafopredeter">
     <w:name w:val="Default Paragraph Font"/>
     <w:uiPriority w:val="1"/>
+    <w:semiHidden/>
     <w:unhideWhenUsed/>
   </w:style>
   <w:style w:type="table" w:default="1" w:styleId="Tablanormal">

</xml_diff>

<commit_message>
adding more problems module04 ex0,ex1
</commit_message>
<xml_diff>
--- a/subjects/subject_words/java04_es_subject.docx
+++ b/subjects/subject_words/java04_es_subject.docx
@@ -430,7 +430,7 @@
           </mc:Choice>
           <mc:Fallback>
             <w:pict>
-              <v:shape w14:anchorId="35DAF45D" id="Graphic 3" o:spid="_x0000_s1026" style="position:absolute;margin-left:86.45pt;margin-top:20.05pt;width:476.5pt;height:25.2pt;z-index:-251655680;visibility:visible;mso-wrap-style:square;mso-wrap-distance-left:0;mso-wrap-distance-top:0;mso-wrap-distance-right:0;mso-wrap-distance-bottom:0;mso-position-horizontal:absolute;mso-position-horizontal-relative:page;mso-position-vertical:absolute;mso-position-vertical-relative:text;v-text-anchor:top" coordsize="6051550,320040" o:gfxdata="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" path="m6051397,l5594197,,,12,,18605r5594197,l5594197,320040r457200,l6051397,xe" fillcolor="black" stroked="f">
+              <v:shape w14:anchorId="613E790D" id="Graphic 3" o:spid="_x0000_s1026" style="position:absolute;margin-left:86.45pt;margin-top:20.05pt;width:476.5pt;height:25.2pt;z-index:-251655680;visibility:visible;mso-wrap-style:square;mso-wrap-distance-left:0;mso-wrap-distance-top:0;mso-wrap-distance-right:0;mso-wrap-distance-bottom:0;mso-position-horizontal:absolute;mso-position-horizontal-relative:page;mso-position-vertical:absolute;mso-position-vertical-relative:text;v-text-anchor:top" coordsize="6051550,320040" o:gfxdata="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" path="m6051397,l5594197,,,12,,18605r5594197,l5594197,320040r457200,l6051397,xe" fillcolor="black" stroked="f">
                 <v:path arrowok="t"/>
                 <w10:wrap type="topAndBottom" anchorx="page"/>
               </v:shape>
@@ -914,23 +914,7 @@
                 <w:noProof/>
                 <w:w w:val="90"/>
               </w:rPr>
-              <w:t>El</w:t>
-            </w:r>
-            <w:r>
-              <w:rPr>
-                <w:rStyle w:val="Hipervnculo"/>
-                <w:noProof/>
-                <w:w w:val="90"/>
-              </w:rPr>
-              <w:t xml:space="preserve"> </w:t>
-            </w:r>
-            <w:r>
-              <w:rPr>
-                <w:rStyle w:val="Hipervnculo"/>
-                <w:noProof/>
-                <w:w w:val="90"/>
-              </w:rPr>
-              <w:t>Guion de la Misión</w:t>
+              <w:t>El Guion de la Misión</w:t>
             </w:r>
             <w:r>
               <w:rPr>
@@ -4424,7 +4408,7 @@
           </mc:Choice>
           <mc:Fallback>
             <w:pict>
-              <v:group w14:anchorId="640C72A9" id="Group 15" o:spid="_x0000_s1026" style="width:442.05pt;height:1.6pt;mso-position-horizontal-relative:char;mso-position-vertical-relative:line" coordsize="56140,203" o:gfxdata="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">
+              <v:group w14:anchorId="0C0C4FD9" id="Group 15" o:spid="_x0000_s1026" style="width:442.05pt;height:1.6pt;mso-position-horizontal-relative:char;mso-position-vertical-relative:line" coordsize="56140,203" o:gfxdata="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">
                 <v:shape id="Graphic 16" o:spid="_x0000_s1027" style="position:absolute;width:56127;height:196;visibility:visible;mso-wrap-style:square;v-text-anchor:top" coordsize="5612765,19685" o:gfxdata="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" path="m5612765,l,,,19685r5612765,l5612765,xe" fillcolor="#9f9f9f" stroked="f">
                   <v:path arrowok="t"/>
                 </v:shape>
@@ -4572,6 +4556,18 @@
         </w:rPr>
         <w:t>MissionScript.java</w:t>
       </w:r>
+      <w:r>
+        <w:rPr>
+          <w:w w:val="90"/>
+        </w:rPr>
+        <w:t xml:space="preserve">, </w:t>
+      </w:r>
+      <w:r>
+        <w:rPr>
+          <w:w w:val="90"/>
+        </w:rPr>
+        <w:t>mision.txt</w:t>
+      </w:r>
     </w:p>
     <w:p>
       <w:pPr>
@@ -4585,42 +4581,17 @@
         </w:tabs>
         <w:spacing w:line="252" w:lineRule="auto"/>
         <w:ind w:right="1037"/>
-        <w:rPr>
-          <w:lang w:val="en-US"/>
-        </w:rPr>
-      </w:pPr>
-      <w:proofErr w:type="spellStart"/>
-      <w:r>
-        <w:rPr>
-          <w:b/>
-          <w:w w:val="90"/>
-          <w:lang w:val="en-US"/>
-        </w:rPr>
-        <w:t>Funciones</w:t>
-      </w:r>
-      <w:proofErr w:type="spellEnd"/>
-      <w:r>
-        <w:rPr>
-          <w:b/>
-          <w:w w:val="90"/>
-          <w:lang w:val="en-US"/>
-        </w:rPr>
-        <w:t xml:space="preserve"> </w:t>
-      </w:r>
-      <w:proofErr w:type="spellStart"/>
-      <w:r>
-        <w:rPr>
-          <w:b/>
-          <w:w w:val="90"/>
-          <w:lang w:val="en-US"/>
-        </w:rPr>
-        <w:t>Autorizadas</w:t>
-      </w:r>
-      <w:proofErr w:type="spellEnd"/>
-      <w:r>
-        <w:rPr>
-          <w:w w:val="90"/>
-          <w:lang w:val="en-US"/>
+      </w:pPr>
+      <w:r>
+        <w:rPr>
+          <w:b/>
+          <w:w w:val="90"/>
+        </w:rPr>
+        <w:t>Funciones Autorizadas</w:t>
+      </w:r>
+      <w:r>
+        <w:rPr>
+          <w:w w:val="90"/>
         </w:rPr>
         <w:t xml:space="preserve">: </w:t>
       </w:r>
@@ -4629,7 +4600,6 @@
       <w:r>
         <w:rPr>
           <w:w w:val="90"/>
-          <w:lang w:val="en-US"/>
         </w:rPr>
         <w:t>java.nio.file</w:t>
       </w:r>
@@ -4637,7 +4607,6 @@
       <w:r>
         <w:rPr>
           <w:w w:val="90"/>
-          <w:lang w:val="en-US"/>
         </w:rPr>
         <w:t>.Files</w:t>
       </w:r>
@@ -4645,7 +4614,6 @@
       <w:r>
         <w:rPr>
           <w:w w:val="90"/>
-          <w:lang w:val="en-US"/>
         </w:rPr>
         <w:t xml:space="preserve">, </w:t>
       </w:r>
@@ -4653,7 +4621,6 @@
       <w:r>
         <w:rPr>
           <w:w w:val="90"/>
-          <w:lang w:val="en-US"/>
         </w:rPr>
         <w:t>java.nio.file.Path</w:t>
       </w:r>
@@ -4661,19 +4628,65 @@
       <w:r>
         <w:rPr>
           <w:w w:val="90"/>
-          <w:lang w:val="en-US"/>
-        </w:rPr>
-        <w:t xml:space="preserve">, Stream&lt;String&gt;, </w:t>
+        </w:rPr>
+        <w:t xml:space="preserve">, </w:t>
       </w:r>
       <w:proofErr w:type="spellStart"/>
       <w:r>
         <w:rPr>
           <w:w w:val="90"/>
-          <w:lang w:val="en-US"/>
+        </w:rPr>
+        <w:t>Stream</w:t>
+      </w:r>
+      <w:proofErr w:type="spellEnd"/>
+      <w:r>
+        <w:rPr>
+          <w:w w:val="90"/>
+        </w:rPr>
+        <w:t>&lt;</w:t>
+      </w:r>
+      <w:proofErr w:type="spellStart"/>
+      <w:r>
+        <w:rPr>
+          <w:w w:val="90"/>
+        </w:rPr>
+        <w:t>String</w:t>
+      </w:r>
+      <w:proofErr w:type="spellEnd"/>
+      <w:r>
+        <w:rPr>
+          <w:w w:val="90"/>
+        </w:rPr>
+        <w:t xml:space="preserve">&gt;, </w:t>
+      </w:r>
+      <w:proofErr w:type="spellStart"/>
+      <w:r>
+        <w:rPr>
+          <w:w w:val="90"/>
         </w:rPr>
         <w:t>System.out.println</w:t>
       </w:r>
       <w:proofErr w:type="spellEnd"/>
+      <w:r>
+        <w:rPr>
+          <w:w w:val="90"/>
+        </w:rPr>
+        <w:t xml:space="preserve">, </w:t>
+      </w:r>
+      <w:proofErr w:type="spellStart"/>
+      <w:r>
+        <w:rPr>
+          <w:w w:val="90"/>
+        </w:rPr>
+        <w:t>System.getProperty</w:t>
+      </w:r>
+      <w:proofErr w:type="spellEnd"/>
+      <w:r>
+        <w:rPr>
+          <w:w w:val="90"/>
+        </w:rPr>
+        <w:t>(Ruta absoluta).</w:t>
+      </w:r>
     </w:p>
     <w:p>
       <w:pPr>
@@ -4688,6 +4701,7 @@
         <w:spacing w:line="279" w:lineRule="exact"/>
         <w:ind w:left="1341"/>
         <w:rPr>
+          <w:w w:val="90"/>
           <w:lang w:val="en-US"/>
         </w:rPr>
       </w:pPr>
@@ -4720,7 +4734,46 @@
           <w:w w:val="90"/>
           <w:lang w:val="en-US"/>
         </w:rPr>
-        <w:t>Any.</w:t>
+        <w:t xml:space="preserve">public static void </w:t>
+      </w:r>
+      <w:proofErr w:type="gramStart"/>
+      <w:r>
+        <w:rPr>
+          <w:w w:val="90"/>
+          <w:lang w:val="en-US"/>
+        </w:rPr>
+        <w:t>main(</w:t>
+      </w:r>
+      <w:proofErr w:type="gramEnd"/>
+      <w:r>
+        <w:rPr>
+          <w:w w:val="90"/>
+          <w:lang w:val="en-US"/>
+        </w:rPr>
+        <w:t xml:space="preserve">String[] </w:t>
+      </w:r>
+      <w:proofErr w:type="spellStart"/>
+      <w:r>
+        <w:rPr>
+          <w:w w:val="90"/>
+          <w:lang w:val="en-US"/>
+        </w:rPr>
+        <w:t>args</w:t>
+      </w:r>
+      <w:proofErr w:type="spellEnd"/>
+      <w:r>
+        <w:rPr>
+          <w:w w:val="90"/>
+          <w:lang w:val="en-US"/>
+        </w:rPr>
+        <w:t>)</w:t>
+      </w:r>
+      <w:r>
+        <w:rPr>
+          <w:w w:val="90"/>
+          <w:lang w:val="en-US"/>
+        </w:rPr>
+        <w:t>.</w:t>
       </w:r>
     </w:p>
     <w:p>
@@ -4851,50 +4904,55 @@
     <w:p>
       <w:pPr>
         <w:ind w:left="622"/>
-      </w:pPr>
-    </w:p>
-    <w:p>
-      <w:pPr>
-        <w:pStyle w:val="Textoindependiente"/>
-        <w:spacing w:before="1" w:line="252" w:lineRule="auto"/>
-        <w:ind w:left="622" w:right="672"/>
-      </w:pPr>
-      <w:r>
+        <w:rPr>
+          <w:spacing w:val="-8"/>
+        </w:rPr>
+      </w:pPr>
+    </w:p>
+    <w:p>
+      <w:pPr>
+        <w:ind w:left="622"/>
         <w:rPr>
           <w:b/>
           <w:bCs/>
-        </w:rPr>
-        <w:t>Salida Esperada</w:t>
-      </w:r>
-    </w:p>
-    <w:p>
-      <w:pPr>
-        <w:pStyle w:val="Sinespaciado"/>
+          <w:spacing w:val="-8"/>
+        </w:rPr>
+      </w:pPr>
+      <w:r>
+        <w:rPr>
+          <w:b/>
+          <w:bCs/>
+          <w:spacing w:val="-8"/>
+        </w:rPr>
+        <w:t>mision.txt</w:t>
+      </w:r>
+    </w:p>
+    <w:p>
+      <w:pPr>
         <w:ind w:left="622"/>
         <w:rPr>
-          <w:lang w:val="es-ES"/>
+          <w:spacing w:val="-8"/>
         </w:rPr>
       </w:pPr>
       <w:r>
         <w:rPr>
           <w:noProof/>
-          <w:lang w:val="es-ES"/>
         </w:rPr>
         <mc:AlternateContent>
           <mc:Choice Requires="wps">
             <w:drawing>
-              <wp:anchor distT="0" distB="0" distL="114300" distR="114300" simplePos="0" relativeHeight="251644928" behindDoc="0" locked="0" layoutInCell="1" allowOverlap="1" wp14:anchorId="1C4D31BE" wp14:editId="0BA5062A">
+              <wp:anchor distT="0" distB="0" distL="114300" distR="114300" simplePos="0" relativeHeight="251656704" behindDoc="0" locked="0" layoutInCell="1" allowOverlap="1" wp14:anchorId="52D2470B" wp14:editId="28D3D846">
                 <wp:simplePos x="0" y="0"/>
                 <wp:positionH relativeFrom="margin">
-                  <wp:posOffset>398885</wp:posOffset>
+                  <wp:posOffset>419100</wp:posOffset>
                 </wp:positionH>
                 <wp:positionV relativeFrom="paragraph">
-                  <wp:posOffset>78712</wp:posOffset>
+                  <wp:posOffset>126365</wp:posOffset>
                 </wp:positionV>
-                <wp:extent cx="5518205" cy="1136540"/>
-                <wp:effectExtent l="0" t="0" r="25400" b="26035"/>
+                <wp:extent cx="5518205" cy="1276350"/>
+                <wp:effectExtent l="0" t="0" r="25400" b="19050"/>
                 <wp:wrapNone/>
-                <wp:docPr id="1654877533" name="Rectángulo 2"/>
+                <wp:docPr id="1101761559" name="Rectángulo 2"/>
                 <wp:cNvGraphicFramePr/>
                 <a:graphic xmlns:a="http://schemas.openxmlformats.org/drawingml/2006/main">
                   <a:graphicData uri="http://schemas.microsoft.com/office/word/2010/wordprocessingShape">
@@ -4903,7 +4961,7 @@
                       <wps:spPr>
                         <a:xfrm>
                           <a:off x="0" y="0"/>
-                          <a:ext cx="5518205" cy="1136540"/>
+                          <a:ext cx="5518205" cy="1276350"/>
                         </a:xfrm>
                         <a:prstGeom prst="rect">
                           <a:avLst/>
@@ -4948,7 +5006,87 @@
                                 <w:rFonts w:ascii="Cascadia Mono SemiBold" w:hAnsi="Cascadia Mono SemiBold" w:cs="Cascadia Mono SemiBold"/>
                                 <w:lang w:val="es-ES"/>
                               </w:rPr>
-                              <w:t>Contenido del archivo línea por línea con un prefijo [MISSION PLAN].</w:t>
+                              <w:t>=== PLAN DE LA MISIÓN ===</w:t>
+                            </w:r>
+                          </w:p>
+                          <w:p>
+                            <w:pPr>
+                              <w:pStyle w:val="Sinespaciado"/>
+                              <w:rPr>
+                                <w:rFonts w:ascii="Cascadia Mono SemiBold" w:hAnsi="Cascadia Mono SemiBold" w:cs="Cascadia Mono SemiBold"/>
+                                <w:lang w:val="es-ES"/>
+                              </w:rPr>
+                            </w:pPr>
+                            <w:r>
+                              <w:rPr>
+                                <w:rFonts w:ascii="Cascadia Mono SemiBold" w:hAnsi="Cascadia Mono SemiBold" w:cs="Cascadia Mono SemiBold"/>
+                                <w:lang w:val="es-ES"/>
+                              </w:rPr>
+                              <w:t>1. Encender motores</w:t>
+                            </w:r>
+                          </w:p>
+                          <w:p>
+                            <w:pPr>
+                              <w:pStyle w:val="Sinespaciado"/>
+                              <w:rPr>
+                                <w:rFonts w:ascii="Cascadia Mono SemiBold" w:hAnsi="Cascadia Mono SemiBold" w:cs="Cascadia Mono SemiBold"/>
+                                <w:lang w:val="es-ES"/>
+                              </w:rPr>
+                            </w:pPr>
+                            <w:r>
+                              <w:rPr>
+                                <w:rFonts w:ascii="Cascadia Mono SemiBold" w:hAnsi="Cascadia Mono SemiBold" w:cs="Cascadia Mono SemiBold"/>
+                                <w:lang w:val="es-ES"/>
+                              </w:rPr>
+                              <w:t>2. Verificar combustible</w:t>
+                            </w:r>
+                          </w:p>
+                          <w:p>
+                            <w:pPr>
+                              <w:pStyle w:val="Sinespaciado"/>
+                              <w:rPr>
+                                <w:rFonts w:ascii="Cascadia Mono SemiBold" w:hAnsi="Cascadia Mono SemiBold" w:cs="Cascadia Mono SemiBold"/>
+                                <w:lang w:val="es-ES"/>
+                              </w:rPr>
+                            </w:pPr>
+                            <w:r>
+                              <w:rPr>
+                                <w:rFonts w:ascii="Cascadia Mono SemiBold" w:hAnsi="Cascadia Mono SemiBold" w:cs="Cascadia Mono SemiBold"/>
+                                <w:lang w:val="es-ES"/>
+                              </w:rPr>
+                              <w:t>3. Despegar</w:t>
+                            </w:r>
+                          </w:p>
+                          <w:p>
+                            <w:pPr>
+                              <w:pStyle w:val="Sinespaciado"/>
+                              <w:rPr>
+                                <w:rFonts w:ascii="Cascadia Mono SemiBold" w:hAnsi="Cascadia Mono SemiBold" w:cs="Cascadia Mono SemiBold"/>
+                                <w:lang w:val="es-ES"/>
+                              </w:rPr>
+                            </w:pPr>
+                            <w:r>
+                              <w:rPr>
+                                <w:rFonts w:ascii="Cascadia Mono SemiBold" w:hAnsi="Cascadia Mono SemiBold" w:cs="Cascadia Mono SemiBold"/>
+                                <w:lang w:val="es-ES"/>
+                              </w:rPr>
+                              <w:t>4. Entrar en órbita</w:t>
+                            </w:r>
+                          </w:p>
+                          <w:p>
+                            <w:pPr>
+                              <w:pStyle w:val="Sinespaciado"/>
+                              <w:rPr>
+                                <w:rFonts w:ascii="Cascadia Mono SemiBold" w:hAnsi="Cascadia Mono SemiBold" w:cs="Cascadia Mono SemiBold"/>
+                                <w:lang w:val="es-ES"/>
+                              </w:rPr>
+                            </w:pPr>
+                            <w:r>
+                              <w:rPr>
+                                <w:rFonts w:ascii="Cascadia Mono SemiBold" w:hAnsi="Cascadia Mono SemiBold" w:cs="Cascadia Mono SemiBold"/>
+                                <w:lang w:val="es-ES"/>
+                              </w:rPr>
+                              <w:t>5. Iniciar exploración</w:t>
                             </w:r>
                           </w:p>
                         </w:txbxContent>
@@ -4973,7 +5111,7 @@
           </mc:Choice>
           <mc:Fallback>
             <w:pict>
-              <v:rect w14:anchorId="1C4D31BE" id="Rectángulo 2" o:spid="_x0000_s1026" style="position:absolute;left:0;text-align:left;margin-left:31.4pt;margin-top:6.2pt;width:434.5pt;height:89.5pt;z-index:251644928;visibility:visible;mso-wrap-style:square;mso-width-percent:0;mso-height-percent:0;mso-wrap-distance-left:9pt;mso-wrap-distance-top:0;mso-wrap-distance-right:9pt;mso-wrap-distance-bottom:0;mso-position-horizontal:absolute;mso-position-horizontal-relative:margin;mso-position-vertical:absolute;mso-position-vertical-relative:text;mso-width-percent:0;mso-height-percent:0;mso-width-relative:margin;mso-height-relative:margin;v-text-anchor:middle" o:gfxdata="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" fillcolor="black [3213]" strokecolor="black [3213]" strokeweight="2pt">
+              <v:rect w14:anchorId="52D2470B" id="Rectángulo 2" o:spid="_x0000_s1026" style="position:absolute;left:0;text-align:left;margin-left:33pt;margin-top:9.95pt;width:434.5pt;height:100.5pt;z-index:251656704;visibility:visible;mso-wrap-style:square;mso-width-percent:0;mso-height-percent:0;mso-wrap-distance-left:9pt;mso-wrap-distance-top:0;mso-wrap-distance-right:9pt;mso-wrap-distance-bottom:0;mso-position-horizontal:absolute;mso-position-horizontal-relative:margin;mso-position-vertical:absolute;mso-position-vertical-relative:text;mso-width-percent:0;mso-height-percent:0;mso-width-relative:margin;mso-height-relative:margin;v-text-anchor:middle" o:gfxdata="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" fillcolor="black [3213]" strokecolor="black [3213]" strokeweight="2pt">
                 <v:textbox>
                   <w:txbxContent>
                     <w:p>
@@ -4989,7 +5127,627 @@
                           <w:rFonts w:ascii="Cascadia Mono SemiBold" w:hAnsi="Cascadia Mono SemiBold" w:cs="Cascadia Mono SemiBold"/>
                           <w:lang w:val="es-ES"/>
                         </w:rPr>
-                        <w:t>Contenido del archivo línea por línea con un prefijo [MISSION PLAN].</w:t>
+                        <w:t>=== PLAN DE LA MISIÓN ===</w:t>
+                      </w:r>
+                    </w:p>
+                    <w:p>
+                      <w:pPr>
+                        <w:pStyle w:val="Sinespaciado"/>
+                        <w:rPr>
+                          <w:rFonts w:ascii="Cascadia Mono SemiBold" w:hAnsi="Cascadia Mono SemiBold" w:cs="Cascadia Mono SemiBold"/>
+                          <w:lang w:val="es-ES"/>
+                        </w:rPr>
+                      </w:pPr>
+                      <w:r>
+                        <w:rPr>
+                          <w:rFonts w:ascii="Cascadia Mono SemiBold" w:hAnsi="Cascadia Mono SemiBold" w:cs="Cascadia Mono SemiBold"/>
+                          <w:lang w:val="es-ES"/>
+                        </w:rPr>
+                        <w:t>1. Encender motores</w:t>
+                      </w:r>
+                    </w:p>
+                    <w:p>
+                      <w:pPr>
+                        <w:pStyle w:val="Sinespaciado"/>
+                        <w:rPr>
+                          <w:rFonts w:ascii="Cascadia Mono SemiBold" w:hAnsi="Cascadia Mono SemiBold" w:cs="Cascadia Mono SemiBold"/>
+                          <w:lang w:val="es-ES"/>
+                        </w:rPr>
+                      </w:pPr>
+                      <w:r>
+                        <w:rPr>
+                          <w:rFonts w:ascii="Cascadia Mono SemiBold" w:hAnsi="Cascadia Mono SemiBold" w:cs="Cascadia Mono SemiBold"/>
+                          <w:lang w:val="es-ES"/>
+                        </w:rPr>
+                        <w:t>2. Verificar combustible</w:t>
+                      </w:r>
+                    </w:p>
+                    <w:p>
+                      <w:pPr>
+                        <w:pStyle w:val="Sinespaciado"/>
+                        <w:rPr>
+                          <w:rFonts w:ascii="Cascadia Mono SemiBold" w:hAnsi="Cascadia Mono SemiBold" w:cs="Cascadia Mono SemiBold"/>
+                          <w:lang w:val="es-ES"/>
+                        </w:rPr>
+                      </w:pPr>
+                      <w:r>
+                        <w:rPr>
+                          <w:rFonts w:ascii="Cascadia Mono SemiBold" w:hAnsi="Cascadia Mono SemiBold" w:cs="Cascadia Mono SemiBold"/>
+                          <w:lang w:val="es-ES"/>
+                        </w:rPr>
+                        <w:t>3. Despegar</w:t>
+                      </w:r>
+                    </w:p>
+                    <w:p>
+                      <w:pPr>
+                        <w:pStyle w:val="Sinespaciado"/>
+                        <w:rPr>
+                          <w:rFonts w:ascii="Cascadia Mono SemiBold" w:hAnsi="Cascadia Mono SemiBold" w:cs="Cascadia Mono SemiBold"/>
+                          <w:lang w:val="es-ES"/>
+                        </w:rPr>
+                      </w:pPr>
+                      <w:r>
+                        <w:rPr>
+                          <w:rFonts w:ascii="Cascadia Mono SemiBold" w:hAnsi="Cascadia Mono SemiBold" w:cs="Cascadia Mono SemiBold"/>
+                          <w:lang w:val="es-ES"/>
+                        </w:rPr>
+                        <w:t>4. Entrar en órbita</w:t>
+                      </w:r>
+                    </w:p>
+                    <w:p>
+                      <w:pPr>
+                        <w:pStyle w:val="Sinespaciado"/>
+                        <w:rPr>
+                          <w:rFonts w:ascii="Cascadia Mono SemiBold" w:hAnsi="Cascadia Mono SemiBold" w:cs="Cascadia Mono SemiBold"/>
+                          <w:lang w:val="es-ES"/>
+                        </w:rPr>
+                      </w:pPr>
+                      <w:r>
+                        <w:rPr>
+                          <w:rFonts w:ascii="Cascadia Mono SemiBold" w:hAnsi="Cascadia Mono SemiBold" w:cs="Cascadia Mono SemiBold"/>
+                          <w:lang w:val="es-ES"/>
+                        </w:rPr>
+                        <w:t>5. Iniciar exploración</w:t>
+                      </w:r>
+                    </w:p>
+                  </w:txbxContent>
+                </v:textbox>
+                <w10:wrap anchorx="margin"/>
+              </v:rect>
+            </w:pict>
+          </mc:Fallback>
+        </mc:AlternateContent>
+      </w:r>
+    </w:p>
+    <w:p>
+      <w:pPr>
+        <w:ind w:left="622"/>
+        <w:rPr>
+          <w:spacing w:val="-8"/>
+        </w:rPr>
+      </w:pPr>
+    </w:p>
+    <w:p>
+      <w:pPr>
+        <w:ind w:left="622"/>
+      </w:pPr>
+    </w:p>
+    <w:p>
+      <w:pPr>
+        <w:pStyle w:val="Textoindependiente"/>
+        <w:spacing w:before="1" w:line="252" w:lineRule="auto"/>
+        <w:ind w:left="622" w:right="672"/>
+        <w:rPr>
+          <w:b/>
+          <w:bCs/>
+        </w:rPr>
+      </w:pPr>
+    </w:p>
+    <w:p>
+      <w:pPr>
+        <w:pStyle w:val="Textoindependiente"/>
+        <w:spacing w:before="1" w:line="252" w:lineRule="auto"/>
+        <w:ind w:right="672"/>
+        <w:rPr>
+          <w:b/>
+          <w:bCs/>
+        </w:rPr>
+      </w:pPr>
+    </w:p>
+    <w:p>
+      <w:pPr>
+        <w:pStyle w:val="Textoindependiente"/>
+        <w:spacing w:before="1" w:line="252" w:lineRule="auto"/>
+        <w:ind w:right="672"/>
+        <w:rPr>
+          <w:b/>
+          <w:bCs/>
+        </w:rPr>
+      </w:pPr>
+    </w:p>
+    <w:p>
+      <w:pPr>
+        <w:pStyle w:val="Textoindependiente"/>
+        <w:spacing w:before="1" w:line="252" w:lineRule="auto"/>
+        <w:ind w:left="622" w:right="672"/>
+        <w:rPr>
+          <w:b/>
+          <w:bCs/>
+        </w:rPr>
+      </w:pPr>
+    </w:p>
+    <w:p>
+      <w:pPr>
+        <w:pStyle w:val="Textoindependiente"/>
+        <w:spacing w:before="1" w:line="252" w:lineRule="auto"/>
+        <w:ind w:left="622" w:right="672"/>
+        <w:rPr>
+          <w:b/>
+          <w:bCs/>
+        </w:rPr>
+      </w:pPr>
+    </w:p>
+    <w:p>
+      <w:pPr>
+        <w:pStyle w:val="Textoindependiente"/>
+        <w:spacing w:before="1" w:line="252" w:lineRule="auto"/>
+        <w:ind w:left="622" w:right="672"/>
+      </w:pPr>
+      <w:r>
+        <w:rPr>
+          <w:b/>
+          <w:bCs/>
+        </w:rPr>
+        <w:t>Salida Esperada</w:t>
+      </w:r>
+    </w:p>
+    <w:p>
+      <w:pPr>
+        <w:pStyle w:val="Sinespaciado"/>
+        <w:ind w:left="622"/>
+        <w:rPr>
+          <w:lang w:val="es-ES"/>
+        </w:rPr>
+      </w:pPr>
+      <w:r>
+        <w:rPr>
+          <w:noProof/>
+          <w:lang w:val="es-ES"/>
+        </w:rPr>
+        <mc:AlternateContent>
+          <mc:Choice Requires="wps">
+            <w:drawing>
+              <wp:anchor distT="0" distB="0" distL="114300" distR="114300" simplePos="0" relativeHeight="251644928" behindDoc="0" locked="0" layoutInCell="1" allowOverlap="1" wp14:anchorId="1C4D31BE" wp14:editId="47313A76">
+                <wp:simplePos x="0" y="0"/>
+                <wp:positionH relativeFrom="margin">
+                  <wp:posOffset>400050</wp:posOffset>
+                </wp:positionH>
+                <wp:positionV relativeFrom="paragraph">
+                  <wp:posOffset>78740</wp:posOffset>
+                </wp:positionV>
+                <wp:extent cx="5514975" cy="1352550"/>
+                <wp:effectExtent l="0" t="0" r="28575" b="19050"/>
+                <wp:wrapNone/>
+                <wp:docPr id="1654877533" name="Rectángulo 2"/>
+                <wp:cNvGraphicFramePr/>
+                <a:graphic xmlns:a="http://schemas.openxmlformats.org/drawingml/2006/main">
+                  <a:graphicData uri="http://schemas.microsoft.com/office/word/2010/wordprocessingShape">
+                    <wps:wsp>
+                      <wps:cNvSpPr/>
+                      <wps:spPr>
+                        <a:xfrm>
+                          <a:off x="0" y="0"/>
+                          <a:ext cx="5514975" cy="1352550"/>
+                        </a:xfrm>
+                        <a:prstGeom prst="rect">
+                          <a:avLst/>
+                        </a:prstGeom>
+                        <a:solidFill>
+                          <a:schemeClr val="tx1"/>
+                        </a:solidFill>
+                        <a:ln>
+                          <a:solidFill>
+                            <a:schemeClr val="tx1"/>
+                          </a:solidFill>
+                        </a:ln>
+                      </wps:spPr>
+                      <wps:style>
+                        <a:lnRef idx="2">
+                          <a:schemeClr val="accent1">
+                            <a:shade val="15000"/>
+                          </a:schemeClr>
+                        </a:lnRef>
+                        <a:fillRef idx="1">
+                          <a:schemeClr val="accent1"/>
+                        </a:fillRef>
+                        <a:effectRef idx="0">
+                          <a:schemeClr val="accent1"/>
+                        </a:effectRef>
+                        <a:fontRef idx="minor">
+                          <a:schemeClr val="lt1"/>
+                        </a:fontRef>
+                      </wps:style>
+                      <wps:txbx>
+                        <w:txbxContent>
+                          <w:p>
+                            <w:pPr>
+                              <w:pStyle w:val="Sinespaciado"/>
+                              <w:rPr>
+                                <w:rFonts w:ascii="Cascadia Mono SemiBold" w:hAnsi="Cascadia Mono SemiBold" w:cs="Cascadia Mono SemiBold"/>
+                                <w:sz w:val="20"/>
+                                <w:szCs w:val="20"/>
+                                <w:lang w:val="es-ES"/>
+                              </w:rPr>
+                            </w:pPr>
+                            <w:r>
+                              <w:rPr>
+                                <w:rFonts w:ascii="Cascadia Mono SemiBold" w:hAnsi="Cascadia Mono SemiBold" w:cs="Cascadia Mono SemiBold"/>
+                                <w:sz w:val="20"/>
+                                <w:szCs w:val="20"/>
+                                <w:lang w:val="es-ES"/>
+                              </w:rPr>
+                              <w:t>Directorio Actual: C:\Users\</w:t>
+                            </w:r>
+                            <w:r>
+                              <w:rPr>
+                                <w:rFonts w:ascii="Cascadia Mono SemiBold" w:hAnsi="Cascadia Mono SemiBold" w:cs="Cascadia Mono SemiBold"/>
+                                <w:sz w:val="20"/>
+                                <w:szCs w:val="20"/>
+                                <w:lang w:val="es-ES"/>
+                              </w:rPr>
+                              <w:t>XXXX</w:t>
+                            </w:r>
+                            <w:r>
+                              <w:rPr>
+                                <w:rFonts w:ascii="Cascadia Mono SemiBold" w:hAnsi="Cascadia Mono SemiBold" w:cs="Cascadia Mono SemiBold"/>
+                                <w:sz w:val="20"/>
+                                <w:szCs w:val="20"/>
+                                <w:lang w:val="es-ES"/>
+                              </w:rPr>
+                              <w:t>\Documents\java_modules\src\ex0</w:t>
+                            </w:r>
+                          </w:p>
+                          <w:p>
+                            <w:pPr>
+                              <w:pStyle w:val="Sinespaciado"/>
+                              <w:rPr>
+                                <w:rFonts w:ascii="Cascadia Mono SemiBold" w:hAnsi="Cascadia Mono SemiBold" w:cs="Cascadia Mono SemiBold"/>
+                                <w:sz w:val="20"/>
+                                <w:szCs w:val="20"/>
+                                <w:lang w:val="es-ES"/>
+                              </w:rPr>
+                            </w:pPr>
+                          </w:p>
+                          <w:p>
+                            <w:pPr>
+                              <w:pStyle w:val="Sinespaciado"/>
+                              <w:rPr>
+                                <w:rFonts w:ascii="Cascadia Mono SemiBold" w:hAnsi="Cascadia Mono SemiBold" w:cs="Cascadia Mono SemiBold"/>
+                                <w:sz w:val="20"/>
+                                <w:szCs w:val="20"/>
+                                <w:lang w:val="es-ES"/>
+                              </w:rPr>
+                            </w:pPr>
+                            <w:r>
+                              <w:rPr>
+                                <w:rFonts w:ascii="Cascadia Mono SemiBold" w:hAnsi="Cascadia Mono SemiBold" w:cs="Cascadia Mono SemiBold"/>
+                                <w:sz w:val="20"/>
+                                <w:szCs w:val="20"/>
+                                <w:lang w:val="es-ES"/>
+                              </w:rPr>
+                              <w:t>=== PLAN DE LA MISIÓN ===</w:t>
+                            </w:r>
+                          </w:p>
+                          <w:p>
+                            <w:pPr>
+                              <w:pStyle w:val="Sinespaciado"/>
+                              <w:rPr>
+                                <w:rFonts w:ascii="Cascadia Mono SemiBold" w:hAnsi="Cascadia Mono SemiBold" w:cs="Cascadia Mono SemiBold"/>
+                                <w:sz w:val="20"/>
+                                <w:szCs w:val="20"/>
+                                <w:lang w:val="es-ES"/>
+                              </w:rPr>
+                            </w:pPr>
+                            <w:r>
+                              <w:rPr>
+                                <w:rFonts w:ascii="Cascadia Mono SemiBold" w:hAnsi="Cascadia Mono SemiBold" w:cs="Cascadia Mono SemiBold"/>
+                                <w:sz w:val="20"/>
+                                <w:szCs w:val="20"/>
+                                <w:lang w:val="es-ES"/>
+                              </w:rPr>
+                              <w:t>1. Encender motores</w:t>
+                            </w:r>
+                          </w:p>
+                          <w:p>
+                            <w:pPr>
+                              <w:pStyle w:val="Sinespaciado"/>
+                              <w:rPr>
+                                <w:rFonts w:ascii="Cascadia Mono SemiBold" w:hAnsi="Cascadia Mono SemiBold" w:cs="Cascadia Mono SemiBold"/>
+                                <w:sz w:val="20"/>
+                                <w:szCs w:val="20"/>
+                                <w:lang w:val="es-ES"/>
+                              </w:rPr>
+                            </w:pPr>
+                            <w:r>
+                              <w:rPr>
+                                <w:rFonts w:ascii="Cascadia Mono SemiBold" w:hAnsi="Cascadia Mono SemiBold" w:cs="Cascadia Mono SemiBold"/>
+                                <w:sz w:val="20"/>
+                                <w:szCs w:val="20"/>
+                                <w:lang w:val="es-ES"/>
+                              </w:rPr>
+                              <w:t>2. Verificar combustible</w:t>
+                            </w:r>
+                          </w:p>
+                          <w:p>
+                            <w:pPr>
+                              <w:pStyle w:val="Sinespaciado"/>
+                              <w:rPr>
+                                <w:rFonts w:ascii="Cascadia Mono SemiBold" w:hAnsi="Cascadia Mono SemiBold" w:cs="Cascadia Mono SemiBold"/>
+                                <w:sz w:val="20"/>
+                                <w:szCs w:val="20"/>
+                                <w:lang w:val="es-ES"/>
+                              </w:rPr>
+                            </w:pPr>
+                            <w:r>
+                              <w:rPr>
+                                <w:rFonts w:ascii="Cascadia Mono SemiBold" w:hAnsi="Cascadia Mono SemiBold" w:cs="Cascadia Mono SemiBold"/>
+                                <w:sz w:val="20"/>
+                                <w:szCs w:val="20"/>
+                                <w:lang w:val="es-ES"/>
+                              </w:rPr>
+                              <w:t>3. Despegar</w:t>
+                            </w:r>
+                          </w:p>
+                          <w:p>
+                            <w:pPr>
+                              <w:pStyle w:val="Sinespaciado"/>
+                              <w:rPr>
+                                <w:rFonts w:ascii="Cascadia Mono SemiBold" w:hAnsi="Cascadia Mono SemiBold" w:cs="Cascadia Mono SemiBold"/>
+                                <w:sz w:val="20"/>
+                                <w:szCs w:val="20"/>
+                                <w:lang w:val="es-ES"/>
+                              </w:rPr>
+                            </w:pPr>
+                            <w:r>
+                              <w:rPr>
+                                <w:rFonts w:ascii="Cascadia Mono SemiBold" w:hAnsi="Cascadia Mono SemiBold" w:cs="Cascadia Mono SemiBold"/>
+                                <w:sz w:val="20"/>
+                                <w:szCs w:val="20"/>
+                                <w:lang w:val="es-ES"/>
+                              </w:rPr>
+                              <w:t>4. Entrar en órbita</w:t>
+                            </w:r>
+                          </w:p>
+                          <w:p>
+                            <w:pPr>
+                              <w:pStyle w:val="Sinespaciado"/>
+                              <w:rPr>
+                                <w:rFonts w:ascii="Cascadia Mono SemiBold" w:hAnsi="Cascadia Mono SemiBold" w:cs="Cascadia Mono SemiBold"/>
+                                <w:sz w:val="20"/>
+                                <w:szCs w:val="20"/>
+                                <w:lang w:val="es-ES"/>
+                              </w:rPr>
+                            </w:pPr>
+                            <w:r>
+                              <w:rPr>
+                                <w:rFonts w:ascii="Cascadia Mono SemiBold" w:hAnsi="Cascadia Mono SemiBold" w:cs="Cascadia Mono SemiBold"/>
+                                <w:sz w:val="20"/>
+                                <w:szCs w:val="20"/>
+                                <w:lang w:val="es-ES"/>
+                              </w:rPr>
+                              <w:t>5. Iniciar exploració</w:t>
+                            </w:r>
+                            <w:r>
+                              <w:rPr>
+                                <w:rFonts w:ascii="Cascadia Mono SemiBold" w:hAnsi="Cascadia Mono SemiBold" w:cs="Cascadia Mono SemiBold"/>
+                                <w:sz w:val="20"/>
+                                <w:szCs w:val="20"/>
+                                <w:lang w:val="es-ES"/>
+                              </w:rPr>
+                              <w:t>n</w:t>
+                            </w:r>
+                          </w:p>
+                        </w:txbxContent>
+                      </wps:txbx>
+                      <wps:bodyPr rot="0" spcFirstLastPara="0" vertOverflow="overflow" horzOverflow="overflow" vert="horz" wrap="square" lIns="91440" tIns="45720" rIns="91440" bIns="45720" numCol="1" spcCol="0" rtlCol="0" fromWordArt="0" anchor="ctr" anchorCtr="0" forceAA="0" compatLnSpc="1">
+                        <a:prstTxWarp prst="textNoShape">
+                          <a:avLst/>
+                        </a:prstTxWarp>
+                        <a:noAutofit/>
+                      </wps:bodyPr>
+                    </wps:wsp>
+                  </a:graphicData>
+                </a:graphic>
+                <wp14:sizeRelH relativeFrom="margin">
+                  <wp14:pctWidth>0</wp14:pctWidth>
+                </wp14:sizeRelH>
+                <wp14:sizeRelV relativeFrom="margin">
+                  <wp14:pctHeight>0</wp14:pctHeight>
+                </wp14:sizeRelV>
+              </wp:anchor>
+            </w:drawing>
+          </mc:Choice>
+          <mc:Fallback>
+            <w:pict>
+              <v:rect w14:anchorId="1C4D31BE" id="_x0000_s1027" style="position:absolute;left:0;text-align:left;margin-left:31.5pt;margin-top:6.2pt;width:434.25pt;height:106.5pt;z-index:251644928;visibility:visible;mso-wrap-style:square;mso-width-percent:0;mso-height-percent:0;mso-wrap-distance-left:9pt;mso-wrap-distance-top:0;mso-wrap-distance-right:9pt;mso-wrap-distance-bottom:0;mso-position-horizontal:absolute;mso-position-horizontal-relative:margin;mso-position-vertical:absolute;mso-position-vertical-relative:text;mso-width-percent:0;mso-height-percent:0;mso-width-relative:margin;mso-height-relative:margin;v-text-anchor:middle" o:gfxdata="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" fillcolor="black [3213]" strokecolor="black [3213]" strokeweight="2pt">
+                <v:textbox>
+                  <w:txbxContent>
+                    <w:p>
+                      <w:pPr>
+                        <w:pStyle w:val="Sinespaciado"/>
+                        <w:rPr>
+                          <w:rFonts w:ascii="Cascadia Mono SemiBold" w:hAnsi="Cascadia Mono SemiBold" w:cs="Cascadia Mono SemiBold"/>
+                          <w:sz w:val="20"/>
+                          <w:szCs w:val="20"/>
+                          <w:lang w:val="es-ES"/>
+                        </w:rPr>
+                      </w:pPr>
+                      <w:r>
+                        <w:rPr>
+                          <w:rFonts w:ascii="Cascadia Mono SemiBold" w:hAnsi="Cascadia Mono SemiBold" w:cs="Cascadia Mono SemiBold"/>
+                          <w:sz w:val="20"/>
+                          <w:szCs w:val="20"/>
+                          <w:lang w:val="es-ES"/>
+                        </w:rPr>
+                        <w:t>Directorio Actual: C:\Users\</w:t>
+                      </w:r>
+                      <w:r>
+                        <w:rPr>
+                          <w:rFonts w:ascii="Cascadia Mono SemiBold" w:hAnsi="Cascadia Mono SemiBold" w:cs="Cascadia Mono SemiBold"/>
+                          <w:sz w:val="20"/>
+                          <w:szCs w:val="20"/>
+                          <w:lang w:val="es-ES"/>
+                        </w:rPr>
+                        <w:t>XXXX</w:t>
+                      </w:r>
+                      <w:r>
+                        <w:rPr>
+                          <w:rFonts w:ascii="Cascadia Mono SemiBold" w:hAnsi="Cascadia Mono SemiBold" w:cs="Cascadia Mono SemiBold"/>
+                          <w:sz w:val="20"/>
+                          <w:szCs w:val="20"/>
+                          <w:lang w:val="es-ES"/>
+                        </w:rPr>
+                        <w:t>\Documents\java_modules\src\ex0</w:t>
+                      </w:r>
+                    </w:p>
+                    <w:p>
+                      <w:pPr>
+                        <w:pStyle w:val="Sinespaciado"/>
+                        <w:rPr>
+                          <w:rFonts w:ascii="Cascadia Mono SemiBold" w:hAnsi="Cascadia Mono SemiBold" w:cs="Cascadia Mono SemiBold"/>
+                          <w:sz w:val="20"/>
+                          <w:szCs w:val="20"/>
+                          <w:lang w:val="es-ES"/>
+                        </w:rPr>
+                      </w:pPr>
+                    </w:p>
+                    <w:p>
+                      <w:pPr>
+                        <w:pStyle w:val="Sinespaciado"/>
+                        <w:rPr>
+                          <w:rFonts w:ascii="Cascadia Mono SemiBold" w:hAnsi="Cascadia Mono SemiBold" w:cs="Cascadia Mono SemiBold"/>
+                          <w:sz w:val="20"/>
+                          <w:szCs w:val="20"/>
+                          <w:lang w:val="es-ES"/>
+                        </w:rPr>
+                      </w:pPr>
+                      <w:r>
+                        <w:rPr>
+                          <w:rFonts w:ascii="Cascadia Mono SemiBold" w:hAnsi="Cascadia Mono SemiBold" w:cs="Cascadia Mono SemiBold"/>
+                          <w:sz w:val="20"/>
+                          <w:szCs w:val="20"/>
+                          <w:lang w:val="es-ES"/>
+                        </w:rPr>
+                        <w:t>=== PLAN DE LA MISIÓN ===</w:t>
+                      </w:r>
+                    </w:p>
+                    <w:p>
+                      <w:pPr>
+                        <w:pStyle w:val="Sinespaciado"/>
+                        <w:rPr>
+                          <w:rFonts w:ascii="Cascadia Mono SemiBold" w:hAnsi="Cascadia Mono SemiBold" w:cs="Cascadia Mono SemiBold"/>
+                          <w:sz w:val="20"/>
+                          <w:szCs w:val="20"/>
+                          <w:lang w:val="es-ES"/>
+                        </w:rPr>
+                      </w:pPr>
+                      <w:r>
+                        <w:rPr>
+                          <w:rFonts w:ascii="Cascadia Mono SemiBold" w:hAnsi="Cascadia Mono SemiBold" w:cs="Cascadia Mono SemiBold"/>
+                          <w:sz w:val="20"/>
+                          <w:szCs w:val="20"/>
+                          <w:lang w:val="es-ES"/>
+                        </w:rPr>
+                        <w:t>1. Encender motores</w:t>
+                      </w:r>
+                    </w:p>
+                    <w:p>
+                      <w:pPr>
+                        <w:pStyle w:val="Sinespaciado"/>
+                        <w:rPr>
+                          <w:rFonts w:ascii="Cascadia Mono SemiBold" w:hAnsi="Cascadia Mono SemiBold" w:cs="Cascadia Mono SemiBold"/>
+                          <w:sz w:val="20"/>
+                          <w:szCs w:val="20"/>
+                          <w:lang w:val="es-ES"/>
+                        </w:rPr>
+                      </w:pPr>
+                      <w:r>
+                        <w:rPr>
+                          <w:rFonts w:ascii="Cascadia Mono SemiBold" w:hAnsi="Cascadia Mono SemiBold" w:cs="Cascadia Mono SemiBold"/>
+                          <w:sz w:val="20"/>
+                          <w:szCs w:val="20"/>
+                          <w:lang w:val="es-ES"/>
+                        </w:rPr>
+                        <w:t>2. Verificar combustible</w:t>
+                      </w:r>
+                    </w:p>
+                    <w:p>
+                      <w:pPr>
+                        <w:pStyle w:val="Sinespaciado"/>
+                        <w:rPr>
+                          <w:rFonts w:ascii="Cascadia Mono SemiBold" w:hAnsi="Cascadia Mono SemiBold" w:cs="Cascadia Mono SemiBold"/>
+                          <w:sz w:val="20"/>
+                          <w:szCs w:val="20"/>
+                          <w:lang w:val="es-ES"/>
+                        </w:rPr>
+                      </w:pPr>
+                      <w:r>
+                        <w:rPr>
+                          <w:rFonts w:ascii="Cascadia Mono SemiBold" w:hAnsi="Cascadia Mono SemiBold" w:cs="Cascadia Mono SemiBold"/>
+                          <w:sz w:val="20"/>
+                          <w:szCs w:val="20"/>
+                          <w:lang w:val="es-ES"/>
+                        </w:rPr>
+                        <w:t>3. Despegar</w:t>
+                      </w:r>
+                    </w:p>
+                    <w:p>
+                      <w:pPr>
+                        <w:pStyle w:val="Sinespaciado"/>
+                        <w:rPr>
+                          <w:rFonts w:ascii="Cascadia Mono SemiBold" w:hAnsi="Cascadia Mono SemiBold" w:cs="Cascadia Mono SemiBold"/>
+                          <w:sz w:val="20"/>
+                          <w:szCs w:val="20"/>
+                          <w:lang w:val="es-ES"/>
+                        </w:rPr>
+                      </w:pPr>
+                      <w:r>
+                        <w:rPr>
+                          <w:rFonts w:ascii="Cascadia Mono SemiBold" w:hAnsi="Cascadia Mono SemiBold" w:cs="Cascadia Mono SemiBold"/>
+                          <w:sz w:val="20"/>
+                          <w:szCs w:val="20"/>
+                          <w:lang w:val="es-ES"/>
+                        </w:rPr>
+                        <w:t>4. Entrar en órbita</w:t>
+                      </w:r>
+                    </w:p>
+                    <w:p>
+                      <w:pPr>
+                        <w:pStyle w:val="Sinespaciado"/>
+                        <w:rPr>
+                          <w:rFonts w:ascii="Cascadia Mono SemiBold" w:hAnsi="Cascadia Mono SemiBold" w:cs="Cascadia Mono SemiBold"/>
+                          <w:sz w:val="20"/>
+                          <w:szCs w:val="20"/>
+                          <w:lang w:val="es-ES"/>
+                        </w:rPr>
+                      </w:pPr>
+                      <w:r>
+                        <w:rPr>
+                          <w:rFonts w:ascii="Cascadia Mono SemiBold" w:hAnsi="Cascadia Mono SemiBold" w:cs="Cascadia Mono SemiBold"/>
+                          <w:sz w:val="20"/>
+                          <w:szCs w:val="20"/>
+                          <w:lang w:val="es-ES"/>
+                        </w:rPr>
+                        <w:t>5. Iniciar exploració</w:t>
+                      </w:r>
+                      <w:r>
+                        <w:rPr>
+                          <w:rFonts w:ascii="Cascadia Mono SemiBold" w:hAnsi="Cascadia Mono SemiBold" w:cs="Cascadia Mono SemiBold"/>
+                          <w:sz w:val="20"/>
+                          <w:szCs w:val="20"/>
+                          <w:lang w:val="es-ES"/>
+                        </w:rPr>
+                        <w:t>n</w:t>
                       </w:r>
                     </w:p>
                   </w:txbxContent>
@@ -5145,14 +5903,30 @@
         </w:rPr>
         <w:t xml:space="preserve"> </w:t>
       </w:r>
-      <w:proofErr w:type="spellStart"/>
       <w:r>
         <w:rPr>
           <w:spacing w:val="-2"/>
         </w:rPr>
         <w:t>SceneCleaner.jav</w:t>
       </w:r>
-      <w:proofErr w:type="spellEnd"/>
+      <w:r>
+        <w:rPr>
+          <w:spacing w:val="-2"/>
+        </w:rPr>
+        <w:t>a</w:t>
+      </w:r>
+      <w:r>
+        <w:rPr>
+          <w:spacing w:val="-2"/>
+        </w:rPr>
+        <w:t xml:space="preserve">, </w:t>
+      </w:r>
+      <w:r>
+        <w:rPr>
+          <w:spacing w:val="-2"/>
+        </w:rPr>
+        <w:t>escena.txt</w:t>
+      </w:r>
     </w:p>
     <w:p>
       <w:pPr>
@@ -5167,6 +5941,7 @@
         <w:spacing w:line="293" w:lineRule="exact"/>
         <w:ind w:left="1341"/>
         <w:rPr>
+          <w:w w:val="90"/>
           <w:lang w:val="en-US"/>
         </w:rPr>
       </w:pPr>
@@ -5201,7 +5976,46 @@
           <w:w w:val="90"/>
           <w:lang w:val="en-US"/>
         </w:rPr>
-        <w:t>Any.</w:t>
+        <w:t xml:space="preserve">public static void </w:t>
+      </w:r>
+      <w:proofErr w:type="gramStart"/>
+      <w:r>
+        <w:rPr>
+          <w:w w:val="90"/>
+          <w:lang w:val="en-US"/>
+        </w:rPr>
+        <w:t>main(</w:t>
+      </w:r>
+      <w:proofErr w:type="gramEnd"/>
+      <w:r>
+        <w:rPr>
+          <w:w w:val="90"/>
+          <w:lang w:val="en-US"/>
+        </w:rPr>
+        <w:t xml:space="preserve">String[] </w:t>
+      </w:r>
+      <w:proofErr w:type="spellStart"/>
+      <w:r>
+        <w:rPr>
+          <w:w w:val="90"/>
+          <w:lang w:val="en-US"/>
+        </w:rPr>
+        <w:t>args</w:t>
+      </w:r>
+      <w:proofErr w:type="spellEnd"/>
+      <w:r>
+        <w:rPr>
+          <w:w w:val="90"/>
+          <w:lang w:val="en-US"/>
+        </w:rPr>
+        <w:t>)</w:t>
+      </w:r>
+      <w:r>
+        <w:rPr>
+          <w:w w:val="90"/>
+          <w:lang w:val="en-US"/>
+        </w:rPr>
+        <w:t>.</w:t>
       </w:r>
     </w:p>
     <w:p>
@@ -5449,6 +6263,11 @@
     </w:p>
     <w:p>
       <w:pPr>
+        <w:pStyle w:val="Sinespaciado"/>
+      </w:pPr>
+    </w:p>
+    <w:p>
+      <w:pPr>
         <w:ind w:left="622"/>
         <w:rPr>
           <w:spacing w:val="-6"/>
@@ -5492,50 +6311,63 @@
     <w:p>
       <w:pPr>
         <w:ind w:left="622"/>
-      </w:pPr>
-    </w:p>
-    <w:p>
-      <w:pPr>
-        <w:pStyle w:val="Textoindependiente"/>
-        <w:spacing w:before="1" w:line="252" w:lineRule="auto"/>
-        <w:ind w:left="622" w:right="672"/>
-      </w:pPr>
-      <w:r>
+        <w:rPr>
+          <w:spacing w:val="-6"/>
+        </w:rPr>
+      </w:pPr>
+    </w:p>
+    <w:p>
+      <w:pPr>
+        <w:ind w:left="622"/>
         <w:rPr>
           <w:b/>
           <w:bCs/>
-        </w:rPr>
-        <w:t>Salida Esperada</w:t>
-      </w:r>
-    </w:p>
-    <w:p>
-      <w:pPr>
-        <w:pStyle w:val="Sinespaciado"/>
+          <w:spacing w:val="-8"/>
+        </w:rPr>
+      </w:pPr>
+      <w:r>
+        <w:rPr>
+          <w:b/>
+          <w:bCs/>
+          <w:spacing w:val="-8"/>
+        </w:rPr>
+        <w:t>escena</w:t>
+      </w:r>
+      <w:r>
+        <w:rPr>
+          <w:b/>
+          <w:bCs/>
+          <w:spacing w:val="-8"/>
+        </w:rPr>
+        <w:t>.txt</w:t>
+      </w:r>
+    </w:p>
+    <w:p>
+      <w:pPr>
         <w:ind w:left="622"/>
         <w:rPr>
-          <w:lang w:val="es-ES"/>
+          <w:spacing w:val="-8"/>
         </w:rPr>
       </w:pPr>
       <w:r>
         <w:rPr>
           <w:noProof/>
-          <w:lang w:val="es-ES"/>
         </w:rPr>
         <mc:AlternateContent>
           <mc:Choice Requires="wps">
             <w:drawing>
-              <wp:anchor distT="0" distB="0" distL="114300" distR="114300" simplePos="0" relativeHeight="251646976" behindDoc="0" locked="0" layoutInCell="1" allowOverlap="1" wp14:anchorId="6EEA5942" wp14:editId="54EA2910">
+              <wp:anchor distT="0" distB="0" distL="114300" distR="114300" simplePos="0" relativeHeight="251661824" behindDoc="0" locked="0" layoutInCell="1" allowOverlap="1" wp14:anchorId="5CCC47C2" wp14:editId="1DB1FA8E">
                 <wp:simplePos x="0" y="0"/>
                 <wp:positionH relativeFrom="margin">
-                  <wp:posOffset>400050</wp:posOffset>
+                  <wp:posOffset>419100</wp:posOffset>
                 </wp:positionH>
                 <wp:positionV relativeFrom="paragraph">
-                  <wp:posOffset>79376</wp:posOffset>
+                  <wp:posOffset>122555</wp:posOffset>
                 </wp:positionV>
-                <wp:extent cx="5518205" cy="571500"/>
+                <wp:extent cx="5518205" cy="1162050"/>
                 <wp:effectExtent l="0" t="0" r="25400" b="19050"/>
                 <wp:wrapNone/>
-                <wp:docPr id="1692332025" name="Rectángulo 2"/>
+                <wp:docPr id="1535638191" name="Rectángulo 2"/>
                 <wp:cNvGraphicFramePr/>
                 <a:graphic xmlns:a="http://schemas.openxmlformats.org/drawingml/2006/main">
                   <a:graphicData uri="http://schemas.microsoft.com/office/word/2010/wordprocessingShape">
@@ -5544,7 +6376,7 @@
                       <wps:spPr>
                         <a:xfrm>
                           <a:off x="0" y="0"/>
-                          <a:ext cx="5518205" cy="571500"/>
+                          <a:ext cx="5518205" cy="1162050"/>
                         </a:xfrm>
                         <a:prstGeom prst="rect">
                           <a:avLst/>
@@ -5589,7 +6421,71 @@
                                 <w:rFonts w:ascii="Cascadia Mono SemiBold" w:hAnsi="Cascadia Mono SemiBold" w:cs="Cascadia Mono SemiBold"/>
                                 <w:lang w:val="es-ES"/>
                               </w:rPr>
-                              <w:t>Líneas importantes en formato "DEADPOOL-STYLE" (MAYÚSCULAS).</w:t>
+                              <w:t>Se encontraron huellas en la ventana</w:t>
+                            </w:r>
+                          </w:p>
+                          <w:p>
+                            <w:pPr>
+                              <w:pStyle w:val="Sinespaciado"/>
+                              <w:rPr>
+                                <w:rFonts w:ascii="Cascadia Mono SemiBold" w:hAnsi="Cascadia Mono SemiBold" w:cs="Cascadia Mono SemiBold"/>
+                                <w:lang w:val="es-ES"/>
+                              </w:rPr>
+                            </w:pPr>
+                            <w:r>
+                              <w:rPr>
+                                <w:rFonts w:ascii="Cascadia Mono SemiBold" w:hAnsi="Cascadia Mono SemiBold" w:cs="Cascadia Mono SemiBold"/>
+                                <w:lang w:val="es-ES"/>
+                              </w:rPr>
+                              <w:t>NOISE: interferencia de radio detectada</w:t>
+                            </w:r>
+                          </w:p>
+                          <w:p>
+                            <w:pPr>
+                              <w:pStyle w:val="Sinespaciado"/>
+                              <w:rPr>
+                                <w:rFonts w:ascii="Cascadia Mono SemiBold" w:hAnsi="Cascadia Mono SemiBold" w:cs="Cascadia Mono SemiBold"/>
+                                <w:lang w:val="es-ES"/>
+                              </w:rPr>
+                            </w:pPr>
+                            <w:r>
+                              <w:rPr>
+                                <w:rFonts w:ascii="Cascadia Mono SemiBold" w:hAnsi="Cascadia Mono SemiBold" w:cs="Cascadia Mono SemiBold"/>
+                                <w:lang w:val="es-ES"/>
+                              </w:rPr>
+                              <w:t>El sospechoso llevaba una chaqueta negra</w:t>
+                            </w:r>
+                          </w:p>
+                          <w:p>
+                            <w:pPr>
+                              <w:pStyle w:val="Sinespaciado"/>
+                              <w:rPr>
+                                <w:rFonts w:ascii="Cascadia Mono SemiBold" w:hAnsi="Cascadia Mono SemiBold" w:cs="Cascadia Mono SemiBold"/>
+                                <w:lang w:val="es-ES"/>
+                              </w:rPr>
+                            </w:pPr>
+                            <w:r>
+                              <w:rPr>
+                                <w:rFonts w:ascii="Cascadia Mono SemiBold" w:hAnsi="Cascadia Mono SemiBold" w:cs="Cascadia Mono SemiBold"/>
+                                <w:lang w:val="es-ES"/>
+                              </w:rPr>
+                              <w:t>CIVILIAN: testigo anónimo reportó el incidente</w:t>
+                            </w:r>
+                          </w:p>
+                          <w:p>
+                            <w:pPr>
+                              <w:pStyle w:val="Sinespaciado"/>
+                              <w:rPr>
+                                <w:rFonts w:ascii="Cascadia Mono SemiBold" w:hAnsi="Cascadia Mono SemiBold" w:cs="Cascadia Mono SemiBold"/>
+                                <w:lang w:val="es-ES"/>
+                              </w:rPr>
+                            </w:pPr>
+                            <w:r>
+                              <w:rPr>
+                                <w:rFonts w:ascii="Cascadia Mono SemiBold" w:hAnsi="Cascadia Mono SemiBold" w:cs="Cascadia Mono SemiBold"/>
+                                <w:lang w:val="es-ES"/>
+                              </w:rPr>
+                              <w:t>Casquillo de bala hallado cerca de la puerta</w:t>
                             </w:r>
                           </w:p>
                         </w:txbxContent>
@@ -5614,7 +6510,7 @@
           </mc:Choice>
           <mc:Fallback>
             <w:pict>
-              <v:rect w14:anchorId="6EEA5942" id="_x0000_s1027" style="position:absolute;left:0;text-align:left;margin-left:31.5pt;margin-top:6.25pt;width:434.5pt;height:45pt;z-index:251646976;visibility:visible;mso-wrap-style:square;mso-width-percent:0;mso-height-percent:0;mso-wrap-distance-left:9pt;mso-wrap-distance-top:0;mso-wrap-distance-right:9pt;mso-wrap-distance-bottom:0;mso-position-horizontal:absolute;mso-position-horizontal-relative:margin;mso-position-vertical:absolute;mso-position-vertical-relative:text;mso-width-percent:0;mso-height-percent:0;mso-width-relative:margin;mso-height-relative:margin;v-text-anchor:middle" o:gfxdata="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" fillcolor="black [3213]" strokecolor="black [3213]" strokeweight="2pt">
+              <v:rect w14:anchorId="5CCC47C2" id="_x0000_s1028" style="position:absolute;left:0;text-align:left;margin-left:33pt;margin-top:9.65pt;width:434.5pt;height:91.5pt;z-index:251661824;visibility:visible;mso-wrap-style:square;mso-width-percent:0;mso-height-percent:0;mso-wrap-distance-left:9pt;mso-wrap-distance-top:0;mso-wrap-distance-right:9pt;mso-wrap-distance-bottom:0;mso-position-horizontal:absolute;mso-position-horizontal-relative:margin;mso-position-vertical:absolute;mso-position-vertical-relative:text;mso-width-percent:0;mso-height-percent:0;mso-width-relative:margin;mso-height-relative:margin;v-text-anchor:middle" o:gfxdata="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" fillcolor="black [3213]" strokecolor="black [3213]" strokeweight="2pt">
                 <v:textbox>
                   <w:txbxContent>
                     <w:p>
@@ -5630,7 +6526,341 @@
                           <w:rFonts w:ascii="Cascadia Mono SemiBold" w:hAnsi="Cascadia Mono SemiBold" w:cs="Cascadia Mono SemiBold"/>
                           <w:lang w:val="es-ES"/>
                         </w:rPr>
-                        <w:t>Líneas importantes en formato "DEADPOOL-STYLE" (MAYÚSCULAS).</w:t>
+                        <w:t>Se encontraron huellas en la ventana</w:t>
+                      </w:r>
+                    </w:p>
+                    <w:p>
+                      <w:pPr>
+                        <w:pStyle w:val="Sinespaciado"/>
+                        <w:rPr>
+                          <w:rFonts w:ascii="Cascadia Mono SemiBold" w:hAnsi="Cascadia Mono SemiBold" w:cs="Cascadia Mono SemiBold"/>
+                          <w:lang w:val="es-ES"/>
+                        </w:rPr>
+                      </w:pPr>
+                      <w:r>
+                        <w:rPr>
+                          <w:rFonts w:ascii="Cascadia Mono SemiBold" w:hAnsi="Cascadia Mono SemiBold" w:cs="Cascadia Mono SemiBold"/>
+                          <w:lang w:val="es-ES"/>
+                        </w:rPr>
+                        <w:t>NOISE: interferencia de radio detectada</w:t>
+                      </w:r>
+                    </w:p>
+                    <w:p>
+                      <w:pPr>
+                        <w:pStyle w:val="Sinespaciado"/>
+                        <w:rPr>
+                          <w:rFonts w:ascii="Cascadia Mono SemiBold" w:hAnsi="Cascadia Mono SemiBold" w:cs="Cascadia Mono SemiBold"/>
+                          <w:lang w:val="es-ES"/>
+                        </w:rPr>
+                      </w:pPr>
+                      <w:r>
+                        <w:rPr>
+                          <w:rFonts w:ascii="Cascadia Mono SemiBold" w:hAnsi="Cascadia Mono SemiBold" w:cs="Cascadia Mono SemiBold"/>
+                          <w:lang w:val="es-ES"/>
+                        </w:rPr>
+                        <w:t>El sospechoso llevaba una chaqueta negra</w:t>
+                      </w:r>
+                    </w:p>
+                    <w:p>
+                      <w:pPr>
+                        <w:pStyle w:val="Sinespaciado"/>
+                        <w:rPr>
+                          <w:rFonts w:ascii="Cascadia Mono SemiBold" w:hAnsi="Cascadia Mono SemiBold" w:cs="Cascadia Mono SemiBold"/>
+                          <w:lang w:val="es-ES"/>
+                        </w:rPr>
+                      </w:pPr>
+                      <w:r>
+                        <w:rPr>
+                          <w:rFonts w:ascii="Cascadia Mono SemiBold" w:hAnsi="Cascadia Mono SemiBold" w:cs="Cascadia Mono SemiBold"/>
+                          <w:lang w:val="es-ES"/>
+                        </w:rPr>
+                        <w:t>CIVILIAN: testigo anónimo reportó el incidente</w:t>
+                      </w:r>
+                    </w:p>
+                    <w:p>
+                      <w:pPr>
+                        <w:pStyle w:val="Sinespaciado"/>
+                        <w:rPr>
+                          <w:rFonts w:ascii="Cascadia Mono SemiBold" w:hAnsi="Cascadia Mono SemiBold" w:cs="Cascadia Mono SemiBold"/>
+                          <w:lang w:val="es-ES"/>
+                        </w:rPr>
+                      </w:pPr>
+                      <w:r>
+                        <w:rPr>
+                          <w:rFonts w:ascii="Cascadia Mono SemiBold" w:hAnsi="Cascadia Mono SemiBold" w:cs="Cascadia Mono SemiBold"/>
+                          <w:lang w:val="es-ES"/>
+                        </w:rPr>
+                        <w:t>Casquillo de bala hallado cerca de la puerta</w:t>
+                      </w:r>
+                    </w:p>
+                  </w:txbxContent>
+                </v:textbox>
+                <w10:wrap anchorx="margin"/>
+              </v:rect>
+            </w:pict>
+          </mc:Fallback>
+        </mc:AlternateContent>
+      </w:r>
+    </w:p>
+    <w:p>
+      <w:pPr>
+        <w:ind w:left="622"/>
+        <w:rPr>
+          <w:spacing w:val="-8"/>
+        </w:rPr>
+      </w:pPr>
+    </w:p>
+    <w:p>
+      <w:pPr>
+        <w:ind w:left="622"/>
+      </w:pPr>
+    </w:p>
+    <w:p>
+      <w:pPr>
+        <w:pStyle w:val="Textoindependiente"/>
+        <w:spacing w:before="1" w:line="252" w:lineRule="auto"/>
+        <w:ind w:left="622" w:right="672"/>
+        <w:rPr>
+          <w:b/>
+          <w:bCs/>
+        </w:rPr>
+      </w:pPr>
+    </w:p>
+    <w:p>
+      <w:pPr>
+        <w:pStyle w:val="Textoindependiente"/>
+        <w:spacing w:before="1" w:line="252" w:lineRule="auto"/>
+        <w:ind w:right="672"/>
+        <w:rPr>
+          <w:b/>
+          <w:bCs/>
+        </w:rPr>
+      </w:pPr>
+    </w:p>
+    <w:p>
+      <w:pPr>
+        <w:pStyle w:val="Textoindependiente"/>
+        <w:spacing w:before="1" w:line="252" w:lineRule="auto"/>
+        <w:ind w:right="672"/>
+        <w:rPr>
+          <w:b/>
+          <w:bCs/>
+        </w:rPr>
+      </w:pPr>
+    </w:p>
+    <w:p>
+      <w:pPr>
+        <w:pStyle w:val="Textoindependiente"/>
+        <w:spacing w:before="1" w:line="252" w:lineRule="auto"/>
+        <w:ind w:left="622" w:right="672"/>
+        <w:rPr>
+          <w:b/>
+          <w:bCs/>
+        </w:rPr>
+      </w:pPr>
+    </w:p>
+    <w:p/>
+    <w:p>
+      <w:pPr>
+        <w:pStyle w:val="Textoindependiente"/>
+        <w:spacing w:before="1" w:line="252" w:lineRule="auto"/>
+        <w:ind w:left="622" w:right="672"/>
+      </w:pPr>
+      <w:r>
+        <w:rPr>
+          <w:b/>
+          <w:bCs/>
+        </w:rPr>
+        <w:t>Salida Esperada</w:t>
+      </w:r>
+    </w:p>
+    <w:p>
+      <w:pPr>
+        <w:pStyle w:val="Sinespaciado"/>
+        <w:ind w:left="622"/>
+        <w:rPr>
+          <w:lang w:val="es-ES"/>
+        </w:rPr>
+      </w:pPr>
+      <w:r>
+        <w:rPr>
+          <w:noProof/>
+          <w:lang w:val="es-ES"/>
+        </w:rPr>
+        <mc:AlternateContent>
+          <mc:Choice Requires="wps">
+            <w:drawing>
+              <wp:anchor distT="0" distB="0" distL="114300" distR="114300" simplePos="0" relativeHeight="251646976" behindDoc="0" locked="0" layoutInCell="1" allowOverlap="1" wp14:anchorId="6EEA5942" wp14:editId="0B3FB99D">
+                <wp:simplePos x="0" y="0"/>
+                <wp:positionH relativeFrom="margin">
+                  <wp:posOffset>400050</wp:posOffset>
+                </wp:positionH>
+                <wp:positionV relativeFrom="paragraph">
+                  <wp:posOffset>74930</wp:posOffset>
+                </wp:positionV>
+                <wp:extent cx="5518205" cy="838200"/>
+                <wp:effectExtent l="0" t="0" r="25400" b="19050"/>
+                <wp:wrapNone/>
+                <wp:docPr id="1692332025" name="Rectángulo 2"/>
+                <wp:cNvGraphicFramePr/>
+                <a:graphic xmlns:a="http://schemas.openxmlformats.org/drawingml/2006/main">
+                  <a:graphicData uri="http://schemas.microsoft.com/office/word/2010/wordprocessingShape">
+                    <wps:wsp>
+                      <wps:cNvSpPr/>
+                      <wps:spPr>
+                        <a:xfrm>
+                          <a:off x="0" y="0"/>
+                          <a:ext cx="5518205" cy="838200"/>
+                        </a:xfrm>
+                        <a:prstGeom prst="rect">
+                          <a:avLst/>
+                        </a:prstGeom>
+                        <a:solidFill>
+                          <a:schemeClr val="tx1"/>
+                        </a:solidFill>
+                        <a:ln>
+                          <a:solidFill>
+                            <a:schemeClr val="tx1"/>
+                          </a:solidFill>
+                        </a:ln>
+                      </wps:spPr>
+                      <wps:style>
+                        <a:lnRef idx="2">
+                          <a:schemeClr val="accent1">
+                            <a:shade val="15000"/>
+                          </a:schemeClr>
+                        </a:lnRef>
+                        <a:fillRef idx="1">
+                          <a:schemeClr val="accent1"/>
+                        </a:fillRef>
+                        <a:effectRef idx="0">
+                          <a:schemeClr val="accent1"/>
+                        </a:effectRef>
+                        <a:fontRef idx="minor">
+                          <a:schemeClr val="lt1"/>
+                        </a:fontRef>
+                      </wps:style>
+                      <wps:txbx>
+                        <w:txbxContent>
+                          <w:p>
+                            <w:pPr>
+                              <w:pStyle w:val="Sinespaciado"/>
+                              <w:rPr>
+                                <w:rFonts w:ascii="Cascadia Mono SemiBold" w:hAnsi="Cascadia Mono SemiBold" w:cs="Cascadia Mono SemiBold"/>
+                                <w:lang w:val="es-ES"/>
+                              </w:rPr>
+                            </w:pPr>
+                            <w:r>
+                              <w:rPr>
+                                <w:rFonts w:ascii="Cascadia Mono SemiBold" w:hAnsi="Cascadia Mono SemiBold" w:cs="Cascadia Mono SemiBold"/>
+                                <w:lang w:val="es-ES"/>
+                              </w:rPr>
+                              <w:t>SE ENCONTRARON HUELLAS EN LA VENTANA</w:t>
+                            </w:r>
+                          </w:p>
+                          <w:p>
+                            <w:pPr>
+                              <w:pStyle w:val="Sinespaciado"/>
+                              <w:rPr>
+                                <w:rFonts w:ascii="Cascadia Mono SemiBold" w:hAnsi="Cascadia Mono SemiBold" w:cs="Cascadia Mono SemiBold"/>
+                                <w:lang w:val="es-ES"/>
+                              </w:rPr>
+                            </w:pPr>
+                            <w:r>
+                              <w:rPr>
+                                <w:rFonts w:ascii="Cascadia Mono SemiBold" w:hAnsi="Cascadia Mono SemiBold" w:cs="Cascadia Mono SemiBold"/>
+                                <w:lang w:val="es-ES"/>
+                              </w:rPr>
+                              <w:t>EL SOSPECHOSO LLEVABA UNA CHAQUETA NEGRA</w:t>
+                            </w:r>
+                          </w:p>
+                          <w:p>
+                            <w:pPr>
+                              <w:pStyle w:val="Sinespaciado"/>
+                              <w:rPr>
+                                <w:rFonts w:ascii="Cascadia Mono SemiBold" w:hAnsi="Cascadia Mono SemiBold" w:cs="Cascadia Mono SemiBold"/>
+                                <w:lang w:val="es-ES"/>
+                              </w:rPr>
+                            </w:pPr>
+                            <w:r>
+                              <w:rPr>
+                                <w:rFonts w:ascii="Cascadia Mono SemiBold" w:hAnsi="Cascadia Mono SemiBold" w:cs="Cascadia Mono SemiBold"/>
+                                <w:lang w:val="es-ES"/>
+                              </w:rPr>
+                              <w:t>CASQUILLO DE BALA HALLADO CERCA DE LA PUERTA</w:t>
+                            </w:r>
+                          </w:p>
+                        </w:txbxContent>
+                      </wps:txbx>
+                      <wps:bodyPr rot="0" spcFirstLastPara="0" vertOverflow="overflow" horzOverflow="overflow" vert="horz" wrap="square" lIns="91440" tIns="45720" rIns="91440" bIns="45720" numCol="1" spcCol="0" rtlCol="0" fromWordArt="0" anchor="ctr" anchorCtr="0" forceAA="0" compatLnSpc="1">
+                        <a:prstTxWarp prst="textNoShape">
+                          <a:avLst/>
+                        </a:prstTxWarp>
+                        <a:noAutofit/>
+                      </wps:bodyPr>
+                    </wps:wsp>
+                  </a:graphicData>
+                </a:graphic>
+                <wp14:sizeRelH relativeFrom="margin">
+                  <wp14:pctWidth>0</wp14:pctWidth>
+                </wp14:sizeRelH>
+                <wp14:sizeRelV relativeFrom="margin">
+                  <wp14:pctHeight>0</wp14:pctHeight>
+                </wp14:sizeRelV>
+              </wp:anchor>
+            </w:drawing>
+          </mc:Choice>
+          <mc:Fallback>
+            <w:pict>
+              <v:rect w14:anchorId="6EEA5942" id="_x0000_s1029" style="position:absolute;left:0;text-align:left;margin-left:31.5pt;margin-top:5.9pt;width:434.5pt;height:66pt;z-index:251646976;visibility:visible;mso-wrap-style:square;mso-width-percent:0;mso-height-percent:0;mso-wrap-distance-left:9pt;mso-wrap-distance-top:0;mso-wrap-distance-right:9pt;mso-wrap-distance-bottom:0;mso-position-horizontal:absolute;mso-position-horizontal-relative:margin;mso-position-vertical:absolute;mso-position-vertical-relative:text;mso-width-percent:0;mso-height-percent:0;mso-width-relative:margin;mso-height-relative:margin;v-text-anchor:middle" o:gfxdata="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" fillcolor="black [3213]" strokecolor="black [3213]" strokeweight="2pt">
+                <v:textbox>
+                  <w:txbxContent>
+                    <w:p>
+                      <w:pPr>
+                        <w:pStyle w:val="Sinespaciado"/>
+                        <w:rPr>
+                          <w:rFonts w:ascii="Cascadia Mono SemiBold" w:hAnsi="Cascadia Mono SemiBold" w:cs="Cascadia Mono SemiBold"/>
+                          <w:lang w:val="es-ES"/>
+                        </w:rPr>
+                      </w:pPr>
+                      <w:r>
+                        <w:rPr>
+                          <w:rFonts w:ascii="Cascadia Mono SemiBold" w:hAnsi="Cascadia Mono SemiBold" w:cs="Cascadia Mono SemiBold"/>
+                          <w:lang w:val="es-ES"/>
+                        </w:rPr>
+                        <w:t>SE ENCONTRARON HUELLAS EN LA VENTANA</w:t>
+                      </w:r>
+                    </w:p>
+                    <w:p>
+                      <w:pPr>
+                        <w:pStyle w:val="Sinespaciado"/>
+                        <w:rPr>
+                          <w:rFonts w:ascii="Cascadia Mono SemiBold" w:hAnsi="Cascadia Mono SemiBold" w:cs="Cascadia Mono SemiBold"/>
+                          <w:lang w:val="es-ES"/>
+                        </w:rPr>
+                      </w:pPr>
+                      <w:r>
+                        <w:rPr>
+                          <w:rFonts w:ascii="Cascadia Mono SemiBold" w:hAnsi="Cascadia Mono SemiBold" w:cs="Cascadia Mono SemiBold"/>
+                          <w:lang w:val="es-ES"/>
+                        </w:rPr>
+                        <w:t>EL SOSPECHOSO LLEVABA UNA CHAQUETA NEGRA</w:t>
+                      </w:r>
+                    </w:p>
+                    <w:p>
+                      <w:pPr>
+                        <w:pStyle w:val="Sinespaciado"/>
+                        <w:rPr>
+                          <w:rFonts w:ascii="Cascadia Mono SemiBold" w:hAnsi="Cascadia Mono SemiBold" w:cs="Cascadia Mono SemiBold"/>
+                          <w:lang w:val="es-ES"/>
+                        </w:rPr>
+                      </w:pPr>
+                      <w:r>
+                        <w:rPr>
+                          <w:rFonts w:ascii="Cascadia Mono SemiBold" w:hAnsi="Cascadia Mono SemiBold" w:cs="Cascadia Mono SemiBold"/>
+                          <w:lang w:val="es-ES"/>
+                        </w:rPr>
+                        <w:t>CASQUILLO DE BALA HALLADO CERCA DE LA PUERTA</w:t>
                       </w:r>
                     </w:p>
                   </w:txbxContent>
@@ -6212,7 +7442,7 @@
           </mc:Choice>
           <mc:Fallback>
             <w:pict>
-              <v:rect w14:anchorId="58BA83F3" id="_x0000_s1028" style="position:absolute;left:0;text-align:left;margin-left:31.2pt;margin-top:5.85pt;width:434.5pt;height:66pt;z-index:251649024;visibility:visible;mso-wrap-style:square;mso-width-percent:0;mso-height-percent:0;mso-wrap-distance-left:9pt;mso-wrap-distance-top:0;mso-wrap-distance-right:9pt;mso-wrap-distance-bottom:0;mso-position-horizontal:absolute;mso-position-horizontal-relative:margin;mso-position-vertical:absolute;mso-position-vertical-relative:text;mso-width-percent:0;mso-height-percent:0;mso-width-relative:margin;mso-height-relative:margin;v-text-anchor:middle" o:gfxdata="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" fillcolor="black [3213]" strokecolor="black [3213]" strokeweight="2pt">
+              <v:rect w14:anchorId="58BA83F3" id="_x0000_s1030" style="position:absolute;left:0;text-align:left;margin-left:31.2pt;margin-top:5.85pt;width:434.5pt;height:66pt;z-index:251649024;visibility:visible;mso-wrap-style:square;mso-width-percent:0;mso-height-percent:0;mso-wrap-distance-left:9pt;mso-wrap-distance-top:0;mso-wrap-distance-right:9pt;mso-wrap-distance-bottom:0;mso-position-horizontal:absolute;mso-position-horizontal-relative:margin;mso-position-vertical:absolute;mso-position-vertical-relative:text;mso-width-percent:0;mso-height-percent:0;mso-width-relative:margin;mso-height-relative:margin;v-text-anchor:middle" o:gfxdata="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" fillcolor="black [3213]" strokecolor="black [3213]" strokeweight="2pt">
                 <v:textbox>
                   <w:txbxContent>
                     <w:p>
@@ -6861,7 +8091,7 @@
           </mc:Choice>
           <mc:Fallback>
             <w:pict>
-              <v:rect w14:anchorId="4F91A487" id="_x0000_s1029" style="position:absolute;left:0;text-align:left;margin-left:31.2pt;margin-top:6pt;width:434.5pt;height:37.8pt;z-index:251658240;visibility:visible;mso-wrap-style:square;mso-width-percent:0;mso-height-percent:0;mso-wrap-distance-left:9pt;mso-wrap-distance-top:0;mso-wrap-distance-right:9pt;mso-wrap-distance-bottom:0;mso-position-horizontal:absolute;mso-position-horizontal-relative:margin;mso-position-vertical:absolute;mso-position-vertical-relative:text;mso-width-percent:0;mso-height-percent:0;mso-width-relative:margin;mso-height-relative:margin;v-text-anchor:middle" o:gfxdata="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" fillcolor="black [3213]" strokecolor="black [3213]" strokeweight="2pt">
+              <v:rect w14:anchorId="4F91A487" id="_x0000_s1031" style="position:absolute;left:0;text-align:left;margin-left:31.2pt;margin-top:6pt;width:434.5pt;height:37.8pt;z-index:251658240;visibility:visible;mso-wrap-style:square;mso-width-percent:0;mso-height-percent:0;mso-wrap-distance-left:9pt;mso-wrap-distance-top:0;mso-wrap-distance-right:9pt;mso-wrap-distance-bottom:0;mso-position-horizontal:absolute;mso-position-horizontal-relative:margin;mso-position-vertical:absolute;mso-position-vertical-relative:text;mso-width-percent:0;mso-height-percent:0;mso-width-relative:margin;mso-height-relative:margin;v-text-anchor:middle" o:gfxdata="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" fillcolor="black [3213]" strokecolor="black [3213]" strokeweight="2pt">
                 <v:textbox>
                   <w:txbxContent>
                     <w:p>
@@ -7402,7 +8632,7 @@
           </mc:Choice>
           <mc:Fallback>
             <w:pict>
-              <v:rect w14:anchorId="07DEF22C" id="_x0000_s1030" style="position:absolute;margin-left:26.4pt;margin-top:.7pt;width:441.4pt;height:46.8pt;z-index:251642880;visibility:visible;mso-wrap-style:square;mso-width-percent:0;mso-height-percent:0;mso-wrap-distance-left:9pt;mso-wrap-distance-top:0;mso-wrap-distance-right:9pt;mso-wrap-distance-bottom:0;mso-position-horizontal:absolute;mso-position-horizontal-relative:margin;mso-position-vertical:absolute;mso-position-vertical-relative:text;mso-width-percent:0;mso-height-percent:0;mso-width-relative:margin;mso-height-relative:margin;v-text-anchor:middle" o:gfxdata="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" fillcolor="black [3213]" strokecolor="black [3213]" strokeweight="2pt">
+              <v:rect w14:anchorId="07DEF22C" id="_x0000_s1032" style="position:absolute;margin-left:26.4pt;margin-top:.7pt;width:441.4pt;height:46.8pt;z-index:251642880;visibility:visible;mso-wrap-style:square;mso-width-percent:0;mso-height-percent:0;mso-wrap-distance-left:9pt;mso-wrap-distance-top:0;mso-wrap-distance-right:9pt;mso-wrap-distance-bottom:0;mso-position-horizontal:absolute;mso-position-horizontal-relative:margin;mso-position-vertical:absolute;mso-position-vertical-relative:text;mso-width-percent:0;mso-height-percent:0;mso-width-relative:margin;mso-height-relative:margin;v-text-anchor:middle" o:gfxdata="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" fillcolor="black [3213]" strokecolor="black [3213]" strokeweight="2pt">
                 <v:textbox>
                   <w:txbxContent>
                     <w:p>
@@ -8152,7 +9382,7 @@
           </mc:Choice>
           <mc:Fallback>
             <w:pict>
-              <v:rect w14:anchorId="313EC888" id="_x0000_s1031" style="position:absolute;margin-left:24.6pt;margin-top:5.45pt;width:436.4pt;height:42.6pt;z-index:251651072;visibility:visible;mso-wrap-style:square;mso-width-percent:0;mso-height-percent:0;mso-wrap-distance-left:9pt;mso-wrap-distance-top:0;mso-wrap-distance-right:9pt;mso-wrap-distance-bottom:0;mso-position-horizontal:absolute;mso-position-horizontal-relative:margin;mso-position-vertical:absolute;mso-position-vertical-relative:text;mso-width-percent:0;mso-height-percent:0;mso-width-relative:margin;mso-height-relative:margin;v-text-anchor:middle" o:gfxdata="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" fillcolor="black [3213]" strokecolor="black [3213]" strokeweight="2pt">
+              <v:rect w14:anchorId="313EC888" id="_x0000_s1033" style="position:absolute;margin-left:24.6pt;margin-top:5.45pt;width:436.4pt;height:42.6pt;z-index:251651072;visibility:visible;mso-wrap-style:square;mso-width-percent:0;mso-height-percent:0;mso-wrap-distance-left:9pt;mso-wrap-distance-top:0;mso-wrap-distance-right:9pt;mso-wrap-distance-bottom:0;mso-position-horizontal:absolute;mso-position-horizontal-relative:margin;mso-position-vertical:absolute;mso-position-vertical-relative:text;mso-width-percent:0;mso-height-percent:0;mso-width-relative:margin;mso-height-relative:margin;v-text-anchor:middle" o:gfxdata="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" fillcolor="black [3213]" strokecolor="black [3213]" strokeweight="2pt">
                 <v:textbox>
                   <w:txbxContent>
                     <w:p>
@@ -8819,7 +10049,7 @@
           </mc:Choice>
           <mc:Fallback>
             <w:pict>
-              <v:rect w14:anchorId="51756CB7" id="_x0000_s1032" style="position:absolute;left:0;text-align:left;margin-left:31.2pt;margin-top:6.45pt;width:451.4pt;height:49.8pt;z-index:251655168;visibility:visible;mso-wrap-style:square;mso-width-percent:0;mso-height-percent:0;mso-wrap-distance-left:9pt;mso-wrap-distance-top:0;mso-wrap-distance-right:9pt;mso-wrap-distance-bottom:0;mso-position-horizontal:absolute;mso-position-horizontal-relative:margin;mso-position-vertical:absolute;mso-position-vertical-relative:text;mso-width-percent:0;mso-height-percent:0;mso-width-relative:margin;mso-height-relative:margin;v-text-anchor:middle" o:gfxdata="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" fillcolor="black [3213]" strokecolor="black [3213]" strokeweight="2pt">
+              <v:rect w14:anchorId="51756CB7" id="_x0000_s1034" style="position:absolute;left:0;text-align:left;margin-left:31.2pt;margin-top:6.45pt;width:451.4pt;height:49.8pt;z-index:251655168;visibility:visible;mso-wrap-style:square;mso-width-percent:0;mso-height-percent:0;mso-wrap-distance-left:9pt;mso-wrap-distance-top:0;mso-wrap-distance-right:9pt;mso-wrap-distance-bottom:0;mso-position-horizontal:absolute;mso-position-horizontal-relative:margin;mso-position-vertical:absolute;mso-position-vertical-relative:text;mso-width-percent:0;mso-height-percent:0;mso-width-relative:margin;mso-height-relative:margin;v-text-anchor:middle" o:gfxdata="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" fillcolor="black [3213]" strokecolor="black [3213]" strokeweight="2pt">
                 <v:textbox>
                   <w:txbxContent>
                     <w:p>
@@ -9502,7 +10732,7 @@
           </mc:Choice>
           <mc:Fallback>
             <w:pict>
-              <v:rect w14:anchorId="1136D5C1" id="_x0000_s1033" style="position:absolute;left:0;text-align:left;margin-left:31.2pt;margin-top:6.45pt;width:451.4pt;height:56.4pt;z-index:251665408;visibility:visible;mso-wrap-style:square;mso-width-percent:0;mso-height-percent:0;mso-wrap-distance-left:9pt;mso-wrap-distance-top:0;mso-wrap-distance-right:9pt;mso-wrap-distance-bottom:0;mso-position-horizontal:absolute;mso-position-horizontal-relative:margin;mso-position-vertical:absolute;mso-position-vertical-relative:text;mso-width-percent:0;mso-height-percent:0;mso-width-relative:margin;mso-height-relative:margin;v-text-anchor:middle" o:gfxdata="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" fillcolor="black [3213]" strokecolor="black [3213]" strokeweight="2pt">
+              <v:rect w14:anchorId="1136D5C1" id="_x0000_s1035" style="position:absolute;left:0;text-align:left;margin-left:31.2pt;margin-top:6.45pt;width:451.4pt;height:56.4pt;z-index:251665408;visibility:visible;mso-wrap-style:square;mso-width-percent:0;mso-height-percent:0;mso-wrap-distance-left:9pt;mso-wrap-distance-top:0;mso-wrap-distance-right:9pt;mso-wrap-distance-bottom:0;mso-position-horizontal:absolute;mso-position-horizontal-relative:margin;mso-position-vertical:absolute;mso-position-vertical-relative:text;mso-width-percent:0;mso-height-percent:0;mso-width-relative:margin;mso-height-relative:margin;v-text-anchor:middle" o:gfxdata="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" fillcolor="black [3213]" strokecolor="black [3213]" strokeweight="2pt">
                 <v:textbox>
                   <w:txbxContent>
                     <w:p>
@@ -10269,7 +11499,7 @@
           </mc:Choice>
           <mc:Fallback>
             <w:pict>
-              <v:rect w14:anchorId="065036AF" id="_x0000_s1034" style="position:absolute;left:0;text-align:left;margin-left:31.2pt;margin-top:6.4pt;width:451.4pt;height:34.2pt;z-index:251667456;visibility:visible;mso-wrap-style:square;mso-width-percent:0;mso-height-percent:0;mso-wrap-distance-left:9pt;mso-wrap-distance-top:0;mso-wrap-distance-right:9pt;mso-wrap-distance-bottom:0;mso-position-horizontal:absolute;mso-position-horizontal-relative:margin;mso-position-vertical:absolute;mso-position-vertical-relative:text;mso-width-percent:0;mso-height-percent:0;mso-width-relative:margin;mso-height-relative:margin;v-text-anchor:middle" o:gfxdata="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" fillcolor="black [3213]" strokecolor="black [3213]" strokeweight="2pt">
+              <v:rect w14:anchorId="065036AF" id="_x0000_s1036" style="position:absolute;left:0;text-align:left;margin-left:31.2pt;margin-top:6.4pt;width:451.4pt;height:34.2pt;z-index:251667456;visibility:visible;mso-wrap-style:square;mso-width-percent:0;mso-height-percent:0;mso-wrap-distance-left:9pt;mso-wrap-distance-top:0;mso-wrap-distance-right:9pt;mso-wrap-distance-bottom:0;mso-position-horizontal:absolute;mso-position-horizontal-relative:margin;mso-position-vertical:absolute;mso-position-vertical-relative:text;mso-width-percent:0;mso-height-percent:0;mso-width-relative:margin;mso-height-relative:margin;v-text-anchor:middle" o:gfxdata="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" fillcolor="black [3213]" strokecolor="black [3213]" strokeweight="2pt">
                 <v:textbox>
                   <w:txbxContent>
                     <w:p>
@@ -11041,7 +12271,7 @@
           </mc:Choice>
           <mc:Fallback>
             <w:pict>
-              <v:rect w14:anchorId="3C6DF592" id="_x0000_s1035" style="position:absolute;left:0;text-align:left;margin-left:31.2pt;margin-top:6.4pt;width:451.4pt;height:34.2pt;z-index:251669504;visibility:visible;mso-wrap-style:square;mso-width-percent:0;mso-height-percent:0;mso-wrap-distance-left:9pt;mso-wrap-distance-top:0;mso-wrap-distance-right:9pt;mso-wrap-distance-bottom:0;mso-position-horizontal:absolute;mso-position-horizontal-relative:margin;mso-position-vertical:absolute;mso-position-vertical-relative:text;mso-width-percent:0;mso-height-percent:0;mso-width-relative:margin;mso-height-relative:margin;v-text-anchor:middle" o:gfxdata="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" fillcolor="black [3213]" strokecolor="black [3213]" strokeweight="2pt">
+              <v:rect w14:anchorId="3C6DF592" id="_x0000_s1037" style="position:absolute;left:0;text-align:left;margin-left:31.2pt;margin-top:6.4pt;width:451.4pt;height:34.2pt;z-index:251669504;visibility:visible;mso-wrap-style:square;mso-width-percent:0;mso-height-percent:0;mso-wrap-distance-left:9pt;mso-wrap-distance-top:0;mso-wrap-distance-right:9pt;mso-wrap-distance-bottom:0;mso-position-horizontal:absolute;mso-position-horizontal-relative:margin;mso-position-vertical:absolute;mso-position-vertical-relative:text;mso-width-percent:0;mso-height-percent:0;mso-width-relative:margin;mso-height-relative:margin;v-text-anchor:middle" o:gfxdata="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" fillcolor="black [3213]" strokecolor="black [3213]" strokeweight="2pt">
                 <v:textbox>
                   <w:txbxContent>
                     <w:p>
@@ -11691,7 +12921,7 @@
           </mc:Choice>
           <mc:Fallback>
             <w:pict>
-              <v:rect w14:anchorId="0D64C913" id="_x0000_s1036" style="position:absolute;left:0;text-align:left;margin-left:31.2pt;margin-top:6.3pt;width:451.4pt;height:42pt;z-index:251671552;visibility:visible;mso-wrap-style:square;mso-width-percent:0;mso-height-percent:0;mso-wrap-distance-left:9pt;mso-wrap-distance-top:0;mso-wrap-distance-right:9pt;mso-wrap-distance-bottom:0;mso-position-horizontal:absolute;mso-position-horizontal-relative:margin;mso-position-vertical:absolute;mso-position-vertical-relative:text;mso-width-percent:0;mso-height-percent:0;mso-width-relative:margin;mso-height-relative:margin;v-text-anchor:middle" o:gfxdata="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" fillcolor="black [3213]" strokecolor="black [3213]" strokeweight="2pt">
+              <v:rect w14:anchorId="0D64C913" id="_x0000_s1038" style="position:absolute;left:0;text-align:left;margin-left:31.2pt;margin-top:6.3pt;width:451.4pt;height:42pt;z-index:251671552;visibility:visible;mso-wrap-style:square;mso-width-percent:0;mso-height-percent:0;mso-wrap-distance-left:9pt;mso-wrap-distance-top:0;mso-wrap-distance-right:9pt;mso-wrap-distance-bottom:0;mso-position-horizontal:absolute;mso-position-horizontal-relative:margin;mso-position-vertical:absolute;mso-position-vertical-relative:text;mso-width-percent:0;mso-height-percent:0;mso-width-relative:margin;mso-height-relative:margin;v-text-anchor:middle" o:gfxdata="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" fillcolor="black [3213]" strokecolor="black [3213]" strokeweight="2pt">
                 <v:textbox>
                   <w:txbxContent>
                     <w:p>
@@ -12557,7 +13787,7 @@
           </mc:Choice>
           <mc:Fallback>
             <w:pict>
-              <v:rect w14:anchorId="093E9505" id="_x0000_s1037" style="position:absolute;left:0;text-align:left;margin-left:31.2pt;margin-top:6.05pt;width:451.4pt;height:67.8pt;z-index:251673600;visibility:visible;mso-wrap-style:square;mso-width-percent:0;mso-height-percent:0;mso-wrap-distance-left:9pt;mso-wrap-distance-top:0;mso-wrap-distance-right:9pt;mso-wrap-distance-bottom:0;mso-position-horizontal:absolute;mso-position-horizontal-relative:margin;mso-position-vertical:absolute;mso-position-vertical-relative:text;mso-width-percent:0;mso-height-percent:0;mso-width-relative:margin;mso-height-relative:margin;v-text-anchor:middle" o:gfxdata="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" fillcolor="black [3213]" strokecolor="black [3213]" strokeweight="2pt">
+              <v:rect w14:anchorId="093E9505" id="_x0000_s1039" style="position:absolute;left:0;text-align:left;margin-left:31.2pt;margin-top:6.05pt;width:451.4pt;height:67.8pt;z-index:251673600;visibility:visible;mso-wrap-style:square;mso-width-percent:0;mso-height-percent:0;mso-wrap-distance-left:9pt;mso-wrap-distance-top:0;mso-wrap-distance-right:9pt;mso-wrap-distance-bottom:0;mso-position-horizontal:absolute;mso-position-horizontal-relative:margin;mso-position-vertical:absolute;mso-position-vertical-relative:text;mso-width-percent:0;mso-height-percent:0;mso-width-relative:margin;mso-height-relative:margin;v-text-anchor:middle" o:gfxdata="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" fillcolor="black [3213]" strokecolor="black [3213]" strokeweight="2pt">
                 <v:textbox>
                   <w:txbxContent>
                     <w:p>
@@ -13656,7 +14886,7 @@
               <v:stroke joinstyle="miter"/>
               <v:path gradientshapeok="t" o:connecttype="rect"/>
             </v:shapetype>
-            <v:shape id="Textbox 1" o:spid="_x0000_s1038" type="#_x0000_t202" style="position:absolute;margin-left:543.95pt;margin-top:723.9pt;width:14.5pt;height:19.15pt;z-index:-16070656;visibility:visible;mso-wrap-style:square;mso-wrap-distance-left:0;mso-wrap-distance-top:0;mso-wrap-distance-right:0;mso-wrap-distance-bottom:0;mso-position-horizontal:absolute;mso-position-horizontal-relative:page;mso-position-vertical:absolute;mso-position-vertical-relative:page;v-text-anchor:top" o:gfxdata="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" filled="f" stroked="f">
+            <v:shape id="Textbox 1" o:spid="_x0000_s1040" type="#_x0000_t202" style="position:absolute;margin-left:543.95pt;margin-top:723.9pt;width:14.5pt;height:19.15pt;z-index:-16070656;visibility:visible;mso-wrap-style:square;mso-wrap-distance-left:0;mso-wrap-distance-top:0;mso-wrap-distance-right:0;mso-wrap-distance-bottom:0;mso-position-horizontal:absolute;mso-position-horizontal-relative:page;mso-position-vertical:absolute;mso-position-vertical-relative:page;v-text-anchor:top" o:gfxdata="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" filled="f" stroked="f">
               <v:textbox inset="0,0,0,0">
                 <w:txbxContent>
                   <w:p>
@@ -13818,7 +15048,7 @@
         </mc:Choice>
         <mc:Fallback>
           <w:pict>
-            <v:shape w14:anchorId="69160F5D" id="Graphic 4" o:spid="_x0000_s1026" style="position:absolute;margin-left:86.45pt;margin-top:719.75pt;width:476.5pt;height:25.2pt;z-index:-251660288;visibility:visible;mso-wrap-style:square;mso-wrap-distance-left:0;mso-wrap-distance-top:0;mso-wrap-distance-right:0;mso-wrap-distance-bottom:0;mso-position-horizontal:absolute;mso-position-horizontal-relative:page;mso-position-vertical:absolute;mso-position-vertical-relative:page;v-text-anchor:top" coordsize="6051550,320040" o:gfxdata="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" path="m6051397,l5594197,,,12,,18605r5594197,l5594197,320040r457200,l6051397,xe" fillcolor="black" stroked="f">
+            <v:shape w14:anchorId="3E36AA15" id="Graphic 4" o:spid="_x0000_s1026" style="position:absolute;margin-left:86.45pt;margin-top:719.75pt;width:476.5pt;height:25.2pt;z-index:-251660288;visibility:visible;mso-wrap-style:square;mso-wrap-distance-left:0;mso-wrap-distance-top:0;mso-wrap-distance-right:0;mso-wrap-distance-bottom:0;mso-position-horizontal:absolute;mso-position-horizontal-relative:page;mso-position-vertical:absolute;mso-position-vertical-relative:page;v-text-anchor:top" coordsize="6051550,320040" o:gfxdata="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" path="m6051397,l5594197,,,12,,18605r5594197,l5594197,320040r457200,l6051397,xe" fillcolor="black" stroked="f">
               <v:path arrowok="t"/>
               <w10:wrap anchorx="page" anchory="page"/>
             </v:shape>
@@ -13932,7 +15162,7 @@
               <v:stroke joinstyle="miter"/>
               <v:path gradientshapeok="t" o:connecttype="rect"/>
             </v:shapetype>
-            <v:shape id="Textbox 5" o:spid="_x0000_s1039" type="#_x0000_t202" style="position:absolute;margin-left:538.4pt;margin-top:723.9pt;width:19.9pt;height:19.15pt;z-index:-251658240;visibility:visible;mso-wrap-style:square;mso-wrap-distance-left:0;mso-wrap-distance-top:0;mso-wrap-distance-right:0;mso-wrap-distance-bottom:0;mso-position-horizontal:absolute;mso-position-horizontal-relative:page;mso-position-vertical:absolute;mso-position-vertical-relative:page;v-text-anchor:top" o:gfxdata="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" filled="f" stroked="f">
+            <v:shape id="Textbox 5" o:spid="_x0000_s1041" type="#_x0000_t202" style="position:absolute;margin-left:538.4pt;margin-top:723.9pt;width:19.9pt;height:19.15pt;z-index:-251658240;visibility:visible;mso-wrap-style:square;mso-wrap-distance-left:0;mso-wrap-distance-top:0;mso-wrap-distance-right:0;mso-wrap-distance-bottom:0;mso-position-horizontal:absolute;mso-position-horizontal-relative:page;mso-position-vertical:absolute;mso-position-vertical-relative:page;v-text-anchor:top" o:gfxdata="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" filled="f" stroked="f">
               <v:textbox inset="0,0,0,0">
                 <w:txbxContent>
                   <w:p>
@@ -17373,7 +18603,7 @@
   <w:style w:type="paragraph" w:default="1" w:styleId="Normal">
     <w:name w:val="Normal"/>
     <w:qFormat/>
-    <w:rsid w:val="001F2DCF"/>
+    <w:rsid w:val="000F39EC"/>
     <w:rPr>
       <w:rFonts w:ascii="Aptos" w:eastAsia="Trebuchet MS" w:hAnsi="Aptos" w:cs="Trebuchet MS"/>
       <w:sz w:val="24"/>
@@ -17479,7 +18709,6 @@
   <w:style w:type="character" w:default="1" w:styleId="Fuentedeprrafopredeter">
     <w:name w:val="Default Paragraph Font"/>
     <w:uiPriority w:val="1"/>
-    <w:semiHidden/>
     <w:unhideWhenUsed/>
   </w:style>
   <w:style w:type="table" w:default="1" w:styleId="Tablanormal">

</xml_diff>

<commit_message>
adding more problems module04-ex05
</commit_message>
<xml_diff>
--- a/subjects/subject_words/java04_es_subject.docx
+++ b/subjects/subject_words/java04_es_subject.docx
@@ -430,7 +430,7 @@
           </mc:Choice>
           <mc:Fallback>
             <w:pict>
-              <v:shape w14:anchorId="613E790D" id="Graphic 3" o:spid="_x0000_s1026" style="position:absolute;margin-left:86.45pt;margin-top:20.05pt;width:476.5pt;height:25.2pt;z-index:-251655680;visibility:visible;mso-wrap-style:square;mso-wrap-distance-left:0;mso-wrap-distance-top:0;mso-wrap-distance-right:0;mso-wrap-distance-bottom:0;mso-position-horizontal:absolute;mso-position-horizontal-relative:page;mso-position-vertical:absolute;mso-position-vertical-relative:text;v-text-anchor:top" coordsize="6051550,320040" o:gfxdata="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" path="m6051397,l5594197,,,12,,18605r5594197,l5594197,320040r457200,l6051397,xe" fillcolor="black" stroked="f">
+              <v:shape w14:anchorId="5BD3411A" id="Graphic 3" o:spid="_x0000_s1026" style="position:absolute;margin-left:86.45pt;margin-top:20.05pt;width:476.5pt;height:25.2pt;z-index:-251655680;visibility:visible;mso-wrap-style:square;mso-wrap-distance-left:0;mso-wrap-distance-top:0;mso-wrap-distance-right:0;mso-wrap-distance-bottom:0;mso-position-horizontal:absolute;mso-position-horizontal-relative:page;mso-position-vertical:absolute;mso-position-vertical-relative:text;v-text-anchor:top" coordsize="6051550,320040" o:gfxdata="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" path="m6051397,l5594197,,,12,,18605r5594197,l5594197,320040r457200,l6051397,xe" fillcolor="black" stroked="f">
                 <v:path arrowok="t"/>
                 <w10:wrap type="topAndBottom" anchorx="page"/>
               </v:shape>
@@ -456,7 +456,7 @@
         </w:sectPr>
       </w:pPr>
     </w:p>
-    <w:bookmarkStart w:id="0" w:name="_Toc234312449" w:displacedByCustomXml="next"/>
+    <w:bookmarkStart w:id="0" w:name="_Toc235059744" w:displacedByCustomXml="next"/>
     <w:sdt>
       <w:sdtPr>
         <w:rPr>
@@ -485,10 +485,12 @@
           <w:pPr>
             <w:pStyle w:val="Ttulo1"/>
           </w:pPr>
+          <w:proofErr w:type="spellStart"/>
           <w:r>
             <w:t>Contents</w:t>
           </w:r>
           <w:bookmarkEnd w:id="0"/>
+          <w:proofErr w:type="spellEnd"/>
         </w:p>
         <w:p>
           <w:pPr>
@@ -513,7 +515,7 @@
           <w:r>
             <w:fldChar w:fldCharType="separate"/>
           </w:r>
-          <w:hyperlink w:anchor="_Toc234312449" w:history="1">
+          <w:hyperlink w:anchor="_Toc235059744" w:history="1">
             <w:r>
               <w:rPr>
                 <w:rStyle w:val="Hipervnculo"/>
@@ -540,7 +542,7 @@
                 <w:noProof/>
                 <w:webHidden/>
               </w:rPr>
-              <w:instrText xml:space="preserve"> PAGEREF _Toc234312449 \h </w:instrText>
+              <w:instrText xml:space="preserve"> PAGEREF _Toc235059744 \h </w:instrText>
             </w:r>
             <w:r>
               <w:rPr>
@@ -586,7 +588,7 @@
               <w14:ligatures w14:val="standardContextual"/>
             </w:rPr>
           </w:pPr>
-          <w:hyperlink w:anchor="_Toc234312450" w:history="1">
+          <w:hyperlink w:anchor="_Toc235059745" w:history="1">
             <w:r>
               <w:rPr>
                 <w:rStyle w:val="Hipervnculo"/>
@@ -630,7 +632,7 @@
                 <w:noProof/>
                 <w:webHidden/>
               </w:rPr>
-              <w:instrText xml:space="preserve"> PAGEREF _Toc234312450 \h </w:instrText>
+              <w:instrText xml:space="preserve"> PAGEREF _Toc235059745 \h </w:instrText>
             </w:r>
             <w:r>
               <w:rPr>
@@ -676,7 +678,7 @@
               <w14:ligatures w14:val="standardContextual"/>
             </w:rPr>
           </w:pPr>
-          <w:hyperlink w:anchor="_Toc234312451" w:history="1">
+          <w:hyperlink w:anchor="_Toc235059746" w:history="1">
             <w:r>
               <w:rPr>
                 <w:rStyle w:val="Hipervnculo"/>
@@ -720,7 +722,7 @@
                 <w:noProof/>
                 <w:webHidden/>
               </w:rPr>
-              <w:instrText xml:space="preserve"> PAGEREF _Toc234312451 \h </w:instrText>
+              <w:instrText xml:space="preserve"> PAGEREF _Toc235059746 \h </w:instrText>
             </w:r>
             <w:r>
               <w:rPr>
@@ -766,7 +768,7 @@
               <w14:ligatures w14:val="standardContextual"/>
             </w:rPr>
           </w:pPr>
-          <w:hyperlink w:anchor="_Toc234312452" w:history="1">
+          <w:hyperlink w:anchor="_Toc235059747" w:history="1">
             <w:r>
               <w:rPr>
                 <w:rStyle w:val="Hipervnculo"/>
@@ -810,7 +812,7 @@
                 <w:noProof/>
                 <w:webHidden/>
               </w:rPr>
-              <w:instrText xml:space="preserve"> PAGEREF _Toc234312452 \h </w:instrText>
+              <w:instrText xml:space="preserve"> PAGEREF _Toc235059747 \h </w:instrText>
             </w:r>
             <w:r>
               <w:rPr>
@@ -856,7 +858,7 @@
               <w14:ligatures w14:val="standardContextual"/>
             </w:rPr>
           </w:pPr>
-          <w:hyperlink w:anchor="_Toc234312453" w:history="1">
+          <w:hyperlink w:anchor="_Toc235059748" w:history="1">
             <w:r>
               <w:rPr>
                 <w:rStyle w:val="Hipervnculo"/>
@@ -935,7 +937,7 @@
                 <w:noProof/>
                 <w:webHidden/>
               </w:rPr>
-              <w:instrText xml:space="preserve"> PAGEREF _Toc234312453 \h </w:instrText>
+              <w:instrText xml:space="preserve"> PAGEREF _Toc235059748 \h </w:instrText>
             </w:r>
             <w:r>
               <w:rPr>
@@ -981,7 +983,7 @@
               <w14:ligatures w14:val="standardContextual"/>
             </w:rPr>
           </w:pPr>
-          <w:hyperlink w:anchor="_Toc234312454" w:history="1">
+          <w:hyperlink w:anchor="_Toc235059749" w:history="1">
             <w:r>
               <w:rPr>
                 <w:rStyle w:val="Hipervnculo"/>
@@ -1052,7 +1054,7 @@
                 <w:noProof/>
                 <w:webHidden/>
               </w:rPr>
-              <w:instrText xml:space="preserve"> PAGEREF _Toc234312454 \h </w:instrText>
+              <w:instrText xml:space="preserve"> PAGEREF _Toc235059749 \h </w:instrText>
             </w:r>
             <w:r>
               <w:rPr>
@@ -1098,7 +1100,7 @@
               <w14:ligatures w14:val="standardContextual"/>
             </w:rPr>
           </w:pPr>
-          <w:hyperlink w:anchor="_Toc234312455" w:history="1">
+          <w:hyperlink w:anchor="_Toc235059750" w:history="1">
             <w:r>
               <w:rPr>
                 <w:rStyle w:val="Hipervnculo"/>
@@ -1177,7 +1179,7 @@
                 <w:noProof/>
                 <w:webHidden/>
               </w:rPr>
-              <w:instrText xml:space="preserve"> PAGEREF _Toc234312455 \h </w:instrText>
+              <w:instrText xml:space="preserve"> PAGEREF _Toc235059750 \h </w:instrText>
             </w:r>
             <w:r>
               <w:rPr>
@@ -1223,7 +1225,7 @@
               <w14:ligatures w14:val="standardContextual"/>
             </w:rPr>
           </w:pPr>
-          <w:hyperlink w:anchor="_Toc234312456" w:history="1">
+          <w:hyperlink w:anchor="_Toc235059751" w:history="1">
             <w:r>
               <w:rPr>
                 <w:rStyle w:val="Hipervnculo"/>
@@ -1302,7 +1304,7 @@
                 <w:noProof/>
                 <w:webHidden/>
               </w:rPr>
-              <w:instrText xml:space="preserve"> PAGEREF _Toc234312456 \h </w:instrText>
+              <w:instrText xml:space="preserve"> PAGEREF _Toc235059751 \h </w:instrText>
             </w:r>
             <w:r>
               <w:rPr>
@@ -1348,7 +1350,7 @@
               <w14:ligatures w14:val="standardContextual"/>
             </w:rPr>
           </w:pPr>
-          <w:hyperlink w:anchor="_Toc234312457" w:history="1">
+          <w:hyperlink w:anchor="_Toc235059752" w:history="1">
             <w:r>
               <w:rPr>
                 <w:rStyle w:val="Hipervnculo"/>
@@ -1419,7 +1421,7 @@
                 <w:noProof/>
                 <w:webHidden/>
               </w:rPr>
-              <w:instrText xml:space="preserve"> PAGEREF _Toc234312457 \h </w:instrText>
+              <w:instrText xml:space="preserve"> PAGEREF _Toc235059752 \h </w:instrText>
             </w:r>
             <w:r>
               <w:rPr>
@@ -1465,7 +1467,7 @@
               <w14:ligatures w14:val="standardContextual"/>
             </w:rPr>
           </w:pPr>
-          <w:hyperlink w:anchor="_Toc234312458" w:history="1">
+          <w:hyperlink w:anchor="_Toc235059753" w:history="1">
             <w:r>
               <w:rPr>
                 <w:rStyle w:val="Hipervnculo"/>
@@ -1544,7 +1546,7 @@
                 <w:noProof/>
                 <w:webHidden/>
               </w:rPr>
-              <w:instrText xml:space="preserve"> PAGEREF _Toc234312458 \h </w:instrText>
+              <w:instrText xml:space="preserve"> PAGEREF _Toc235059753 \h </w:instrText>
             </w:r>
             <w:r>
               <w:rPr>
@@ -1590,7 +1592,7 @@
               <w14:ligatures w14:val="standardContextual"/>
             </w:rPr>
           </w:pPr>
-          <w:hyperlink w:anchor="_Toc234312459" w:history="1">
+          <w:hyperlink w:anchor="_Toc235059754" w:history="1">
             <w:r>
               <w:rPr>
                 <w:rStyle w:val="Hipervnculo"/>
@@ -1652,7 +1654,7 @@
                 <w:noProof/>
                 <w:webHidden/>
               </w:rPr>
-              <w:instrText xml:space="preserve"> PAGEREF _Toc234312459 \h </w:instrText>
+              <w:instrText xml:space="preserve"> PAGEREF _Toc235059754 \h </w:instrText>
             </w:r>
             <w:r>
               <w:rPr>
@@ -1698,7 +1700,7 @@
               <w14:ligatures w14:val="standardContextual"/>
             </w:rPr>
           </w:pPr>
-          <w:hyperlink w:anchor="_Toc234312460" w:history="1">
+          <w:hyperlink w:anchor="_Toc235059755" w:history="1">
             <w:r>
               <w:rPr>
                 <w:rStyle w:val="Hipervnculo"/>
@@ -1760,7 +1762,7 @@
                 <w:noProof/>
                 <w:webHidden/>
               </w:rPr>
-              <w:instrText xml:space="preserve"> PAGEREF _Toc234312460 \h </w:instrText>
+              <w:instrText xml:space="preserve"> PAGEREF _Toc235059755 \h </w:instrText>
             </w:r>
             <w:r>
               <w:rPr>
@@ -1806,7 +1808,7 @@
               <w14:ligatures w14:val="standardContextual"/>
             </w:rPr>
           </w:pPr>
-          <w:hyperlink w:anchor="_Toc234312461" w:history="1">
+          <w:hyperlink w:anchor="_Toc235059756" w:history="1">
             <w:r>
               <w:rPr>
                 <w:rStyle w:val="Hipervnculo"/>
@@ -1868,7 +1870,7 @@
                 <w:noProof/>
                 <w:webHidden/>
               </w:rPr>
-              <w:instrText xml:space="preserve"> PAGEREF _Toc234312461 \h </w:instrText>
+              <w:instrText xml:space="preserve"> PAGEREF _Toc235059756 \h </w:instrText>
             </w:r>
             <w:r>
               <w:rPr>
@@ -1914,7 +1916,7 @@
               <w14:ligatures w14:val="standardContextual"/>
             </w:rPr>
           </w:pPr>
-          <w:hyperlink w:anchor="_Toc234312462" w:history="1">
+          <w:hyperlink w:anchor="_Toc235059757" w:history="1">
             <w:r>
               <w:rPr>
                 <w:rStyle w:val="Hipervnculo"/>
@@ -1959,7 +1961,7 @@
                 <w:noProof/>
                 <w:webHidden/>
               </w:rPr>
-              <w:instrText xml:space="preserve"> PAGEREF _Toc234312462 \h </w:instrText>
+              <w:instrText xml:space="preserve"> PAGEREF _Toc235059757 \h </w:instrText>
             </w:r>
             <w:r>
               <w:rPr>
@@ -2005,7 +2007,7 @@
               <w14:ligatures w14:val="standardContextual"/>
             </w:rPr>
           </w:pPr>
-          <w:hyperlink w:anchor="_Toc234312463" w:history="1">
+          <w:hyperlink w:anchor="_Toc235059758" w:history="1">
             <w:r>
               <w:rPr>
                 <w:rStyle w:val="Hipervnculo"/>
@@ -2050,7 +2052,7 @@
                 <w:noProof/>
                 <w:webHidden/>
               </w:rPr>
-              <w:instrText xml:space="preserve"> PAGEREF _Toc234312463 \h </w:instrText>
+              <w:instrText xml:space="preserve"> PAGEREF _Toc235059758 \h </w:instrText>
             </w:r>
             <w:r>
               <w:rPr>
@@ -2096,7 +2098,7 @@
               <w14:ligatures w14:val="standardContextual"/>
             </w:rPr>
           </w:pPr>
-          <w:hyperlink w:anchor="_Toc234312464" w:history="1">
+          <w:hyperlink w:anchor="_Toc235059759" w:history="1">
             <w:r>
               <w:rPr>
                 <w:rStyle w:val="Hipervnculo"/>
@@ -2160,7 +2162,7 @@
                 <w:noProof/>
                 <w:webHidden/>
               </w:rPr>
-              <w:instrText xml:space="preserve"> PAGEREF _Toc234312464 \h </w:instrText>
+              <w:instrText xml:space="preserve"> PAGEREF _Toc235059759 \h </w:instrText>
             </w:r>
             <w:r>
               <w:rPr>
@@ -2205,7 +2207,7 @@
               <w14:ligatures w14:val="standardContextual"/>
             </w:rPr>
           </w:pPr>
-          <w:hyperlink w:anchor="_Toc234312465" w:history="1">
+          <w:hyperlink w:anchor="_Toc235059760" w:history="1">
             <w:r>
               <w:rPr>
                 <w:rStyle w:val="Hipervnculo"/>
@@ -2232,7 +2234,7 @@
                 <w:noProof/>
                 <w:webHidden/>
               </w:rPr>
-              <w:instrText xml:space="preserve"> PAGEREF _Toc234312465 \h </w:instrText>
+              <w:instrText xml:space="preserve"> PAGEREF _Toc235059760 \h </w:instrText>
             </w:r>
             <w:r>
               <w:rPr>
@@ -2294,7 +2296,7 @@
           <w:numId w:val="17"/>
         </w:numPr>
       </w:pPr>
-      <w:bookmarkStart w:id="1" w:name="_Toc234312450"/>
+      <w:bookmarkStart w:id="1" w:name="_Toc235059745"/>
       <w:r>
         <w:lastRenderedPageBreak/>
         <w:t>El Sindicato de la Resiliencia</w:t>
@@ -3373,14 +3375,14 @@
         </w:numPr>
       </w:pPr>
       <w:bookmarkStart w:id="2" w:name="_bookmark1"/>
-      <w:bookmarkStart w:id="3" w:name="_Toc234312451"/>
+      <w:bookmarkStart w:id="3" w:name="_Toc235059746"/>
       <w:bookmarkEnd w:id="2"/>
       <w:r>
         <w:rPr>
           <w:noProof/>
         </w:rPr>
         <w:drawing>
-          <wp:anchor distT="0" distB="0" distL="114300" distR="114300" simplePos="0" relativeHeight="251653120" behindDoc="0" locked="0" layoutInCell="1" allowOverlap="1" wp14:anchorId="5EF8B505" wp14:editId="39C31EDB">
+          <wp:anchor distT="0" distB="0" distL="114300" distR="114300" simplePos="0" relativeHeight="251653632" behindDoc="0" locked="0" layoutInCell="1" allowOverlap="1" wp14:anchorId="5EF8B505" wp14:editId="39C31EDB">
             <wp:simplePos x="0" y="0"/>
             <wp:positionH relativeFrom="column">
               <wp:posOffset>3771900</wp:posOffset>
@@ -3759,7 +3761,7 @@
         </w:numPr>
       </w:pPr>
       <w:bookmarkStart w:id="4" w:name="_bookmark2"/>
-      <w:bookmarkStart w:id="5" w:name="_Toc234312452"/>
+      <w:bookmarkStart w:id="5" w:name="_Toc235059747"/>
       <w:bookmarkEnd w:id="4"/>
       <w:r>
         <w:lastRenderedPageBreak/>
@@ -4408,7 +4410,7 @@
           </mc:Choice>
           <mc:Fallback>
             <w:pict>
-              <v:group w14:anchorId="0C0C4FD9" id="Group 15" o:spid="_x0000_s1026" style="width:442.05pt;height:1.6pt;mso-position-horizontal-relative:char;mso-position-vertical-relative:line" coordsize="56140,203" o:gfxdata="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">
+              <v:group w14:anchorId="1C921AC5" id="Group 15" o:spid="_x0000_s1026" style="width:442.05pt;height:1.6pt;mso-position-horizontal-relative:char;mso-position-vertical-relative:line" coordsize="56140,203" o:gfxdata="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">
                 <v:shape id="Graphic 16" o:spid="_x0000_s1027" style="position:absolute;width:56127;height:196;visibility:visible;mso-wrap-style:square;v-text-anchor:top" coordsize="5612765,19685" o:gfxdata="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" path="m5612765,l,,,19685r5612765,l5612765,xe" fillcolor="#9f9f9f" stroked="f">
                   <v:path arrowok="t"/>
                 </v:shape>
@@ -4453,7 +4455,7 @@
         </w:numPr>
         <w:jc w:val="left"/>
       </w:pPr>
-      <w:bookmarkStart w:id="7" w:name="_Toc234312453"/>
+      <w:bookmarkStart w:id="7" w:name="_Toc235059748"/>
       <w:r>
         <w:rPr>
           <w:w w:val="90"/>
@@ -4941,7 +4943,7 @@
         <mc:AlternateContent>
           <mc:Choice Requires="wps">
             <w:drawing>
-              <wp:anchor distT="0" distB="0" distL="114300" distR="114300" simplePos="0" relativeHeight="251656704" behindDoc="0" locked="0" layoutInCell="1" allowOverlap="1" wp14:anchorId="52D2470B" wp14:editId="28D3D846">
+              <wp:anchor distT="0" distB="0" distL="114300" distR="114300" simplePos="0" relativeHeight="251657728" behindDoc="0" locked="0" layoutInCell="1" allowOverlap="1" wp14:anchorId="52D2470B" wp14:editId="28D3D846">
                 <wp:simplePos x="0" y="0"/>
                 <wp:positionH relativeFrom="margin">
                   <wp:posOffset>419100</wp:posOffset>
@@ -5111,7 +5113,7 @@
           </mc:Choice>
           <mc:Fallback>
             <w:pict>
-              <v:rect w14:anchorId="52D2470B" id="Rectángulo 2" o:spid="_x0000_s1026" style="position:absolute;left:0;text-align:left;margin-left:33pt;margin-top:9.95pt;width:434.5pt;height:100.5pt;z-index:251656704;visibility:visible;mso-wrap-style:square;mso-width-percent:0;mso-height-percent:0;mso-wrap-distance-left:9pt;mso-wrap-distance-top:0;mso-wrap-distance-right:9pt;mso-wrap-distance-bottom:0;mso-position-horizontal:absolute;mso-position-horizontal-relative:margin;mso-position-vertical:absolute;mso-position-vertical-relative:text;mso-width-percent:0;mso-height-percent:0;mso-width-relative:margin;mso-height-relative:margin;v-text-anchor:middle" o:gfxdata="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" fillcolor="black [3213]" strokecolor="black [3213]" strokeweight="2pt">
+              <v:rect w14:anchorId="52D2470B" id="Rectángulo 2" o:spid="_x0000_s1026" style="position:absolute;left:0;text-align:left;margin-left:33pt;margin-top:9.95pt;width:434.5pt;height:100.5pt;z-index:251657728;visibility:visible;mso-wrap-style:square;mso-width-percent:0;mso-height-percent:0;mso-wrap-distance-left:9pt;mso-wrap-distance-top:0;mso-wrap-distance-right:9pt;mso-wrap-distance-bottom:0;mso-position-horizontal:absolute;mso-position-horizontal-relative:margin;mso-position-vertical:absolute;mso-position-vertical-relative:text;mso-width-percent:0;mso-height-percent:0;mso-width-relative:margin;mso-height-relative:margin;v-text-anchor:middle" o:gfxdata="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" fillcolor="black [3213]" strokecolor="black [3213]" strokeweight="2pt">
                 <v:textbox>
                   <w:txbxContent>
                     <w:p>
@@ -5317,7 +5319,7 @@
         <mc:AlternateContent>
           <mc:Choice Requires="wps">
             <w:drawing>
-              <wp:anchor distT="0" distB="0" distL="114300" distR="114300" simplePos="0" relativeHeight="251644928" behindDoc="0" locked="0" layoutInCell="1" allowOverlap="1" wp14:anchorId="1C4D31BE" wp14:editId="47313A76">
+              <wp:anchor distT="0" distB="0" distL="114300" distR="114300" simplePos="0" relativeHeight="251645440" behindDoc="0" locked="0" layoutInCell="1" allowOverlap="1" wp14:anchorId="1C4D31BE" wp14:editId="47313A76">
                 <wp:simplePos x="0" y="0"/>
                 <wp:positionH relativeFrom="margin">
                   <wp:posOffset>400050</wp:posOffset>
@@ -5569,7 +5571,7 @@
           </mc:Choice>
           <mc:Fallback>
             <w:pict>
-              <v:rect w14:anchorId="1C4D31BE" id="_x0000_s1027" style="position:absolute;left:0;text-align:left;margin-left:31.5pt;margin-top:6.2pt;width:434.25pt;height:106.5pt;z-index:251644928;visibility:visible;mso-wrap-style:square;mso-width-percent:0;mso-height-percent:0;mso-wrap-distance-left:9pt;mso-wrap-distance-top:0;mso-wrap-distance-right:9pt;mso-wrap-distance-bottom:0;mso-position-horizontal:absolute;mso-position-horizontal-relative:margin;mso-position-vertical:absolute;mso-position-vertical-relative:text;mso-width-percent:0;mso-height-percent:0;mso-width-relative:margin;mso-height-relative:margin;v-text-anchor:middle" o:gfxdata="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" fillcolor="black [3213]" strokecolor="black [3213]" strokeweight="2pt">
+              <v:rect w14:anchorId="1C4D31BE" id="_x0000_s1027" style="position:absolute;left:0;text-align:left;margin-left:31.5pt;margin-top:6.2pt;width:434.25pt;height:106.5pt;z-index:251645440;visibility:visible;mso-wrap-style:square;mso-width-percent:0;mso-height-percent:0;mso-wrap-distance-left:9pt;mso-wrap-distance-top:0;mso-wrap-distance-right:9pt;mso-wrap-distance-bottom:0;mso-position-horizontal:absolute;mso-position-horizontal-relative:margin;mso-position-vertical:absolute;mso-position-vertical-relative:text;mso-width-percent:0;mso-height-percent:0;mso-width-relative:margin;mso-height-relative:margin;v-text-anchor:middle" o:gfxdata="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" fillcolor="black [3213]" strokecolor="black [3213]" strokeweight="2pt">
                 <v:textbox>
                   <w:txbxContent>
                     <w:p>
@@ -5801,7 +5803,7 @@
         <w:jc w:val="left"/>
       </w:pPr>
       <w:bookmarkStart w:id="8" w:name="_bookmark4"/>
-      <w:bookmarkStart w:id="9" w:name="_Toc234312454"/>
+      <w:bookmarkStart w:id="9" w:name="_Toc235059749"/>
       <w:bookmarkEnd w:id="8"/>
       <w:r>
         <w:rPr>
@@ -6082,6 +6084,7 @@
       <w:r>
         <w:rPr>
           <w:spacing w:val="-6"/>
+          <w:lang w:val="en-US"/>
         </w:rPr>
         <w:t>Stream.filter</w:t>
       </w:r>
@@ -6089,6 +6092,7 @@
       <w:r>
         <w:rPr>
           <w:spacing w:val="-6"/>
+          <w:lang w:val="en-US"/>
         </w:rPr>
         <w:t xml:space="preserve">(), </w:t>
       </w:r>
@@ -6097,6 +6101,7 @@
       <w:r>
         <w:rPr>
           <w:spacing w:val="-6"/>
+          <w:lang w:val="en-US"/>
         </w:rPr>
         <w:t>Stream.map</w:t>
       </w:r>
@@ -6104,6 +6109,7 @@
       <w:r>
         <w:rPr>
           <w:spacing w:val="-6"/>
+          <w:lang w:val="en-US"/>
         </w:rPr>
         <w:t>(</w:t>
       </w:r>
@@ -6111,6 +6117,7 @@
       <w:r>
         <w:rPr>
           <w:spacing w:val="-6"/>
+          <w:lang w:val="en-US"/>
         </w:rPr>
         <w:t xml:space="preserve">), </w:t>
       </w:r>
@@ -6118,6 +6125,7 @@
       <w:r>
         <w:rPr>
           <w:spacing w:val="-6"/>
+          <w:lang w:val="en-US"/>
         </w:rPr>
         <w:t>Files.lines</w:t>
       </w:r>
@@ -6125,8 +6133,55 @@
       <w:r>
         <w:rPr>
           <w:spacing w:val="-6"/>
-        </w:rPr>
-        <w:t>().</w:t>
+          <w:lang w:val="en-US"/>
+        </w:rPr>
+        <w:t>()</w:t>
+      </w:r>
+      <w:r>
+        <w:rPr>
+          <w:spacing w:val="-6"/>
+          <w:lang w:val="en-US"/>
+        </w:rPr>
+        <w:t xml:space="preserve">, </w:t>
+      </w:r>
+      <w:proofErr w:type="spellStart"/>
+      <w:r>
+        <w:rPr>
+          <w:spacing w:val="-6"/>
+          <w:lang w:val="en-US"/>
+        </w:rPr>
+        <w:t>try</w:t>
+      </w:r>
+      <w:r>
+        <w:rPr>
+          <w:spacing w:val="-6"/>
+          <w:lang w:val="en-US"/>
+        </w:rPr>
+        <w:t>|except</w:t>
+      </w:r>
+      <w:proofErr w:type="spellEnd"/>
+      <w:r>
+        <w:rPr>
+          <w:spacing w:val="-6"/>
+          <w:lang w:val="en-US"/>
+        </w:rPr>
+        <w:t xml:space="preserve">, </w:t>
+      </w:r>
+      <w:proofErr w:type="spellStart"/>
+      <w:r>
+        <w:rPr>
+          <w:spacing w:val="-6"/>
+          <w:lang w:val="en-US"/>
+        </w:rPr>
+        <w:t>Path.of</w:t>
+      </w:r>
+      <w:proofErr w:type="spellEnd"/>
+      <w:r>
+        <w:rPr>
+          <w:spacing w:val="-6"/>
+          <w:lang w:val="en-US"/>
+        </w:rPr>
+        <w:t>.</w:t>
       </w:r>
     </w:p>
     <w:p>
@@ -6264,6 +6319,9 @@
     <w:p>
       <w:pPr>
         <w:pStyle w:val="Sinespaciado"/>
+        <w:rPr>
+          <w:lang w:val="es-ES"/>
+        </w:rPr>
       </w:pPr>
     </w:p>
     <w:p>
@@ -6356,7 +6414,7 @@
         <mc:AlternateContent>
           <mc:Choice Requires="wps">
             <w:drawing>
-              <wp:anchor distT="0" distB="0" distL="114300" distR="114300" simplePos="0" relativeHeight="251661824" behindDoc="0" locked="0" layoutInCell="1" allowOverlap="1" wp14:anchorId="5CCC47C2" wp14:editId="1DB1FA8E">
+              <wp:anchor distT="0" distB="0" distL="114300" distR="114300" simplePos="0" relativeHeight="251662848" behindDoc="0" locked="0" layoutInCell="1" allowOverlap="1" wp14:anchorId="5CCC47C2" wp14:editId="1DB1FA8E">
                 <wp:simplePos x="0" y="0"/>
                 <wp:positionH relativeFrom="margin">
                   <wp:posOffset>419100</wp:posOffset>
@@ -6510,7 +6568,7 @@
           </mc:Choice>
           <mc:Fallback>
             <w:pict>
-              <v:rect w14:anchorId="5CCC47C2" id="_x0000_s1028" style="position:absolute;left:0;text-align:left;margin-left:33pt;margin-top:9.65pt;width:434.5pt;height:91.5pt;z-index:251661824;visibility:visible;mso-wrap-style:square;mso-width-percent:0;mso-height-percent:0;mso-wrap-distance-left:9pt;mso-wrap-distance-top:0;mso-wrap-distance-right:9pt;mso-wrap-distance-bottom:0;mso-position-horizontal:absolute;mso-position-horizontal-relative:margin;mso-position-vertical:absolute;mso-position-vertical-relative:text;mso-width-percent:0;mso-height-percent:0;mso-width-relative:margin;mso-height-relative:margin;v-text-anchor:middle" o:gfxdata="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" fillcolor="black [3213]" strokecolor="black [3213]" strokeweight="2pt">
+              <v:rect w14:anchorId="5CCC47C2" id="_x0000_s1028" style="position:absolute;left:0;text-align:left;margin-left:33pt;margin-top:9.65pt;width:434.5pt;height:91.5pt;z-index:251662848;visibility:visible;mso-wrap-style:square;mso-width-percent:0;mso-height-percent:0;mso-wrap-distance-left:9pt;mso-wrap-distance-top:0;mso-wrap-distance-right:9pt;mso-wrap-distance-bottom:0;mso-position-horizontal:absolute;mso-position-horizontal-relative:margin;mso-position-vertical:absolute;mso-position-vertical-relative:text;mso-width-percent:0;mso-height-percent:0;mso-width-relative:margin;mso-height-relative:margin;v-text-anchor:middle" o:gfxdata="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" fillcolor="black [3213]" strokecolor="black [3213]" strokeweight="2pt">
                 <v:textbox>
                   <w:txbxContent>
                     <w:p>
@@ -6690,7 +6748,7 @@
         <mc:AlternateContent>
           <mc:Choice Requires="wps">
             <w:drawing>
-              <wp:anchor distT="0" distB="0" distL="114300" distR="114300" simplePos="0" relativeHeight="251646976" behindDoc="0" locked="0" layoutInCell="1" allowOverlap="1" wp14:anchorId="6EEA5942" wp14:editId="0B3FB99D">
+              <wp:anchor distT="0" distB="0" distL="114300" distR="114300" simplePos="0" relativeHeight="251647488" behindDoc="0" locked="0" layoutInCell="1" allowOverlap="1" wp14:anchorId="6EEA5942" wp14:editId="0B3FB99D">
                 <wp:simplePos x="0" y="0"/>
                 <wp:positionH relativeFrom="margin">
                   <wp:posOffset>400050</wp:posOffset>
@@ -6812,7 +6870,7 @@
           </mc:Choice>
           <mc:Fallback>
             <w:pict>
-              <v:rect w14:anchorId="6EEA5942" id="_x0000_s1029" style="position:absolute;left:0;text-align:left;margin-left:31.5pt;margin-top:5.9pt;width:434.5pt;height:66pt;z-index:251646976;visibility:visible;mso-wrap-style:square;mso-width-percent:0;mso-height-percent:0;mso-wrap-distance-left:9pt;mso-wrap-distance-top:0;mso-wrap-distance-right:9pt;mso-wrap-distance-bottom:0;mso-position-horizontal:absolute;mso-position-horizontal-relative:margin;mso-position-vertical:absolute;mso-position-vertical-relative:text;mso-width-percent:0;mso-height-percent:0;mso-width-relative:margin;mso-height-relative:margin;v-text-anchor:middle" o:gfxdata="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" fillcolor="black [3213]" strokecolor="black [3213]" strokeweight="2pt">
+              <v:rect w14:anchorId="6EEA5942" id="_x0000_s1029" style="position:absolute;left:0;text-align:left;margin-left:31.5pt;margin-top:5.9pt;width:434.5pt;height:66pt;z-index:251647488;visibility:visible;mso-wrap-style:square;mso-width-percent:0;mso-height-percent:0;mso-wrap-distance-left:9pt;mso-wrap-distance-top:0;mso-wrap-distance-right:9pt;mso-wrap-distance-bottom:0;mso-position-horizontal:absolute;mso-position-horizontal-relative:margin;mso-position-vertical:absolute;mso-position-vertical-relative:text;mso-width-percent:0;mso-height-percent:0;mso-width-relative:margin;mso-height-relative:margin;v-text-anchor:middle" o:gfxdata="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" fillcolor="black [3213]" strokecolor="black [3213]" strokeweight="2pt">
                 <v:textbox>
                   <w:txbxContent>
                     <w:p>
@@ -6914,7 +6972,7 @@
         <w:jc w:val="left"/>
       </w:pPr>
       <w:bookmarkStart w:id="10" w:name="_bookmark5"/>
-      <w:bookmarkStart w:id="11" w:name="_Toc234312455"/>
+      <w:bookmarkStart w:id="11" w:name="_Toc235059750"/>
       <w:bookmarkEnd w:id="10"/>
       <w:r>
         <w:rPr>
@@ -7049,24 +7107,25 @@
         <w:spacing w:line="252" w:lineRule="auto"/>
         <w:ind w:right="1520"/>
         <w:rPr>
-          <w:lang w:val="en-US"/>
-        </w:rPr>
-      </w:pPr>
-      <w:proofErr w:type="spellStart"/>
-      <w:r>
-        <w:rPr>
-          <w:b/>
           <w:spacing w:val="-4"/>
           <w:lang w:val="en-US"/>
         </w:rPr>
-        <w:t>Método</w:t>
-      </w:r>
-      <w:proofErr w:type="spellEnd"/>
-      <w:r>
-        <w:rPr>
+      </w:pPr>
+      <w:proofErr w:type="spellStart"/>
+      <w:r>
+        <w:rPr>
+          <w:b/>
           <w:spacing w:val="-4"/>
           <w:lang w:val="en-US"/>
         </w:rPr>
+        <w:t>Método</w:t>
+      </w:r>
+      <w:proofErr w:type="spellEnd"/>
+      <w:r>
+        <w:rPr>
+          <w:spacing w:val="-4"/>
+          <w:lang w:val="en-US"/>
+        </w:rPr>
         <w:t>:</w:t>
       </w:r>
       <w:r>
@@ -7078,18 +7137,26 @@
       </w:r>
       <w:r>
         <w:rPr>
+          <w:spacing w:val="-21"/>
+          <w:lang w:val="en-US"/>
+        </w:rPr>
+        <w:t>S</w:t>
+      </w:r>
+      <w:r>
+        <w:rPr>
           <w:spacing w:val="-4"/>
           <w:lang w:val="en-US"/>
         </w:rPr>
-        <w:t xml:space="preserve">Optional&lt;String&gt;, </w:t>
+        <w:t xml:space="preserve">tring </w:t>
       </w:r>
       <w:proofErr w:type="spellStart"/>
+      <w:proofErr w:type="gramStart"/>
       <w:r>
         <w:rPr>
           <w:spacing w:val="-4"/>
           <w:lang w:val="en-US"/>
         </w:rPr>
-        <w:t>Stream.findFirst</w:t>
+        <w:t>buscarMercenario</w:t>
       </w:r>
       <w:proofErr w:type="spellEnd"/>
       <w:r>
@@ -7097,7 +7164,91 @@
           <w:spacing w:val="-4"/>
           <w:lang w:val="en-US"/>
         </w:rPr>
-        <w:t>().</w:t>
+        <w:t>(</w:t>
+      </w:r>
+      <w:proofErr w:type="gramEnd"/>
+      <w:r>
+        <w:rPr>
+          <w:spacing w:val="-4"/>
+          <w:lang w:val="en-US"/>
+        </w:rPr>
+        <w:t xml:space="preserve">List&lt;String&gt; </w:t>
+      </w:r>
+      <w:proofErr w:type="spellStart"/>
+      <w:r>
+        <w:rPr>
+          <w:spacing w:val="-4"/>
+          <w:lang w:val="en-US"/>
+        </w:rPr>
+        <w:t>mercenarios</w:t>
+      </w:r>
+      <w:proofErr w:type="spellEnd"/>
+      <w:r>
+        <w:rPr>
+          <w:spacing w:val="-4"/>
+          <w:lang w:val="en-US"/>
+        </w:rPr>
+        <w:t xml:space="preserve">, String </w:t>
+      </w:r>
+      <w:proofErr w:type="spellStart"/>
+      <w:r>
+        <w:rPr>
+          <w:spacing w:val="-4"/>
+          <w:lang w:val="en-US"/>
+        </w:rPr>
+        <w:t>nombre</w:t>
+      </w:r>
+      <w:proofErr w:type="spellEnd"/>
+      <w:r>
+        <w:rPr>
+          <w:spacing w:val="-4"/>
+          <w:lang w:val="en-US"/>
+        </w:rPr>
+        <w:t>)</w:t>
+      </w:r>
+      <w:r>
+        <w:rPr>
+          <w:spacing w:val="-4"/>
+          <w:lang w:val="en-US"/>
+        </w:rPr>
+        <w:t xml:space="preserve">, </w:t>
+      </w:r>
+      <w:r>
+        <w:rPr>
+          <w:spacing w:val="-4"/>
+          <w:lang w:val="en-US"/>
+        </w:rPr>
+        <w:t>p</w:t>
+      </w:r>
+      <w:r>
+        <w:rPr>
+          <w:spacing w:val="-4"/>
+          <w:lang w:val="en-US"/>
+        </w:rPr>
+        <w:t xml:space="preserve">ublic static void main(String[] </w:t>
+      </w:r>
+      <w:proofErr w:type="spellStart"/>
+      <w:r>
+        <w:rPr>
+          <w:spacing w:val="-4"/>
+          <w:lang w:val="en-US"/>
+        </w:rPr>
+        <w:t>args</w:t>
+      </w:r>
+      <w:proofErr w:type="spellEnd"/>
+      <w:r>
+        <w:rPr>
+          <w:spacing w:val="-4"/>
+          <w:lang w:val="en-US"/>
+        </w:rPr>
+        <w:t>)</w:t>
+      </w:r>
+      <w:r>
+        <w:rPr>
+          <w:spacing w:val="-4"/>
+          <w:lang w:val="en-US"/>
+        </w:rPr>
+        <w:t>.</w:t>
       </w:r>
     </w:p>
     <w:p>
@@ -7113,7 +7264,7 @@
         <w:spacing w:line="279" w:lineRule="exact"/>
         <w:ind w:left="1341"/>
         <w:rPr>
-          <w:lang w:val="en-US"/>
+          <w:w w:val="90"/>
         </w:rPr>
       </w:pPr>
       <w:proofErr w:type="spellStart"/>
@@ -7160,28 +7311,50 @@
         </w:rPr>
         <w:t xml:space="preserve"> </w:t>
       </w:r>
+      <w:proofErr w:type="spellStart"/>
       <w:r>
         <w:rPr>
           <w:w w:val="90"/>
           <w:lang w:val="en-US"/>
         </w:rPr>
-        <w:t xml:space="preserve">Optional&lt;String&gt;, </w:t>
+        <w:t>Stream.findFirst</w:t>
+      </w:r>
+      <w:proofErr w:type="spellEnd"/>
+      <w:r>
+        <w:rPr>
+          <w:w w:val="90"/>
+          <w:lang w:val="en-US"/>
+        </w:rPr>
+        <w:t>()</w:t>
+      </w:r>
+      <w:r>
+        <w:rPr>
+          <w:w w:val="90"/>
+          <w:lang w:val="en-US"/>
+        </w:rPr>
+        <w:t xml:space="preserve">, </w:t>
       </w:r>
       <w:proofErr w:type="spellStart"/>
-      <w:r>
-        <w:rPr>
-          <w:w w:val="90"/>
-          <w:lang w:val="en-US"/>
-        </w:rPr>
-        <w:t>Stream.findFirst</w:t>
+      <w:proofErr w:type="gramStart"/>
+      <w:r>
+        <w:rPr>
+          <w:w w:val="90"/>
+        </w:rPr>
+        <w:t>filter</w:t>
       </w:r>
       <w:proofErr w:type="spellEnd"/>
       <w:r>
         <w:rPr>
           <w:w w:val="90"/>
-          <w:lang w:val="en-US"/>
-        </w:rPr>
-        <w:t>().</w:t>
+        </w:rPr>
+        <w:t>(</w:t>
+      </w:r>
+      <w:proofErr w:type="gramEnd"/>
+      <w:r>
+        <w:rPr>
+          <w:w w:val="90"/>
+        </w:rPr>
+        <w:t>).</w:t>
       </w:r>
     </w:p>
     <w:p>
@@ -7241,16 +7414,17 @@
           <w:i/>
           <w:spacing w:val="-6"/>
         </w:rPr>
-        <w:t xml:space="preserve">. Manejo estricto con </w:t>
+        <w:t xml:space="preserve">. El manejo de la ausencia de resultados debe realizarse exclusivamente con </w:t>
       </w:r>
       <w:proofErr w:type="spellStart"/>
+      <w:proofErr w:type="gramStart"/>
       <w:r>
         <w:rPr>
           <w:bCs/>
           <w:i/>
           <w:spacing w:val="-6"/>
         </w:rPr>
-        <w:t>Optional.orElse</w:t>
+        <w:t>orElse</w:t>
       </w:r>
       <w:proofErr w:type="spellEnd"/>
       <w:r>
@@ -7259,7 +7433,16 @@
           <w:i/>
           <w:spacing w:val="-6"/>
         </w:rPr>
-        <w:t>()</w:t>
+        <w:t>(</w:t>
+      </w:r>
+      <w:proofErr w:type="gramEnd"/>
+      <w:r>
+        <w:rPr>
+          <w:bCs/>
+          <w:i/>
+          <w:spacing w:val="-6"/>
+        </w:rPr>
+        <w:t>).</w:t>
       </w:r>
     </w:p>
     <w:p>
@@ -7315,7 +7498,347 @@
         <w:rPr>
           <w:spacing w:val="-6"/>
         </w:rPr>
-        <w:t>Buscar un nombre en una lista. Si existe, devolverlo; si no, devolver un mensaje por defecto.</w:t>
+        <w:t>Buscar un nombre dentro de una lista de mercenarios. Si el nombre existe, devolverlo; si no existe, devolver un mensaje por defecto.</w:t>
+      </w:r>
+    </w:p>
+    <w:p>
+      <w:pPr>
+        <w:ind w:left="622"/>
+        <w:rPr>
+          <w:spacing w:val="-6"/>
+        </w:rPr>
+      </w:pPr>
+    </w:p>
+    <w:p>
+      <w:pPr>
+        <w:ind w:left="622"/>
+        <w:rPr>
+          <w:b/>
+          <w:bCs/>
+          <w:spacing w:val="-6"/>
+        </w:rPr>
+      </w:pPr>
+      <w:r>
+        <w:rPr>
+          <w:b/>
+          <w:bCs/>
+          <w:spacing w:val="-6"/>
+        </w:rPr>
+        <w:t>Datos de entrada (deben especificarse)</w:t>
+      </w:r>
+    </w:p>
+    <w:p>
+      <w:pPr>
+        <w:numPr>
+          <w:ilvl w:val="0"/>
+          <w:numId w:val="29"/>
+        </w:numPr>
+        <w:rPr>
+          <w:spacing w:val="-6"/>
+        </w:rPr>
+      </w:pPr>
+      <w:r>
+        <w:rPr>
+          <w:spacing w:val="-6"/>
+        </w:rPr>
+        <w:t>Una lista de nombres de mercenarios (</w:t>
+      </w:r>
+      <w:proofErr w:type="spellStart"/>
+      <w:r>
+        <w:rPr>
+          <w:spacing w:val="-6"/>
+        </w:rPr>
+        <w:t>List</w:t>
+      </w:r>
+      <w:proofErr w:type="spellEnd"/>
+      <w:r>
+        <w:rPr>
+          <w:spacing w:val="-6"/>
+        </w:rPr>
+        <w:t>&lt;</w:t>
+      </w:r>
+      <w:proofErr w:type="spellStart"/>
+      <w:r>
+        <w:rPr>
+          <w:spacing w:val="-6"/>
+        </w:rPr>
+        <w:t>String</w:t>
+      </w:r>
+      <w:proofErr w:type="spellEnd"/>
+      <w:r>
+        <w:rPr>
+          <w:spacing w:val="-6"/>
+        </w:rPr>
+        <w:t xml:space="preserve">&gt;). </w:t>
+      </w:r>
+    </w:p>
+    <w:p>
+      <w:pPr>
+        <w:numPr>
+          <w:ilvl w:val="0"/>
+          <w:numId w:val="29"/>
+        </w:numPr>
+        <w:rPr>
+          <w:spacing w:val="-6"/>
+        </w:rPr>
+      </w:pPr>
+      <w:r>
+        <w:rPr>
+          <w:spacing w:val="-6"/>
+        </w:rPr>
+        <w:t xml:space="preserve">El nombre del mercenario que se desea buscar. </w:t>
+      </w:r>
+    </w:p>
+    <w:p>
+      <w:pPr>
+        <w:numPr>
+          <w:ilvl w:val="0"/>
+          <w:numId w:val="29"/>
+        </w:numPr>
+        <w:rPr>
+          <w:spacing w:val="-6"/>
+        </w:rPr>
+      </w:pPr>
+      <w:r>
+        <w:rPr>
+          <w:spacing w:val="-6"/>
+        </w:rPr>
+        <w:t xml:space="preserve">Al ser </w:t>
+      </w:r>
+      <w:proofErr w:type="spellStart"/>
+      <w:r>
+        <w:rPr>
+          <w:spacing w:val="-6"/>
+        </w:rPr>
+        <w:t>static</w:t>
+      </w:r>
+      <w:proofErr w:type="spellEnd"/>
+      <w:r>
+        <w:rPr>
+          <w:spacing w:val="-6"/>
+        </w:rPr>
+        <w:t xml:space="preserve">, </w:t>
+      </w:r>
+      <w:proofErr w:type="spellStart"/>
+      <w:r>
+        <w:rPr>
+          <w:spacing w:val="-6"/>
+        </w:rPr>
+        <w:t>tenes</w:t>
+      </w:r>
+      <w:proofErr w:type="spellEnd"/>
+      <w:r>
+        <w:rPr>
+          <w:spacing w:val="-6"/>
+        </w:rPr>
+        <w:t xml:space="preserve"> que crear un objeto(</w:t>
+      </w:r>
+      <w:proofErr w:type="spellStart"/>
+      <w:r>
+        <w:rPr>
+          <w:spacing w:val="-6"/>
+        </w:rPr>
+        <w:t>finder</w:t>
+      </w:r>
+      <w:proofErr w:type="spellEnd"/>
+      <w:r>
+        <w:rPr>
+          <w:spacing w:val="-6"/>
+        </w:rPr>
+        <w:t>).</w:t>
+      </w:r>
+    </w:p>
+    <w:p>
+      <w:pPr>
+        <w:rPr>
+          <w:spacing w:val="-6"/>
+        </w:rPr>
+      </w:pPr>
+    </w:p>
+    <w:p>
+      <w:pPr>
+        <w:ind w:firstLine="622"/>
+        <w:rPr>
+          <w:spacing w:val="-6"/>
+        </w:rPr>
+      </w:pPr>
+      <w:r>
+        <w:rPr>
+          <w:spacing w:val="-6"/>
+        </w:rPr>
+        <w:t xml:space="preserve">Lista = </w:t>
+      </w:r>
+      <w:r>
+        <w:rPr>
+          <w:spacing w:val="-6"/>
+        </w:rPr>
+        <w:t>"</w:t>
+      </w:r>
+      <w:proofErr w:type="spellStart"/>
+      <w:r>
+        <w:rPr>
+          <w:spacing w:val="-6"/>
+        </w:rPr>
+        <w:t>Geralt</w:t>
+      </w:r>
+      <w:proofErr w:type="spellEnd"/>
+      <w:r>
+        <w:rPr>
+          <w:spacing w:val="-6"/>
+        </w:rPr>
+        <w:t>", "</w:t>
+      </w:r>
+      <w:proofErr w:type="spellStart"/>
+      <w:r>
+        <w:rPr>
+          <w:spacing w:val="-6"/>
+        </w:rPr>
+        <w:t>Letho</w:t>
+      </w:r>
+      <w:proofErr w:type="spellEnd"/>
+      <w:r>
+        <w:rPr>
+          <w:spacing w:val="-6"/>
+        </w:rPr>
+        <w:t>", "</w:t>
+      </w:r>
+      <w:proofErr w:type="spellStart"/>
+      <w:r>
+        <w:rPr>
+          <w:spacing w:val="-6"/>
+        </w:rPr>
+        <w:t>Eskel</w:t>
+      </w:r>
+      <w:proofErr w:type="spellEnd"/>
+      <w:r>
+        <w:rPr>
+          <w:spacing w:val="-6"/>
+        </w:rPr>
+        <w:t>", "Lambert", "</w:t>
+      </w:r>
+      <w:proofErr w:type="spellStart"/>
+      <w:r>
+        <w:rPr>
+          <w:spacing w:val="-6"/>
+        </w:rPr>
+        <w:t>Coën</w:t>
+      </w:r>
+      <w:proofErr w:type="spellEnd"/>
+      <w:r>
+        <w:rPr>
+          <w:spacing w:val="-6"/>
+        </w:rPr>
+        <w:t>"</w:t>
+      </w:r>
+      <w:r>
+        <w:rPr>
+          <w:spacing w:val="-6"/>
+        </w:rPr>
+        <w:t xml:space="preserve"> y se</w:t>
+      </w:r>
+      <w:r>
+        <w:rPr>
+          <w:spacing w:val="-6"/>
+        </w:rPr>
+        <w:t xml:space="preserve"> busca </w:t>
+      </w:r>
+      <w:r>
+        <w:rPr>
+          <w:spacing w:val="-6"/>
+        </w:rPr>
+        <w:t>"</w:t>
+      </w:r>
+      <w:proofErr w:type="spellStart"/>
+      <w:r>
+        <w:rPr>
+          <w:spacing w:val="-6"/>
+        </w:rPr>
+        <w:t>Letho</w:t>
+      </w:r>
+      <w:proofErr w:type="spellEnd"/>
+      <w:r>
+        <w:rPr>
+          <w:spacing w:val="-6"/>
+        </w:rPr>
+        <w:t>"</w:t>
+      </w:r>
+    </w:p>
+    <w:p>
+      <w:pPr>
+        <w:ind w:left="720"/>
+        <w:rPr>
+          <w:spacing w:val="-6"/>
+        </w:rPr>
+      </w:pPr>
+    </w:p>
+    <w:p>
+      <w:pPr>
+        <w:ind w:left="622"/>
+        <w:rPr>
+          <w:b/>
+          <w:bCs/>
+          <w:spacing w:val="-6"/>
+        </w:rPr>
+      </w:pPr>
+      <w:r>
+        <w:rPr>
+          <w:b/>
+          <w:bCs/>
+          <w:spacing w:val="-6"/>
+        </w:rPr>
+        <w:t>Datos de salida</w:t>
+      </w:r>
+    </w:p>
+    <w:p>
+      <w:pPr>
+        <w:numPr>
+          <w:ilvl w:val="0"/>
+          <w:numId w:val="28"/>
+        </w:numPr>
+        <w:tabs>
+          <w:tab w:val="num" w:pos="720"/>
+        </w:tabs>
+        <w:rPr>
+          <w:spacing w:val="-6"/>
+        </w:rPr>
+      </w:pPr>
+      <w:r>
+        <w:rPr>
+          <w:spacing w:val="-6"/>
+        </w:rPr>
+        <w:t>Si el mercenario existe, devolver su nombre</w:t>
+      </w:r>
+      <w:r>
+        <w:rPr>
+          <w:spacing w:val="-6"/>
+        </w:rPr>
+        <w:t xml:space="preserve"> del primer encontrado</w:t>
+      </w:r>
+      <w:r>
+        <w:rPr>
+          <w:spacing w:val="-6"/>
+        </w:rPr>
+        <w:t xml:space="preserve">. </w:t>
+      </w:r>
+    </w:p>
+    <w:p>
+      <w:pPr>
+        <w:numPr>
+          <w:ilvl w:val="0"/>
+          <w:numId w:val="28"/>
+        </w:numPr>
+        <w:tabs>
+          <w:tab w:val="num" w:pos="720"/>
+        </w:tabs>
+        <w:rPr>
+          <w:spacing w:val="-6"/>
+        </w:rPr>
+      </w:pPr>
+      <w:r>
+        <w:rPr>
+          <w:spacing w:val="-6"/>
+        </w:rPr>
+        <w:t>Si no existe, devolver el mensaje por defecto (especificar cuál, por ejemplo: "Mercenario no encontrado").</w:t>
       </w:r>
     </w:p>
     <w:p>
@@ -7354,16 +7877,16 @@
         <mc:AlternateContent>
           <mc:Choice Requires="wps">
             <w:drawing>
-              <wp:anchor distT="0" distB="0" distL="114300" distR="114300" simplePos="0" relativeHeight="251649024" behindDoc="0" locked="0" layoutInCell="1" allowOverlap="1" wp14:anchorId="58BA83F3" wp14:editId="7B5EA3D6">
+              <wp:anchor distT="0" distB="0" distL="114300" distR="114300" simplePos="0" relativeHeight="251649536" behindDoc="0" locked="0" layoutInCell="1" allowOverlap="1" wp14:anchorId="58BA83F3" wp14:editId="5450904E">
                 <wp:simplePos x="0" y="0"/>
                 <wp:positionH relativeFrom="margin">
-                  <wp:posOffset>396240</wp:posOffset>
+                  <wp:posOffset>392502</wp:posOffset>
                 </wp:positionH>
                 <wp:positionV relativeFrom="paragraph">
-                  <wp:posOffset>74296</wp:posOffset>
+                  <wp:posOffset>78596</wp:posOffset>
                 </wp:positionV>
-                <wp:extent cx="5518205" cy="838200"/>
-                <wp:effectExtent l="0" t="0" r="25400" b="19050"/>
+                <wp:extent cx="5518205" cy="655608"/>
+                <wp:effectExtent l="0" t="0" r="25400" b="11430"/>
                 <wp:wrapNone/>
                 <wp:docPr id="2088680350" name="Rectángulo 2"/>
                 <wp:cNvGraphicFramePr/>
@@ -7374,7 +7897,7 @@
                       <wps:spPr>
                         <a:xfrm>
                           <a:off x="0" y="0"/>
-                          <a:ext cx="5518205" cy="838200"/>
+                          <a:ext cx="5518205" cy="655608"/>
                         </a:xfrm>
                         <a:prstGeom prst="rect">
                           <a:avLst/>
@@ -7417,7 +7940,43 @@
                               <w:rPr>
                                 <w:rFonts w:ascii="Cascadia Mono SemiBold" w:hAnsi="Cascadia Mono SemiBold" w:cs="Cascadia Mono SemiBold"/>
                               </w:rPr>
-                              <w:t>Mercenary [Name] ready for action" o "Mercenary not found in this zip code".</w:t>
+                              <w:t>Letho</w:t>
+                            </w:r>
+                          </w:p>
+                          <w:p>
+                            <w:pPr>
+                              <w:pStyle w:val="Sinespaciado"/>
+                              <w:rPr>
+                                <w:rFonts w:ascii="Cascadia Mono SemiBold" w:hAnsi="Cascadia Mono SemiBold" w:cs="Cascadia Mono SemiBold"/>
+                              </w:rPr>
+                            </w:pPr>
+                            <w:proofErr w:type="spellStart"/>
+                            <w:r>
+                              <w:rPr>
+                                <w:rFonts w:ascii="Cascadia Mono SemiBold" w:hAnsi="Cascadia Mono SemiBold" w:cs="Cascadia Mono SemiBold"/>
+                              </w:rPr>
+                              <w:t>Mercenario</w:t>
+                            </w:r>
+                            <w:proofErr w:type="spellEnd"/>
+                            <w:r>
+                              <w:rPr>
+                                <w:rFonts w:ascii="Cascadia Mono SemiBold" w:hAnsi="Cascadia Mono SemiBold" w:cs="Cascadia Mono SemiBold"/>
+                              </w:rPr>
+                              <w:t xml:space="preserve"> no </w:t>
+                            </w:r>
+                            <w:proofErr w:type="spellStart"/>
+                            <w:r>
+                              <w:rPr>
+                                <w:rFonts w:ascii="Cascadia Mono SemiBold" w:hAnsi="Cascadia Mono SemiBold" w:cs="Cascadia Mono SemiBold"/>
+                              </w:rPr>
+                              <w:t>encontrado</w:t>
+                            </w:r>
+                            <w:proofErr w:type="spellEnd"/>
+                            <w:r>
+                              <w:rPr>
+                                <w:rFonts w:ascii="Cascadia Mono SemiBold" w:hAnsi="Cascadia Mono SemiBold" w:cs="Cascadia Mono SemiBold"/>
+                              </w:rPr>
+                              <w:t>...</w:t>
                             </w:r>
                           </w:p>
                         </w:txbxContent>
@@ -7442,7 +8001,7 @@
           </mc:Choice>
           <mc:Fallback>
             <w:pict>
-              <v:rect w14:anchorId="58BA83F3" id="_x0000_s1030" style="position:absolute;left:0;text-align:left;margin-left:31.2pt;margin-top:5.85pt;width:434.5pt;height:66pt;z-index:251649024;visibility:visible;mso-wrap-style:square;mso-width-percent:0;mso-height-percent:0;mso-wrap-distance-left:9pt;mso-wrap-distance-top:0;mso-wrap-distance-right:9pt;mso-wrap-distance-bottom:0;mso-position-horizontal:absolute;mso-position-horizontal-relative:margin;mso-position-vertical:absolute;mso-position-vertical-relative:text;mso-width-percent:0;mso-height-percent:0;mso-width-relative:margin;mso-height-relative:margin;v-text-anchor:middle" o:gfxdata="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" fillcolor="black [3213]" strokecolor="black [3213]" strokeweight="2pt">
+              <v:rect w14:anchorId="58BA83F3" id="_x0000_s1030" style="position:absolute;left:0;text-align:left;margin-left:30.9pt;margin-top:6.2pt;width:434.5pt;height:51.6pt;z-index:251649536;visibility:visible;mso-wrap-style:square;mso-width-percent:0;mso-height-percent:0;mso-wrap-distance-left:9pt;mso-wrap-distance-top:0;mso-wrap-distance-right:9pt;mso-wrap-distance-bottom:0;mso-position-horizontal:absolute;mso-position-horizontal-relative:margin;mso-position-vertical:absolute;mso-position-vertical-relative:text;mso-width-percent:0;mso-height-percent:0;mso-width-relative:margin;mso-height-relative:margin;v-text-anchor:middle" o:gfxdata="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" fillcolor="black [3213]" strokecolor="black [3213]" strokeweight="2pt">
                 <v:textbox>
                   <w:txbxContent>
                     <w:p>
@@ -7456,7 +8015,43 @@
                         <w:rPr>
                           <w:rFonts w:ascii="Cascadia Mono SemiBold" w:hAnsi="Cascadia Mono SemiBold" w:cs="Cascadia Mono SemiBold"/>
                         </w:rPr>
-                        <w:t>Mercenary [Name] ready for action" o "Mercenary not found in this zip code".</w:t>
+                        <w:t>Letho</w:t>
+                      </w:r>
+                    </w:p>
+                    <w:p>
+                      <w:pPr>
+                        <w:pStyle w:val="Sinespaciado"/>
+                        <w:rPr>
+                          <w:rFonts w:ascii="Cascadia Mono SemiBold" w:hAnsi="Cascadia Mono SemiBold" w:cs="Cascadia Mono SemiBold"/>
+                        </w:rPr>
+                      </w:pPr>
+                      <w:proofErr w:type="spellStart"/>
+                      <w:r>
+                        <w:rPr>
+                          <w:rFonts w:ascii="Cascadia Mono SemiBold" w:hAnsi="Cascadia Mono SemiBold" w:cs="Cascadia Mono SemiBold"/>
+                        </w:rPr>
+                        <w:t>Mercenario</w:t>
+                      </w:r>
+                      <w:proofErr w:type="spellEnd"/>
+                      <w:r>
+                        <w:rPr>
+                          <w:rFonts w:ascii="Cascadia Mono SemiBold" w:hAnsi="Cascadia Mono SemiBold" w:cs="Cascadia Mono SemiBold"/>
+                        </w:rPr>
+                        <w:t xml:space="preserve"> no </w:t>
+                      </w:r>
+                      <w:proofErr w:type="spellStart"/>
+                      <w:r>
+                        <w:rPr>
+                          <w:rFonts w:ascii="Cascadia Mono SemiBold" w:hAnsi="Cascadia Mono SemiBold" w:cs="Cascadia Mono SemiBold"/>
+                        </w:rPr>
+                        <w:t>encontrado</w:t>
+                      </w:r>
+                      <w:proofErr w:type="spellEnd"/>
+                      <w:r>
+                        <w:rPr>
+                          <w:rFonts w:ascii="Cascadia Mono SemiBold" w:hAnsi="Cascadia Mono SemiBold" w:cs="Cascadia Mono SemiBold"/>
+                        </w:rPr>
+                        <w:t>...</w:t>
                       </w:r>
                     </w:p>
                   </w:txbxContent>
@@ -7510,7 +8105,7 @@
         <w:jc w:val="left"/>
       </w:pPr>
       <w:bookmarkStart w:id="12" w:name="_bookmark6"/>
-      <w:bookmarkStart w:id="13" w:name="_Toc234312456"/>
+      <w:bookmarkStart w:id="13" w:name="_Toc235059751"/>
       <w:bookmarkEnd w:id="12"/>
       <w:r>
         <w:rPr>
@@ -7573,12 +8168,16 @@
         </w:tabs>
         <w:spacing w:before="141" w:line="293" w:lineRule="exact"/>
         <w:ind w:left="1341"/>
+        <w:rPr>
+          <w:szCs w:val="24"/>
+        </w:rPr>
       </w:pPr>
       <w:r>
         <w:rPr>
           <w:b/>
           <w:spacing w:val="-2"/>
           <w:w w:val="90"/>
+          <w:szCs w:val="24"/>
         </w:rPr>
         <w:t>Directorio:</w:t>
       </w:r>
@@ -7586,12 +8185,14 @@
         <w:rPr>
           <w:b/>
           <w:spacing w:val="-2"/>
+          <w:szCs w:val="24"/>
         </w:rPr>
         <w:t xml:space="preserve"> </w:t>
       </w:r>
       <w:r>
         <w:rPr>
           <w:spacing w:val="-4"/>
+          <w:szCs w:val="24"/>
         </w:rPr>
         <w:t>ex3/</w:t>
       </w:r>
@@ -7608,12 +8209,16 @@
         </w:tabs>
         <w:spacing w:line="293" w:lineRule="exact"/>
         <w:ind w:left="1341"/>
+        <w:rPr>
+          <w:szCs w:val="24"/>
+        </w:rPr>
       </w:pPr>
       <w:r>
         <w:rPr>
           <w:b/>
           <w:spacing w:val="-2"/>
           <w:w w:val="90"/>
+          <w:szCs w:val="24"/>
         </w:rPr>
         <w:t>Archivo:</w:t>
       </w:r>
@@ -7622,12 +8227,14 @@
           <w:b/>
           <w:spacing w:val="-6"/>
           <w:w w:val="90"/>
+          <w:szCs w:val="24"/>
         </w:rPr>
         <w:t xml:space="preserve"> </w:t>
       </w:r>
       <w:r>
         <w:rPr>
           <w:spacing w:val="-2"/>
+          <w:szCs w:val="24"/>
         </w:rPr>
         <w:t>DeadpoolVault.java</w:t>
       </w:r>
@@ -7645,6 +8252,7 @@
         <w:spacing w:line="293" w:lineRule="exact"/>
         <w:ind w:left="1341"/>
         <w:rPr>
+          <w:szCs w:val="24"/>
           <w:lang w:val="en-US"/>
         </w:rPr>
       </w:pPr>
@@ -7653,6 +8261,7 @@
         <w:rPr>
           <w:b/>
           <w:w w:val="90"/>
+          <w:szCs w:val="24"/>
           <w:lang w:val="en-US"/>
         </w:rPr>
         <w:t>Método</w:t>
@@ -7661,6 +8270,7 @@
       <w:r>
         <w:rPr>
           <w:w w:val="90"/>
+          <w:szCs w:val="24"/>
           <w:lang w:val="en-US"/>
         </w:rPr>
         <w:t>:</w:t>
@@ -7668,6 +8278,7 @@
       <w:r>
         <w:rPr>
           <w:spacing w:val="2"/>
+          <w:szCs w:val="24"/>
           <w:lang w:val="en-US"/>
         </w:rPr>
         <w:t xml:space="preserve"> </w:t>
@@ -7675,51 +8286,54 @@
       <w:r>
         <w:rPr>
           <w:w w:val="90"/>
+          <w:szCs w:val="24"/>
           <w:lang w:val="en-US"/>
         </w:rPr>
-        <w:t>public</w:t>
-      </w:r>
-      <w:r>
-        <w:rPr>
+        <w:t xml:space="preserve">public static void </w:t>
+      </w:r>
+      <w:r>
+        <w:rPr>
+          <w:w w:val="90"/>
+          <w:szCs w:val="24"/>
           <w:lang w:val="en-US"/>
         </w:rPr>
-        <w:t xml:space="preserve"> </w:t>
-      </w:r>
-      <w:r>
-        <w:rPr>
-          <w:w w:val="90"/>
+        <w:t>main (</w:t>
+      </w:r>
+      <w:proofErr w:type="gramStart"/>
+      <w:r>
+        <w:rPr>
+          <w:w w:val="90"/>
+          <w:szCs w:val="24"/>
           <w:lang w:val="en-US"/>
         </w:rPr>
-        <w:t>static</w:t>
-      </w:r>
-      <w:r>
-        <w:rPr>
-          <w:spacing w:val="3"/>
+        <w:t>String[</w:t>
+      </w:r>
+      <w:proofErr w:type="gramEnd"/>
+      <w:r>
+        <w:rPr>
+          <w:w w:val="90"/>
+          <w:szCs w:val="24"/>
           <w:lang w:val="en-US"/>
         </w:rPr>
-        <w:t xml:space="preserve"> </w:t>
-      </w:r>
-      <w:r>
-        <w:rPr>
-          <w:w w:val="90"/>
+        <w:t xml:space="preserve">] </w:t>
+      </w:r>
+      <w:proofErr w:type="spellStart"/>
+      <w:r>
+        <w:rPr>
+          <w:w w:val="90"/>
+          <w:szCs w:val="24"/>
           <w:lang w:val="en-US"/>
         </w:rPr>
-        <w:t>void</w:t>
-      </w:r>
-      <w:r>
-        <w:rPr>
-          <w:spacing w:val="2"/>
+        <w:t>args</w:t>
+      </w:r>
+      <w:proofErr w:type="spellEnd"/>
+      <w:r>
+        <w:rPr>
+          <w:w w:val="90"/>
+          <w:szCs w:val="24"/>
           <w:lang w:val="en-US"/>
         </w:rPr>
-        <w:t xml:space="preserve"> </w:t>
-      </w:r>
-      <w:r>
-        <w:rPr>
-          <w:spacing w:val="-4"/>
-          <w:w w:val="90"/>
-          <w:lang w:val="en-US"/>
-        </w:rPr>
-        <w:t>main…</w:t>
+        <w:t>)</w:t>
       </w:r>
     </w:p>
     <w:p>
@@ -7735,6 +8349,8 @@
         <w:spacing w:line="252" w:lineRule="auto"/>
         <w:ind w:right="2106"/>
         <w:rPr>
+          <w:spacing w:val="-6"/>
+          <w:szCs w:val="24"/>
           <w:lang w:val="en-US"/>
         </w:rPr>
       </w:pPr>
@@ -7743,6 +8359,7 @@
         <w:rPr>
           <w:b/>
           <w:spacing w:val="-6"/>
+          <w:szCs w:val="24"/>
           <w:lang w:val="en-US"/>
         </w:rPr>
         <w:t>Funciones</w:t>
@@ -7752,6 +8369,7 @@
         <w:rPr>
           <w:b/>
           <w:spacing w:val="-21"/>
+          <w:szCs w:val="24"/>
           <w:lang w:val="en-US"/>
         </w:rPr>
         <w:t xml:space="preserve"> </w:t>
@@ -7761,15 +8379,18 @@
         <w:rPr>
           <w:b/>
           <w:spacing w:val="-6"/>
+          <w:szCs w:val="24"/>
           <w:lang w:val="en-US"/>
         </w:rPr>
         <w:t>Autorizadas</w:t>
       </w:r>
       <w:proofErr w:type="spellEnd"/>
+      <w:proofErr w:type="gramStart"/>
       <w:r>
         <w:rPr>
           <w:b/>
           <w:spacing w:val="-6"/>
+          <w:szCs w:val="24"/>
           <w:lang w:val="en-US"/>
         </w:rPr>
         <w:t>:</w:t>
@@ -7778,6 +8399,7 @@
         <w:rPr>
           <w:b/>
           <w:spacing w:val="-21"/>
+          <w:szCs w:val="24"/>
           <w:lang w:val="en-US"/>
         </w:rPr>
         <w:t xml:space="preserve"> </w:t>
@@ -7785,14 +8407,41 @@
       <w:r>
         <w:rPr>
           <w:spacing w:val="-6"/>
+          <w:szCs w:val="24"/>
           <w:lang w:val="en-US"/>
         </w:rPr>
-        <w:t xml:space="preserve">try-with-resources, </w:t>
+        <w:t xml:space="preserve"> </w:t>
+      </w:r>
+      <w:r>
+        <w:rPr>
+          <w:spacing w:val="-6"/>
+          <w:szCs w:val="24"/>
+          <w:lang w:val="en-US"/>
+        </w:rPr>
+        <w:t>try</w:t>
+      </w:r>
+      <w:proofErr w:type="gramEnd"/>
+      <w:r>
+        <w:rPr>
+          <w:spacing w:val="-6"/>
+          <w:szCs w:val="24"/>
+          <w:lang w:val="en-US"/>
+        </w:rPr>
+        <w:t>-with-resources</w:t>
+      </w:r>
+      <w:r>
+        <w:rPr>
+          <w:spacing w:val="-6"/>
+          <w:szCs w:val="24"/>
+          <w:lang w:val="en-US"/>
+        </w:rPr>
+        <w:t xml:space="preserve">, </w:t>
       </w:r>
       <w:proofErr w:type="spellStart"/>
       <w:r>
         <w:rPr>
           <w:spacing w:val="-6"/>
+          <w:szCs w:val="24"/>
           <w:lang w:val="en-US"/>
         </w:rPr>
         <w:t>Files.write</w:t>
@@ -7801,45 +8450,145 @@
       <w:r>
         <w:rPr>
           <w:spacing w:val="-6"/>
+          <w:szCs w:val="24"/>
           <w:lang w:val="en-US"/>
         </w:rPr>
-        <w:t xml:space="preserve">(), </w:t>
+        <w:t>()</w:t>
+      </w:r>
+      <w:r>
+        <w:rPr>
+          <w:spacing w:val="-6"/>
+          <w:szCs w:val="24"/>
+          <w:lang w:val="en-US"/>
+        </w:rPr>
+        <w:t xml:space="preserve">, </w:t>
       </w:r>
       <w:proofErr w:type="spellStart"/>
+      <w:proofErr w:type="gramStart"/>
       <w:r>
         <w:rPr>
           <w:spacing w:val="-6"/>
+          <w:szCs w:val="24"/>
           <w:lang w:val="en-US"/>
         </w:rPr>
+        <w:t>newLine</w:t>
+      </w:r>
+      <w:proofErr w:type="spellEnd"/>
+      <w:r>
+        <w:rPr>
+          <w:spacing w:val="-6"/>
+          <w:szCs w:val="24"/>
+          <w:lang w:val="en-US"/>
+        </w:rPr>
+        <w:t>(</w:t>
+      </w:r>
+      <w:proofErr w:type="gramEnd"/>
+      <w:r>
+        <w:rPr>
+          <w:spacing w:val="-6"/>
+          <w:szCs w:val="24"/>
+          <w:lang w:val="en-US"/>
+        </w:rPr>
+        <w:t>)</w:t>
+      </w:r>
+    </w:p>
+    <w:p>
+      <w:pPr>
+        <w:tabs>
+          <w:tab w:val="left" w:pos="1342"/>
+        </w:tabs>
+        <w:spacing w:line="252" w:lineRule="auto"/>
+        <w:ind w:left="982" w:right="2106"/>
+        <w:rPr>
+          <w:spacing w:val="-6"/>
+          <w:szCs w:val="24"/>
+          <w:lang w:val="en-US"/>
+        </w:rPr>
+      </w:pPr>
+      <w:r>
+        <w:rPr>
+          <w:spacing w:val="-6"/>
+          <w:szCs w:val="24"/>
+          <w:lang w:val="en-US"/>
+        </w:rPr>
+        <w:tab/>
+      </w:r>
+      <w:proofErr w:type="spellStart"/>
+      <w:r>
+        <w:rPr>
+          <w:spacing w:val="-6"/>
+          <w:szCs w:val="24"/>
+          <w:lang w:val="en-US"/>
+        </w:rPr>
         <w:t>Collectors.toList</w:t>
       </w:r>
       <w:proofErr w:type="spellEnd"/>
       <w:r>
         <w:rPr>
           <w:spacing w:val="-6"/>
+          <w:szCs w:val="24"/>
           <w:lang w:val="en-US"/>
         </w:rPr>
         <w:t>()</w:t>
       </w:r>
-    </w:p>
-    <w:p>
-      <w:pPr>
-        <w:pStyle w:val="Ttulo4"/>
+      <w:r>
+        <w:rPr>
+          <w:spacing w:val="-6"/>
+          <w:szCs w:val="24"/>
+          <w:lang w:val="en-US"/>
+        </w:rPr>
+        <w:t xml:space="preserve">, </w:t>
+      </w:r>
+      <w:proofErr w:type="spellStart"/>
+      <w:r>
+        <w:rPr>
+          <w:spacing w:val="-6"/>
+          <w:szCs w:val="24"/>
+          <w:lang w:val="en-US"/>
+        </w:rPr>
+        <w:t>BufferedWriter</w:t>
+      </w:r>
+      <w:proofErr w:type="spellEnd"/>
+      <w:r>
+        <w:rPr>
+          <w:spacing w:val="-6"/>
+          <w:szCs w:val="24"/>
+          <w:lang w:val="en-US"/>
+        </w:rPr>
+        <w:t>, equals, stream.</w:t>
+      </w:r>
+    </w:p>
+    <w:p>
+      <w:pPr>
+        <w:pStyle w:val="Prrafodelista"/>
         <w:numPr>
           <w:ilvl w:val="1"/>
           <w:numId w:val="8"/>
         </w:numPr>
         <w:tabs>
-          <w:tab w:val="left" w:pos="1341"/>
+          <w:tab w:val="left" w:pos="1342"/>
         </w:tabs>
-        <w:spacing w:before="278"/>
-        <w:ind w:left="1341"/>
-      </w:pPr>
-      <w:r>
-        <w:rPr>
+        <w:spacing w:line="252" w:lineRule="auto"/>
+        <w:ind w:right="2106"/>
+        <w:rPr>
+          <w:szCs w:val="24"/>
+        </w:rPr>
+      </w:pPr>
+      <w:r>
+        <w:rPr>
+          <w:b/>
+          <w:bCs/>
           <w:spacing w:val="-2"/>
-        </w:rPr>
-        <w:t>Restricción:</w:t>
+          <w:szCs w:val="24"/>
+        </w:rPr>
+        <w:t>Restricción</w:t>
+      </w:r>
+      <w:r>
+        <w:rPr>
+          <w:spacing w:val="-2"/>
+          <w:szCs w:val="24"/>
+        </w:rPr>
+        <w:t>:</w:t>
       </w:r>
     </w:p>
     <w:p>
@@ -7847,7 +8596,7 @@
         <w:pStyle w:val="Sinespaciado"/>
         <w:numPr>
           <w:ilvl w:val="0"/>
-          <w:numId w:val="21"/>
+          <w:numId w:val="30"/>
         </w:numPr>
         <w:rPr>
           <w:lang w:val="es-ES"/>
@@ -7885,97 +8634,614 @@
         <w:rPr>
           <w:lang w:val="es-ES"/>
         </w:rPr>
-        <w:t xml:space="preserve"> es obligatorio para el manejo de archivos.</w:t>
+        <w:t xml:space="preserve"> es obligatorio para la gestión de archivos. </w:t>
       </w:r>
     </w:p>
     <w:p>
       <w:pPr>
         <w:pStyle w:val="Sinespaciado"/>
+        <w:numPr>
+          <w:ilvl w:val="0"/>
+          <w:numId w:val="30"/>
+        </w:numPr>
         <w:rPr>
           <w:lang w:val="es-ES"/>
         </w:rPr>
       </w:pPr>
+      <w:r>
+        <w:rPr>
+          <w:lang w:val="es-ES"/>
+        </w:rPr>
+        <w:t xml:space="preserve">Está prohibido dejar recursos abiertos manualmente; no se debe depender de llamadas directas </w:t>
+      </w:r>
+      <w:proofErr w:type="gramStart"/>
+      <w:r>
+        <w:rPr>
+          <w:lang w:val="es-ES"/>
+        </w:rPr>
+        <w:t>a .</w:t>
+      </w:r>
+      <w:proofErr w:type="spellStart"/>
+      <w:r>
+        <w:rPr>
+          <w:lang w:val="es-ES"/>
+        </w:rPr>
+        <w:t>close</w:t>
+      </w:r>
+      <w:proofErr w:type="spellEnd"/>
+      <w:proofErr w:type="gramEnd"/>
+      <w:r>
+        <w:rPr>
+          <w:lang w:val="es-ES"/>
+        </w:rPr>
+        <w:t xml:space="preserve">(). </w:t>
+      </w:r>
+    </w:p>
+    <w:p>
+      <w:pPr>
+        <w:pStyle w:val="Sinespaciado"/>
+        <w:numPr>
+          <w:ilvl w:val="0"/>
+          <w:numId w:val="30"/>
+        </w:numPr>
+        <w:rPr>
+          <w:lang w:val="es-ES"/>
+        </w:rPr>
+      </w:pPr>
+      <w:r>
+        <w:rPr>
+          <w:lang w:val="es-ES"/>
+        </w:rPr>
+        <w:t>El filtrado de objetos debe realizarse mediante una expresión Lambda.</w:t>
+      </w:r>
+    </w:p>
+    <w:p>
+      <w:pPr>
+        <w:pStyle w:val="Sinespaciado"/>
+        <w:rPr>
+          <w:lang w:val="es-ES"/>
+        </w:rPr>
+      </w:pPr>
     </w:p>
     <w:p>
       <w:pPr>
         <w:ind w:left="622"/>
+        <w:rPr>
+          <w:b/>
+          <w:spacing w:val="-17"/>
+          <w:szCs w:val="24"/>
+        </w:rPr>
+      </w:pPr>
+      <w:r>
+        <w:rPr>
+          <w:b/>
+          <w:spacing w:val="-6"/>
+          <w:szCs w:val="24"/>
+        </w:rPr>
+        <w:t>Objetivo</w:t>
+      </w:r>
+      <w:r>
+        <w:rPr>
+          <w:b/>
+          <w:spacing w:val="-17"/>
+          <w:szCs w:val="24"/>
+        </w:rPr>
+        <w:t xml:space="preserve"> -</w:t>
+      </w:r>
+      <w:r>
+        <w:rPr>
+          <w:b/>
+          <w:spacing w:val="-17"/>
+          <w:szCs w:val="24"/>
+        </w:rPr>
+        <w:t xml:space="preserve"> </w:t>
+      </w:r>
+      <w:r>
         <w:rPr>
           <w:bCs/>
           <w:spacing w:val="-6"/>
-        </w:rPr>
-      </w:pPr>
-      <w:r>
-        <w:rPr>
-          <w:b/>
+          <w:szCs w:val="24"/>
+        </w:rPr>
+        <w:t xml:space="preserve">Crear un programa que gestione el almacén de objetos de </w:t>
+      </w:r>
+      <w:proofErr w:type="spellStart"/>
+      <w:r>
+        <w:rPr>
+          <w:bCs/>
           <w:spacing w:val="-6"/>
-        </w:rPr>
-        <w:t>Objetivo</w:t>
-      </w:r>
-      <w:r>
+          <w:szCs w:val="24"/>
+        </w:rPr>
+        <w:t>Deadpool</w:t>
+      </w:r>
+      <w:proofErr w:type="spellEnd"/>
+      <w:r>
+        <w:rPr>
+          <w:bCs/>
+          <w:spacing w:val="-6"/>
+          <w:szCs w:val="24"/>
+        </w:rPr>
+        <w:t>.</w:t>
+      </w:r>
+    </w:p>
+    <w:p>
+      <w:pPr>
+        <w:ind w:left="622"/>
         <w:rPr>
           <w:b/>
           <w:spacing w:val="-17"/>
+          <w:szCs w:val="24"/>
+        </w:rPr>
+      </w:pPr>
+    </w:p>
+    <w:p>
+      <w:pPr>
+        <w:ind w:left="622"/>
+        <w:rPr>
+          <w:bCs/>
+          <w:spacing w:val="-6"/>
+          <w:szCs w:val="24"/>
+          <w:lang w:val="en-US"/>
+        </w:rPr>
+      </w:pPr>
+      <w:r>
+        <w:rPr>
+          <w:bCs/>
+          <w:spacing w:val="-6"/>
+          <w:szCs w:val="24"/>
+          <w:lang w:val="en-US"/>
+        </w:rPr>
+        <w:t xml:space="preserve">El </w:t>
+      </w:r>
+      <w:proofErr w:type="spellStart"/>
+      <w:r>
+        <w:rPr>
+          <w:bCs/>
+          <w:spacing w:val="-6"/>
+          <w:szCs w:val="24"/>
+          <w:lang w:val="en-US"/>
+        </w:rPr>
+        <w:t>programa</w:t>
+      </w:r>
+      <w:proofErr w:type="spellEnd"/>
+      <w:r>
+        <w:rPr>
+          <w:bCs/>
+          <w:spacing w:val="-6"/>
+          <w:szCs w:val="24"/>
+          <w:lang w:val="en-US"/>
         </w:rPr>
         <w:t xml:space="preserve"> </w:t>
       </w:r>
-      <w:r>
-        <w:rPr>
-          <w:b/>
+      <w:proofErr w:type="spellStart"/>
+      <w:r>
+        <w:rPr>
+          <w:bCs/>
           <w:spacing w:val="-6"/>
-        </w:rPr>
-        <w:t>-</w:t>
-      </w:r>
-      <w:r>
-        <w:rPr>
-          <w:b/>
-          <w:spacing w:val="-17"/>
+          <w:szCs w:val="24"/>
+          <w:lang w:val="en-US"/>
+        </w:rPr>
+        <w:t>debe</w:t>
+      </w:r>
+      <w:proofErr w:type="spellEnd"/>
+      <w:r>
+        <w:rPr>
+          <w:bCs/>
+          <w:spacing w:val="-6"/>
+          <w:szCs w:val="24"/>
+          <w:lang w:val="en-US"/>
+        </w:rPr>
+        <w:t>:</w:t>
+      </w:r>
+    </w:p>
+    <w:p>
+      <w:pPr>
+        <w:ind w:left="622"/>
+        <w:rPr>
+          <w:bCs/>
+          <w:spacing w:val="-6"/>
+          <w:szCs w:val="24"/>
+          <w:lang w:val="en-US"/>
+        </w:rPr>
+      </w:pPr>
+    </w:p>
+    <w:p>
+      <w:pPr>
+        <w:numPr>
+          <w:ilvl w:val="0"/>
+          <w:numId w:val="31"/>
+        </w:numPr>
+        <w:tabs>
+          <w:tab w:val="clear" w:pos="720"/>
+          <w:tab w:val="num" w:pos="1112"/>
+        </w:tabs>
+        <w:ind w:left="1112"/>
+        <w:rPr>
+          <w:bCs/>
+          <w:spacing w:val="-6"/>
+          <w:szCs w:val="24"/>
+        </w:rPr>
+      </w:pPr>
+      <w:r>
+        <w:rPr>
+          <w:bCs/>
+          <w:spacing w:val="-6"/>
+          <w:szCs w:val="24"/>
+        </w:rPr>
+        <w:t>Tener una lista de objetos (</w:t>
+      </w:r>
+      <w:proofErr w:type="spellStart"/>
+      <w:r>
+        <w:rPr>
+          <w:bCs/>
+          <w:spacing w:val="-6"/>
+          <w:szCs w:val="24"/>
+        </w:rPr>
+        <w:t>List</w:t>
+      </w:r>
+      <w:proofErr w:type="spellEnd"/>
+      <w:r>
+        <w:rPr>
+          <w:bCs/>
+          <w:spacing w:val="-6"/>
+          <w:szCs w:val="24"/>
+        </w:rPr>
+        <w:t>&lt;</w:t>
+      </w:r>
+      <w:proofErr w:type="spellStart"/>
+      <w:r>
+        <w:rPr>
+          <w:bCs/>
+          <w:spacing w:val="-6"/>
+          <w:szCs w:val="24"/>
+        </w:rPr>
+        <w:t>String</w:t>
+      </w:r>
+      <w:proofErr w:type="spellEnd"/>
+      <w:r>
+        <w:rPr>
+          <w:bCs/>
+          <w:spacing w:val="-6"/>
+          <w:szCs w:val="24"/>
+        </w:rPr>
+        <w:t xml:space="preserve">&gt;) que representan el </w:t>
+      </w:r>
+      <w:proofErr w:type="spellStart"/>
+      <w:r>
+        <w:rPr>
+          <w:bCs/>
+          <w:spacing w:val="-6"/>
+          <w:szCs w:val="24"/>
+        </w:rPr>
+        <w:t>loot</w:t>
+      </w:r>
+      <w:proofErr w:type="spellEnd"/>
+      <w:r>
+        <w:rPr>
+          <w:bCs/>
+          <w:spacing w:val="-6"/>
+          <w:szCs w:val="24"/>
+        </w:rPr>
+        <w:t xml:space="preserve"> almacenado. </w:t>
+      </w:r>
+    </w:p>
+    <w:p>
+      <w:pPr>
+        <w:numPr>
+          <w:ilvl w:val="0"/>
+          <w:numId w:val="31"/>
+        </w:numPr>
+        <w:tabs>
+          <w:tab w:val="clear" w:pos="720"/>
+          <w:tab w:val="num" w:pos="1112"/>
+        </w:tabs>
+        <w:ind w:left="1112"/>
+        <w:rPr>
+          <w:bCs/>
+          <w:spacing w:val="-6"/>
+          <w:szCs w:val="24"/>
+        </w:rPr>
+      </w:pPr>
+      <w:r>
+        <w:rPr>
+          <w:bCs/>
+          <w:spacing w:val="-6"/>
+          <w:szCs w:val="24"/>
+        </w:rPr>
+        <w:t xml:space="preserve">Filtrar mediante una Lambda únicamente los objetos considerados de valor. </w:t>
+      </w:r>
+    </w:p>
+    <w:p>
+      <w:pPr>
+        <w:numPr>
+          <w:ilvl w:val="0"/>
+          <w:numId w:val="31"/>
+        </w:numPr>
+        <w:tabs>
+          <w:tab w:val="clear" w:pos="720"/>
+          <w:tab w:val="num" w:pos="1112"/>
+        </w:tabs>
+        <w:ind w:left="1112"/>
+        <w:rPr>
+          <w:bCs/>
+          <w:spacing w:val="-6"/>
+          <w:szCs w:val="24"/>
+        </w:rPr>
+      </w:pPr>
+      <w:r>
+        <w:rPr>
+          <w:bCs/>
+          <w:spacing w:val="-6"/>
+          <w:szCs w:val="24"/>
+        </w:rPr>
+        <w:t xml:space="preserve">Guardar los objetos filtrados en un archivo de texto utilizando operaciones de escritura con archivos. </w:t>
+      </w:r>
+    </w:p>
+    <w:p>
+      <w:pPr>
+        <w:numPr>
+          <w:ilvl w:val="0"/>
+          <w:numId w:val="31"/>
+        </w:numPr>
+        <w:tabs>
+          <w:tab w:val="clear" w:pos="720"/>
+          <w:tab w:val="num" w:pos="1112"/>
+        </w:tabs>
+        <w:ind w:left="1112"/>
+        <w:rPr>
+          <w:bCs/>
+          <w:spacing w:val="-6"/>
+          <w:szCs w:val="24"/>
+        </w:rPr>
+      </w:pPr>
+      <w:r>
+        <w:rPr>
+          <w:bCs/>
+          <w:spacing w:val="-6"/>
+          <w:szCs w:val="24"/>
+        </w:rPr>
+        <w:t xml:space="preserve">Mostrar un mensaje de confirmación indicando: </w:t>
+      </w:r>
+    </w:p>
+    <w:p>
+      <w:pPr>
+        <w:pStyle w:val="Prrafodelista"/>
+        <w:numPr>
+          <w:ilvl w:val="0"/>
+          <w:numId w:val="32"/>
+        </w:numPr>
+        <w:rPr>
+          <w:bCs/>
+          <w:spacing w:val="-6"/>
+          <w:szCs w:val="24"/>
+        </w:rPr>
+      </w:pPr>
+      <w:r>
+        <w:rPr>
+          <w:bCs/>
+          <w:spacing w:val="-6"/>
+          <w:szCs w:val="24"/>
+        </w:rPr>
+        <w:t xml:space="preserve">El nombre del archivo creado. </w:t>
+      </w:r>
+    </w:p>
+    <w:p>
+      <w:pPr>
+        <w:pStyle w:val="Prrafodelista"/>
+        <w:numPr>
+          <w:ilvl w:val="0"/>
+          <w:numId w:val="32"/>
+        </w:numPr>
+        <w:rPr>
+          <w:bCs/>
+          <w:spacing w:val="-6"/>
+          <w:szCs w:val="24"/>
+        </w:rPr>
+      </w:pPr>
+      <w:r>
+        <w:rPr>
+          <w:bCs/>
+          <w:spacing w:val="-6"/>
+          <w:szCs w:val="24"/>
+        </w:rPr>
+        <w:t>La cantidad de objetos guardados.</w:t>
+      </w:r>
+    </w:p>
+    <w:p>
+      <w:pPr>
+        <w:rPr>
+          <w:bCs/>
+          <w:spacing w:val="-6"/>
+          <w:szCs w:val="24"/>
+        </w:rPr>
+      </w:pPr>
+    </w:p>
+    <w:p>
+      <w:pPr>
+        <w:ind w:left="622"/>
+        <w:rPr>
+          <w:bCs/>
+          <w:spacing w:val="-6"/>
+          <w:szCs w:val="24"/>
+        </w:rPr>
+      </w:pPr>
+      <w:r>
+        <w:rPr>
+          <w:b/>
+          <w:i/>
+          <w:iCs/>
+          <w:spacing w:val="-6"/>
+          <w:szCs w:val="24"/>
+        </w:rPr>
+        <w:t>Lista inicial:</w:t>
+      </w:r>
+      <w:r>
+        <w:rPr>
+          <w:bCs/>
+          <w:spacing w:val="-6"/>
+          <w:szCs w:val="24"/>
         </w:rPr>
         <w:t xml:space="preserve"> </w:t>
       </w:r>
       <w:r>
         <w:rPr>
           <w:bCs/>
-          <w:spacing w:val="-17"/>
-        </w:rPr>
-        <w:t>Escribir un archivo de "</w:t>
+          <w:spacing w:val="-6"/>
+          <w:szCs w:val="24"/>
+        </w:rPr>
+        <w:t>["</w:t>
       </w:r>
       <w:proofErr w:type="spellStart"/>
       <w:r>
         <w:rPr>
           <w:bCs/>
-          <w:spacing w:val="-17"/>
-        </w:rPr>
-        <w:t>loot</w:t>
+          <w:spacing w:val="-6"/>
+          <w:szCs w:val="24"/>
+        </w:rPr>
+        <w:t>Katana</w:t>
       </w:r>
       <w:proofErr w:type="spellEnd"/>
       <w:r>
         <w:rPr>
           <w:bCs/>
-          <w:spacing w:val="-17"/>
-        </w:rPr>
-        <w:t>" filtrando solo objetos de valor mediante una Lambda.</w:t>
-      </w:r>
+          <w:spacing w:val="-6"/>
+          <w:szCs w:val="24"/>
+        </w:rPr>
+        <w:t>", "Piedra", "Oro", "Chimichanga", "Diamante"]</w:t>
+      </w:r>
+    </w:p>
+    <w:p>
+      <w:pPr>
+        <w:ind w:left="622"/>
+        <w:rPr>
+          <w:bCs/>
+          <w:spacing w:val="-6"/>
+          <w:szCs w:val="24"/>
+        </w:rPr>
+      </w:pPr>
+      <w:r>
+        <w:rPr>
+          <w:b/>
+          <w:i/>
+          <w:iCs/>
+          <w:spacing w:val="-6"/>
+          <w:szCs w:val="24"/>
+        </w:rPr>
+        <w:t>F</w:t>
+      </w:r>
+      <w:r>
+        <w:rPr>
+          <w:b/>
+          <w:i/>
+          <w:iCs/>
+          <w:spacing w:val="-6"/>
+          <w:szCs w:val="24"/>
+        </w:rPr>
+        <w:t>iltrado</w:t>
+      </w:r>
+      <w:r>
+        <w:rPr>
+          <w:b/>
+          <w:i/>
+          <w:iCs/>
+          <w:spacing w:val="-6"/>
+          <w:szCs w:val="24"/>
+        </w:rPr>
+        <w:t>:</w:t>
+      </w:r>
+      <w:r>
+        <w:rPr>
+          <w:bCs/>
+          <w:spacing w:val="-6"/>
+          <w:szCs w:val="24"/>
+        </w:rPr>
+        <w:t xml:space="preserve"> </w:t>
+      </w:r>
+      <w:r>
+        <w:rPr>
+          <w:bCs/>
+          <w:spacing w:val="-6"/>
+          <w:szCs w:val="24"/>
+        </w:rPr>
+        <w:t>["</w:t>
+      </w:r>
+      <w:proofErr w:type="spellStart"/>
+      <w:r>
+        <w:rPr>
+          <w:bCs/>
+          <w:spacing w:val="-6"/>
+          <w:szCs w:val="24"/>
+        </w:rPr>
+        <w:t>Katana</w:t>
+      </w:r>
+      <w:proofErr w:type="spellEnd"/>
+      <w:r>
+        <w:rPr>
+          <w:bCs/>
+          <w:spacing w:val="-6"/>
+          <w:szCs w:val="24"/>
+        </w:rPr>
+        <w:t>", "Oro", "Diamante"]</w:t>
+      </w:r>
+    </w:p>
+    <w:p>
+      <w:pPr>
+        <w:ind w:left="622"/>
+        <w:rPr>
+          <w:bCs/>
+          <w:spacing w:val="-6"/>
+          <w:szCs w:val="24"/>
+        </w:rPr>
+      </w:pPr>
+      <w:r>
+        <w:rPr>
+          <w:b/>
+          <w:i/>
+          <w:iCs/>
+          <w:spacing w:val="-6"/>
+          <w:szCs w:val="24"/>
+        </w:rPr>
+        <w:t>Archivo generado:</w:t>
+      </w:r>
+      <w:r>
+        <w:rPr>
+          <w:bCs/>
+          <w:spacing w:val="-6"/>
+          <w:szCs w:val="24"/>
+        </w:rPr>
+        <w:t xml:space="preserve"> </w:t>
+      </w:r>
+      <w:r>
+        <w:rPr>
+          <w:bCs/>
+          <w:spacing w:val="-6"/>
+          <w:szCs w:val="24"/>
+        </w:rPr>
+        <w:t>deadpool_loot.txt</w:t>
+      </w:r>
+    </w:p>
+    <w:p>
+      <w:pPr>
+        <w:rPr>
+          <w:bCs/>
+          <w:spacing w:val="-6"/>
+          <w:szCs w:val="24"/>
+        </w:rPr>
+      </w:pPr>
     </w:p>
     <w:p>
       <w:pPr>
         <w:pStyle w:val="Textoindependiente"/>
-        <w:spacing w:before="2"/>
-        <w:rPr>
-          <w:b/>
+        <w:rPr>
+          <w:sz w:val="20"/>
         </w:rPr>
       </w:pPr>
     </w:p>
     <w:p>
       <w:pPr>
         <w:pStyle w:val="Textoindependiente"/>
-        <w:rPr>
-          <w:sz w:val="20"/>
-        </w:rPr>
-      </w:pPr>
-    </w:p>
-    <w:p>
-      <w:pPr>
-        <w:pStyle w:val="Textoindependiente"/>
+        <w:tabs>
+          <w:tab w:val="center" w:pos="5195"/>
+        </w:tabs>
         <w:spacing w:before="1" w:line="252" w:lineRule="auto"/>
         <w:ind w:left="622" w:right="672"/>
       </w:pPr>
@@ -7986,6 +9252,27 @@
         </w:rPr>
         <w:t>Salida Esperada</w:t>
       </w:r>
+      <w:r>
+        <w:rPr>
+          <w:b/>
+          <w:bCs/>
+        </w:rPr>
+        <w:t xml:space="preserve">: </w:t>
+      </w:r>
+      <w:r>
+        <w:rPr>
+          <w:i/>
+          <w:iCs/>
+        </w:rPr>
+        <w:t>El archivo creado</w:t>
+      </w:r>
+      <w:r>
+        <w:rPr>
+          <w:i/>
+          <w:iCs/>
+        </w:rPr>
+        <w:t>, con los datos filtrados con espacios.</w:t>
+      </w:r>
     </w:p>
     <w:p>
       <w:pPr>
@@ -7995,127 +9282,6 @@
           <w:lang w:val="es-ES"/>
         </w:rPr>
       </w:pPr>
-      <w:r>
-        <w:rPr>
-          <w:noProof/>
-          <w:lang w:val="es-ES"/>
-        </w:rPr>
-        <mc:AlternateContent>
-          <mc:Choice Requires="wps">
-            <w:drawing>
-              <wp:anchor distT="0" distB="0" distL="114300" distR="114300" simplePos="0" relativeHeight="251658240" behindDoc="0" locked="0" layoutInCell="1" allowOverlap="1" wp14:anchorId="4F91A487" wp14:editId="294B2BDF">
-                <wp:simplePos x="0" y="0"/>
-                <wp:positionH relativeFrom="margin">
-                  <wp:posOffset>396240</wp:posOffset>
-                </wp:positionH>
-                <wp:positionV relativeFrom="paragraph">
-                  <wp:posOffset>76200</wp:posOffset>
-                </wp:positionV>
-                <wp:extent cx="5518205" cy="480060"/>
-                <wp:effectExtent l="0" t="0" r="25400" b="15240"/>
-                <wp:wrapNone/>
-                <wp:docPr id="483208062" name="Rectángulo 2"/>
-                <wp:cNvGraphicFramePr/>
-                <a:graphic xmlns:a="http://schemas.openxmlformats.org/drawingml/2006/main">
-                  <a:graphicData uri="http://schemas.microsoft.com/office/word/2010/wordprocessingShape">
-                    <wps:wsp>
-                      <wps:cNvSpPr/>
-                      <wps:spPr>
-                        <a:xfrm>
-                          <a:off x="0" y="0"/>
-                          <a:ext cx="5518205" cy="480060"/>
-                        </a:xfrm>
-                        <a:prstGeom prst="rect">
-                          <a:avLst/>
-                        </a:prstGeom>
-                        <a:solidFill>
-                          <a:schemeClr val="tx1"/>
-                        </a:solidFill>
-                        <a:ln>
-                          <a:solidFill>
-                            <a:schemeClr val="tx1"/>
-                          </a:solidFill>
-                        </a:ln>
-                      </wps:spPr>
-                      <wps:style>
-                        <a:lnRef idx="2">
-                          <a:schemeClr val="accent1">
-                            <a:shade val="15000"/>
-                          </a:schemeClr>
-                        </a:lnRef>
-                        <a:fillRef idx="1">
-                          <a:schemeClr val="accent1"/>
-                        </a:fillRef>
-                        <a:effectRef idx="0">
-                          <a:schemeClr val="accent1"/>
-                        </a:effectRef>
-                        <a:fontRef idx="minor">
-                          <a:schemeClr val="lt1"/>
-                        </a:fontRef>
-                      </wps:style>
-                      <wps:txbx>
-                        <w:txbxContent>
-                          <w:p>
-                            <w:pPr>
-                              <w:pStyle w:val="Sinespaciado"/>
-                              <w:rPr>
-                                <w:rFonts w:ascii="Cascadia Mono SemiBold" w:hAnsi="Cascadia Mono SemiBold" w:cs="Cascadia Mono SemiBold"/>
-                              </w:rPr>
-                            </w:pPr>
-                            <w:r>
-                              <w:rPr>
-                                <w:rFonts w:ascii="Cascadia Mono SemiBold" w:hAnsi="Cascadia Mono SemiBold" w:cs="Cascadia Mono SemiBold"/>
-                              </w:rPr>
-                              <w:t>"Vault secured: [filename] saved with [X] items."</w:t>
-                            </w:r>
-                          </w:p>
-                        </w:txbxContent>
-                      </wps:txbx>
-                      <wps:bodyPr rot="0" spcFirstLastPara="0" vertOverflow="overflow" horzOverflow="overflow" vert="horz" wrap="square" lIns="91440" tIns="45720" rIns="91440" bIns="45720" numCol="1" spcCol="0" rtlCol="0" fromWordArt="0" anchor="ctr" anchorCtr="0" forceAA="0" compatLnSpc="1">
-                        <a:prstTxWarp prst="textNoShape">
-                          <a:avLst/>
-                        </a:prstTxWarp>
-                        <a:noAutofit/>
-                      </wps:bodyPr>
-                    </wps:wsp>
-                  </a:graphicData>
-                </a:graphic>
-                <wp14:sizeRelH relativeFrom="margin">
-                  <wp14:pctWidth>0</wp14:pctWidth>
-                </wp14:sizeRelH>
-                <wp14:sizeRelV relativeFrom="margin">
-                  <wp14:pctHeight>0</wp14:pctHeight>
-                </wp14:sizeRelV>
-              </wp:anchor>
-            </w:drawing>
-          </mc:Choice>
-          <mc:Fallback>
-            <w:pict>
-              <v:rect w14:anchorId="4F91A487" id="_x0000_s1031" style="position:absolute;left:0;text-align:left;margin-left:31.2pt;margin-top:6pt;width:434.5pt;height:37.8pt;z-index:251658240;visibility:visible;mso-wrap-style:square;mso-width-percent:0;mso-height-percent:0;mso-wrap-distance-left:9pt;mso-wrap-distance-top:0;mso-wrap-distance-right:9pt;mso-wrap-distance-bottom:0;mso-position-horizontal:absolute;mso-position-horizontal-relative:margin;mso-position-vertical:absolute;mso-position-vertical-relative:text;mso-width-percent:0;mso-height-percent:0;mso-width-relative:margin;mso-height-relative:margin;v-text-anchor:middle" o:gfxdata="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" fillcolor="black [3213]" strokecolor="black [3213]" strokeweight="2pt">
-                <v:textbox>
-                  <w:txbxContent>
-                    <w:p>
-                      <w:pPr>
-                        <w:pStyle w:val="Sinespaciado"/>
-                        <w:rPr>
-                          <w:rFonts w:ascii="Cascadia Mono SemiBold" w:hAnsi="Cascadia Mono SemiBold" w:cs="Cascadia Mono SemiBold"/>
-                        </w:rPr>
-                      </w:pPr>
-                      <w:r>
-                        <w:rPr>
-                          <w:rFonts w:ascii="Cascadia Mono SemiBold" w:hAnsi="Cascadia Mono SemiBold" w:cs="Cascadia Mono SemiBold"/>
-                        </w:rPr>
-                        <w:t>"Vault secured: [filename] saved with [X] items."</w:t>
-                      </w:r>
-                    </w:p>
-                  </w:txbxContent>
-                </v:textbox>
-                <w10:wrap anchorx="margin"/>
-              </v:rect>
-            </w:pict>
-          </mc:Fallback>
-        </mc:AlternateContent>
-      </w:r>
     </w:p>
     <w:p>
       <w:pPr>
@@ -8149,7 +9315,7 @@
         <w:jc w:val="left"/>
       </w:pPr>
       <w:bookmarkStart w:id="14" w:name="_bookmark7"/>
-      <w:bookmarkStart w:id="15" w:name="_Toc234312457"/>
+      <w:bookmarkStart w:id="15" w:name="_Toc235059752"/>
       <w:bookmarkEnd w:id="14"/>
       <w:r>
         <w:rPr>
@@ -8542,7 +9708,7 @@
         <mc:AlternateContent>
           <mc:Choice Requires="wps">
             <w:drawing>
-              <wp:anchor distT="0" distB="0" distL="114300" distR="114300" simplePos="0" relativeHeight="251642880" behindDoc="0" locked="0" layoutInCell="1" allowOverlap="1" wp14:anchorId="07DEF22C" wp14:editId="6CECE511">
+              <wp:anchor distT="0" distB="0" distL="114300" distR="114300" simplePos="0" relativeHeight="251643392" behindDoc="0" locked="0" layoutInCell="1" allowOverlap="1" wp14:anchorId="07DEF22C" wp14:editId="6CECE511">
                 <wp:simplePos x="0" y="0"/>
                 <wp:positionH relativeFrom="margin">
                   <wp:posOffset>335280</wp:posOffset>
@@ -8632,7 +9798,7 @@
           </mc:Choice>
           <mc:Fallback>
             <w:pict>
-              <v:rect w14:anchorId="07DEF22C" id="_x0000_s1032" style="position:absolute;margin-left:26.4pt;margin-top:.7pt;width:441.4pt;height:46.8pt;z-index:251642880;visibility:visible;mso-wrap-style:square;mso-width-percent:0;mso-height-percent:0;mso-wrap-distance-left:9pt;mso-wrap-distance-top:0;mso-wrap-distance-right:9pt;mso-wrap-distance-bottom:0;mso-position-horizontal:absolute;mso-position-horizontal-relative:margin;mso-position-vertical:absolute;mso-position-vertical-relative:text;mso-width-percent:0;mso-height-percent:0;mso-width-relative:margin;mso-height-relative:margin;v-text-anchor:middle" o:gfxdata="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" fillcolor="black [3213]" strokecolor="black [3213]" strokeweight="2pt">
+              <v:rect w14:anchorId="07DEF22C" id="_x0000_s1031" style="position:absolute;margin-left:26.4pt;margin-top:.7pt;width:441.4pt;height:46.8pt;z-index:251643392;visibility:visible;mso-wrap-style:square;mso-width-percent:0;mso-height-percent:0;mso-wrap-distance-left:9pt;mso-wrap-distance-top:0;mso-wrap-distance-right:9pt;mso-wrap-distance-bottom:0;mso-position-horizontal:absolute;mso-position-horizontal-relative:margin;mso-position-vertical:absolute;mso-position-vertical-relative:text;mso-width-percent:0;mso-height-percent:0;mso-width-relative:margin;mso-height-relative:margin;v-text-anchor:middle" o:gfxdata="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" fillcolor="black [3213]" strokecolor="black [3213]" strokeweight="2pt">
                 <v:textbox>
                   <w:txbxContent>
                     <w:p>
@@ -8691,7 +9857,7 @@
         <w:jc w:val="left"/>
       </w:pPr>
       <w:bookmarkStart w:id="16" w:name="_bookmark8"/>
-      <w:bookmarkStart w:id="17" w:name="_Toc234312458"/>
+      <w:bookmarkStart w:id="17" w:name="_Toc235059753"/>
       <w:bookmarkEnd w:id="16"/>
       <w:r>
         <w:rPr>
@@ -9292,7 +10458,7 @@
         <mc:AlternateContent>
           <mc:Choice Requires="wps">
             <w:drawing>
-              <wp:anchor distT="0" distB="0" distL="114300" distR="114300" simplePos="0" relativeHeight="251651072" behindDoc="0" locked="0" layoutInCell="1" allowOverlap="1" wp14:anchorId="313EC888" wp14:editId="68B7C2E6">
+              <wp:anchor distT="0" distB="0" distL="114300" distR="114300" simplePos="0" relativeHeight="251651584" behindDoc="0" locked="0" layoutInCell="1" allowOverlap="1" wp14:anchorId="313EC888" wp14:editId="68B7C2E6">
                 <wp:simplePos x="0" y="0"/>
                 <wp:positionH relativeFrom="margin">
                   <wp:posOffset>312420</wp:posOffset>
@@ -9382,7 +10548,7 @@
           </mc:Choice>
           <mc:Fallback>
             <w:pict>
-              <v:rect w14:anchorId="313EC888" id="_x0000_s1033" style="position:absolute;margin-left:24.6pt;margin-top:5.45pt;width:436.4pt;height:42.6pt;z-index:251651072;visibility:visible;mso-wrap-style:square;mso-width-percent:0;mso-height-percent:0;mso-wrap-distance-left:9pt;mso-wrap-distance-top:0;mso-wrap-distance-right:9pt;mso-wrap-distance-bottom:0;mso-position-horizontal:absolute;mso-position-horizontal-relative:margin;mso-position-vertical:absolute;mso-position-vertical-relative:text;mso-width-percent:0;mso-height-percent:0;mso-width-relative:margin;mso-height-relative:margin;v-text-anchor:middle" o:gfxdata="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" fillcolor="black [3213]" strokecolor="black [3213]" strokeweight="2pt">
+              <v:rect w14:anchorId="313EC888" id="_x0000_s1032" style="position:absolute;margin-left:24.6pt;margin-top:5.45pt;width:436.4pt;height:42.6pt;z-index:251651584;visibility:visible;mso-wrap-style:square;mso-width-percent:0;mso-height-percent:0;mso-wrap-distance-left:9pt;mso-wrap-distance-top:0;mso-wrap-distance-right:9pt;mso-wrap-distance-bottom:0;mso-position-horizontal:absolute;mso-position-horizontal-relative:margin;mso-position-vertical:absolute;mso-position-vertical-relative:text;mso-width-percent:0;mso-height-percent:0;mso-width-relative:margin;mso-height-relative:margin;v-text-anchor:middle" o:gfxdata="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" fillcolor="black [3213]" strokecolor="black [3213]" strokeweight="2pt">
                 <v:textbox>
                   <w:txbxContent>
                     <w:p>
@@ -9451,7 +10617,7 @@
         <w:jc w:val="left"/>
       </w:pPr>
       <w:bookmarkStart w:id="18" w:name="_bookmark9"/>
-      <w:bookmarkStart w:id="19" w:name="_Toc234312459"/>
+      <w:bookmarkStart w:id="19" w:name="_Toc235059754"/>
       <w:bookmarkEnd w:id="18"/>
       <w:r>
         <w:rPr>
@@ -9896,7 +11062,7 @@
         <mc:AlternateContent>
           <mc:Choice Requires="wps">
             <w:drawing>
-              <wp:anchor distT="0" distB="0" distL="114300" distR="114300" simplePos="0" relativeHeight="251655168" behindDoc="0" locked="0" layoutInCell="1" allowOverlap="1" wp14:anchorId="51756CB7" wp14:editId="2D00EC89">
+              <wp:anchor distT="0" distB="0" distL="114300" distR="114300" simplePos="0" relativeHeight="251655680" behindDoc="0" locked="0" layoutInCell="1" allowOverlap="1" wp14:anchorId="51756CB7" wp14:editId="2D00EC89">
                 <wp:simplePos x="0" y="0"/>
                 <wp:positionH relativeFrom="margin">
                   <wp:posOffset>396240</wp:posOffset>
@@ -10049,7 +11215,7 @@
           </mc:Choice>
           <mc:Fallback>
             <w:pict>
-              <v:rect w14:anchorId="51756CB7" id="_x0000_s1034" style="position:absolute;left:0;text-align:left;margin-left:31.2pt;margin-top:6.45pt;width:451.4pt;height:49.8pt;z-index:251655168;visibility:visible;mso-wrap-style:square;mso-width-percent:0;mso-height-percent:0;mso-wrap-distance-left:9pt;mso-wrap-distance-top:0;mso-wrap-distance-right:9pt;mso-wrap-distance-bottom:0;mso-position-horizontal:absolute;mso-position-horizontal-relative:margin;mso-position-vertical:absolute;mso-position-vertical-relative:text;mso-width-percent:0;mso-height-percent:0;mso-width-relative:margin;mso-height-relative:margin;v-text-anchor:middle" o:gfxdata="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" fillcolor="black [3213]" strokecolor="black [3213]" strokeweight="2pt">
+              <v:rect w14:anchorId="51756CB7" id="_x0000_s1033" style="position:absolute;left:0;text-align:left;margin-left:31.2pt;margin-top:6.45pt;width:451.4pt;height:49.8pt;z-index:251655680;visibility:visible;mso-wrap-style:square;mso-width-percent:0;mso-height-percent:0;mso-wrap-distance-left:9pt;mso-wrap-distance-top:0;mso-wrap-distance-right:9pt;mso-wrap-distance-bottom:0;mso-position-horizontal:absolute;mso-position-horizontal-relative:margin;mso-position-vertical:absolute;mso-position-vertical-relative:text;mso-width-percent:0;mso-height-percent:0;mso-width-relative:margin;mso-height-relative:margin;v-text-anchor:middle" o:gfxdata="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" fillcolor="black [3213]" strokecolor="black [3213]" strokeweight="2pt">
                 <v:textbox>
                   <w:txbxContent>
                     <w:p>
@@ -10185,7 +11351,7 @@
         <w:lastRenderedPageBreak/>
         <w:tab/>
       </w:r>
-      <w:bookmarkStart w:id="20" w:name="_Toc234312460"/>
+      <w:bookmarkStart w:id="20" w:name="_Toc235059755"/>
       <w:r>
         <w:rPr>
           <w:w w:val="90"/>
@@ -10586,7 +11752,7 @@
         <mc:AlternateContent>
           <mc:Choice Requires="wps">
             <w:drawing>
-              <wp:anchor distT="0" distB="0" distL="114300" distR="114300" simplePos="0" relativeHeight="251665408" behindDoc="0" locked="0" layoutInCell="1" allowOverlap="1" wp14:anchorId="1136D5C1" wp14:editId="2D95497A">
+              <wp:anchor distT="0" distB="0" distL="114300" distR="114300" simplePos="0" relativeHeight="251664896" behindDoc="0" locked="0" layoutInCell="1" allowOverlap="1" wp14:anchorId="1136D5C1" wp14:editId="2D95497A">
                 <wp:simplePos x="0" y="0"/>
                 <wp:positionH relativeFrom="margin">
                   <wp:posOffset>396240</wp:posOffset>
@@ -10732,7 +11898,7 @@
           </mc:Choice>
           <mc:Fallback>
             <w:pict>
-              <v:rect w14:anchorId="1136D5C1" id="_x0000_s1035" style="position:absolute;left:0;text-align:left;margin-left:31.2pt;margin-top:6.45pt;width:451.4pt;height:56.4pt;z-index:251665408;visibility:visible;mso-wrap-style:square;mso-width-percent:0;mso-height-percent:0;mso-wrap-distance-left:9pt;mso-wrap-distance-top:0;mso-wrap-distance-right:9pt;mso-wrap-distance-bottom:0;mso-position-horizontal:absolute;mso-position-horizontal-relative:margin;mso-position-vertical:absolute;mso-position-vertical-relative:text;mso-width-percent:0;mso-height-percent:0;mso-width-relative:margin;mso-height-relative:margin;v-text-anchor:middle" o:gfxdata="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" fillcolor="black [3213]" strokecolor="black [3213]" strokeweight="2pt">
+              <v:rect w14:anchorId="1136D5C1" id="_x0000_s1034" style="position:absolute;left:0;text-align:left;margin-left:31.2pt;margin-top:6.45pt;width:451.4pt;height:56.4pt;z-index:251664896;visibility:visible;mso-wrap-style:square;mso-width-percent:0;mso-height-percent:0;mso-wrap-distance-left:9pt;mso-wrap-distance-top:0;mso-wrap-distance-right:9pt;mso-wrap-distance-bottom:0;mso-position-horizontal:absolute;mso-position-horizontal-relative:margin;mso-position-vertical:absolute;mso-position-vertical-relative:text;mso-width-percent:0;mso-height-percent:0;mso-width-relative:margin;mso-height-relative:margin;v-text-anchor:middle" o:gfxdata="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" fillcolor="black [3213]" strokecolor="black [3213]" strokeweight="2pt">
                 <v:textbox>
                   <w:txbxContent>
                     <w:p>
@@ -10880,7 +12046,7 @@
       <w:r>
         <w:tab/>
       </w:r>
-      <w:bookmarkStart w:id="21" w:name="_Toc234312461"/>
+      <w:bookmarkStart w:id="21" w:name="_Toc235059756"/>
       <w:r>
         <w:rPr>
           <w:w w:val="90"/>
@@ -11395,7 +12561,7 @@
         <mc:AlternateContent>
           <mc:Choice Requires="wps">
             <w:drawing>
-              <wp:anchor distT="0" distB="0" distL="114300" distR="114300" simplePos="0" relativeHeight="251667456" behindDoc="0" locked="0" layoutInCell="1" allowOverlap="1" wp14:anchorId="065036AF" wp14:editId="6C33F450">
+              <wp:anchor distT="0" distB="0" distL="114300" distR="114300" simplePos="0" relativeHeight="251666944" behindDoc="0" locked="0" layoutInCell="1" allowOverlap="1" wp14:anchorId="065036AF" wp14:editId="6C33F450">
                 <wp:simplePos x="0" y="0"/>
                 <wp:positionH relativeFrom="margin">
                   <wp:posOffset>396240</wp:posOffset>
@@ -11499,7 +12665,7 @@
           </mc:Choice>
           <mc:Fallback>
             <w:pict>
-              <v:rect w14:anchorId="065036AF" id="_x0000_s1036" style="position:absolute;left:0;text-align:left;margin-left:31.2pt;margin-top:6.4pt;width:451.4pt;height:34.2pt;z-index:251667456;visibility:visible;mso-wrap-style:square;mso-width-percent:0;mso-height-percent:0;mso-wrap-distance-left:9pt;mso-wrap-distance-top:0;mso-wrap-distance-right:9pt;mso-wrap-distance-bottom:0;mso-position-horizontal:absolute;mso-position-horizontal-relative:margin;mso-position-vertical:absolute;mso-position-vertical-relative:text;mso-width-percent:0;mso-height-percent:0;mso-width-relative:margin;mso-height-relative:margin;v-text-anchor:middle" o:gfxdata="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" fillcolor="black [3213]" strokecolor="black [3213]" strokeweight="2pt">
+              <v:rect w14:anchorId="065036AF" id="_x0000_s1035" style="position:absolute;left:0;text-align:left;margin-left:31.2pt;margin-top:6.4pt;width:451.4pt;height:34.2pt;z-index:251666944;visibility:visible;mso-wrap-style:square;mso-width-percent:0;mso-height-percent:0;mso-wrap-distance-left:9pt;mso-wrap-distance-top:0;mso-wrap-distance-right:9pt;mso-wrap-distance-bottom:0;mso-position-horizontal:absolute;mso-position-horizontal-relative:margin;mso-position-vertical:absolute;mso-position-vertical-relative:text;mso-width-percent:0;mso-height-percent:0;mso-width-relative:margin;mso-height-relative:margin;v-text-anchor:middle" o:gfxdata="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" fillcolor="black [3213]" strokecolor="black [3213]" strokeweight="2pt">
                 <v:textbox>
                   <w:txbxContent>
                     <w:p>
@@ -11601,7 +12767,7 @@
         <w:lastRenderedPageBreak/>
         <w:tab/>
       </w:r>
-      <w:bookmarkStart w:id="22" w:name="_Toc234312462"/>
+      <w:bookmarkStart w:id="22" w:name="_Toc235059757"/>
       <w:proofErr w:type="gramStart"/>
       <w:r>
         <w:rPr>
@@ -11883,7 +13049,35 @@
         <w:rPr>
           <w:lang w:val="es-ES"/>
         </w:rPr>
-        <w:t>No uses bucles for para agrupar manualmente. Todo debe resolverse con Collectors.groupingBy().</w:t>
+        <w:t xml:space="preserve">No uses bucles </w:t>
+      </w:r>
+      <w:proofErr w:type="spellStart"/>
+      <w:r>
+        <w:rPr>
+          <w:lang w:val="es-ES"/>
+        </w:rPr>
+        <w:t>for</w:t>
+      </w:r>
+      <w:proofErr w:type="spellEnd"/>
+      <w:r>
+        <w:rPr>
+          <w:lang w:val="es-ES"/>
+        </w:rPr>
+        <w:t xml:space="preserve"> para agrupar manualmente. Todo debe resolverse con </w:t>
+      </w:r>
+      <w:proofErr w:type="spellStart"/>
+      <w:r>
+        <w:rPr>
+          <w:lang w:val="es-ES"/>
+        </w:rPr>
+        <w:t>Collectors.groupingBy</w:t>
+      </w:r>
+      <w:proofErr w:type="spellEnd"/>
+      <w:r>
+        <w:rPr>
+          <w:lang w:val="es-ES"/>
+        </w:rPr>
+        <w:t>().</w:t>
       </w:r>
     </w:p>
     <w:p>
@@ -12181,7 +13375,7 @@
         <mc:AlternateContent>
           <mc:Choice Requires="wps">
             <w:drawing>
-              <wp:anchor distT="0" distB="0" distL="114300" distR="114300" simplePos="0" relativeHeight="251669504" behindDoc="0" locked="0" layoutInCell="1" allowOverlap="1" wp14:anchorId="3C6DF592" wp14:editId="6172C026">
+              <wp:anchor distT="0" distB="0" distL="114300" distR="114300" simplePos="0" relativeHeight="251668992" behindDoc="0" locked="0" layoutInCell="1" allowOverlap="1" wp14:anchorId="3C6DF592" wp14:editId="6172C026">
                 <wp:simplePos x="0" y="0"/>
                 <wp:positionH relativeFrom="margin">
                   <wp:posOffset>396240</wp:posOffset>
@@ -12271,7 +13465,7 @@
           </mc:Choice>
           <mc:Fallback>
             <w:pict>
-              <v:rect w14:anchorId="3C6DF592" id="_x0000_s1037" style="position:absolute;left:0;text-align:left;margin-left:31.2pt;margin-top:6.4pt;width:451.4pt;height:34.2pt;z-index:251669504;visibility:visible;mso-wrap-style:square;mso-width-percent:0;mso-height-percent:0;mso-wrap-distance-left:9pt;mso-wrap-distance-top:0;mso-wrap-distance-right:9pt;mso-wrap-distance-bottom:0;mso-position-horizontal:absolute;mso-position-horizontal-relative:margin;mso-position-vertical:absolute;mso-position-vertical-relative:text;mso-width-percent:0;mso-height-percent:0;mso-width-relative:margin;mso-height-relative:margin;v-text-anchor:middle" o:gfxdata="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" fillcolor="black [3213]" strokecolor="black [3213]" strokeweight="2pt">
+              <v:rect w14:anchorId="3C6DF592" id="_x0000_s1036" style="position:absolute;left:0;text-align:left;margin-left:31.2pt;margin-top:6.4pt;width:451.4pt;height:34.2pt;z-index:251668992;visibility:visible;mso-wrap-style:square;mso-width-percent:0;mso-height-percent:0;mso-wrap-distance-left:9pt;mso-wrap-distance-top:0;mso-wrap-distance-right:9pt;mso-wrap-distance-bottom:0;mso-position-horizontal:absolute;mso-position-horizontal-relative:margin;mso-position-vertical:absolute;mso-position-vertical-relative:text;mso-width-percent:0;mso-height-percent:0;mso-width-relative:margin;mso-height-relative:margin;v-text-anchor:middle" o:gfxdata="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" fillcolor="black [3213]" strokecolor="black [3213]" strokeweight="2pt">
                 <v:textbox>
                   <w:txbxContent>
                     <w:p>
@@ -12335,7 +13529,7 @@
         <w:lastRenderedPageBreak/>
         <w:tab/>
       </w:r>
-      <w:bookmarkStart w:id="23" w:name="_Toc234312463"/>
+      <w:bookmarkStart w:id="23" w:name="_Toc235059758"/>
       <w:proofErr w:type="gramStart"/>
       <w:r>
         <w:rPr>
@@ -12819,7 +14013,7 @@
         <mc:AlternateContent>
           <mc:Choice Requires="wps">
             <w:drawing>
-              <wp:anchor distT="0" distB="0" distL="114300" distR="114300" simplePos="0" relativeHeight="251671552" behindDoc="0" locked="0" layoutInCell="1" allowOverlap="1" wp14:anchorId="0D64C913" wp14:editId="74F5A70D">
+              <wp:anchor distT="0" distB="0" distL="114300" distR="114300" simplePos="0" relativeHeight="251671040" behindDoc="0" locked="0" layoutInCell="1" allowOverlap="1" wp14:anchorId="0D64C913" wp14:editId="74F5A70D">
                 <wp:simplePos x="0" y="0"/>
                 <wp:positionH relativeFrom="margin">
                   <wp:posOffset>396240</wp:posOffset>
@@ -12921,7 +14115,7 @@
           </mc:Choice>
           <mc:Fallback>
             <w:pict>
-              <v:rect w14:anchorId="0D64C913" id="_x0000_s1038" style="position:absolute;left:0;text-align:left;margin-left:31.2pt;margin-top:6.3pt;width:451.4pt;height:42pt;z-index:251671552;visibility:visible;mso-wrap-style:square;mso-width-percent:0;mso-height-percent:0;mso-wrap-distance-left:9pt;mso-wrap-distance-top:0;mso-wrap-distance-right:9pt;mso-wrap-distance-bottom:0;mso-position-horizontal:absolute;mso-position-horizontal-relative:margin;mso-position-vertical:absolute;mso-position-vertical-relative:text;mso-width-percent:0;mso-height-percent:0;mso-width-relative:margin;mso-height-relative:margin;v-text-anchor:middle" o:gfxdata="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" fillcolor="black [3213]" strokecolor="black [3213]" strokeweight="2pt">
+              <v:rect w14:anchorId="0D64C913" id="_x0000_s1037" style="position:absolute;left:0;text-align:left;margin-left:31.2pt;margin-top:6.3pt;width:451.4pt;height:42pt;z-index:251671040;visibility:visible;mso-wrap-style:square;mso-width-percent:0;mso-height-percent:0;mso-wrap-distance-left:9pt;mso-wrap-distance-top:0;mso-wrap-distance-right:9pt;mso-wrap-distance-bottom:0;mso-position-horizontal:absolute;mso-position-horizontal-relative:margin;mso-position-vertical:absolute;mso-position-vertical-relative:text;mso-width-percent:0;mso-height-percent:0;mso-width-relative:margin;mso-height-relative:margin;v-text-anchor:middle" o:gfxdata="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" fillcolor="black [3213]" strokecolor="black [3213]" strokeweight="2pt">
                 <v:textbox>
                   <w:txbxContent>
                     <w:p>
@@ -13012,7 +14206,7 @@
         <w:lastRenderedPageBreak/>
         <w:tab/>
       </w:r>
-      <w:bookmarkStart w:id="24" w:name="_Toc234312464"/>
+      <w:bookmarkStart w:id="24" w:name="_Toc235059759"/>
       <w:r>
         <w:rPr>
           <w:w w:val="90"/>
@@ -13671,7 +14865,7 @@
         <mc:AlternateContent>
           <mc:Choice Requires="wps">
             <w:drawing>
-              <wp:anchor distT="0" distB="0" distL="114300" distR="114300" simplePos="0" relativeHeight="251673600" behindDoc="0" locked="0" layoutInCell="1" allowOverlap="1" wp14:anchorId="093E9505" wp14:editId="6891E0A3">
+              <wp:anchor distT="0" distB="0" distL="114300" distR="114300" simplePos="0" relativeHeight="251673088" behindDoc="0" locked="0" layoutInCell="1" allowOverlap="1" wp14:anchorId="093E9505" wp14:editId="6891E0A3">
                 <wp:simplePos x="0" y="0"/>
                 <wp:positionH relativeFrom="margin">
                   <wp:posOffset>396240</wp:posOffset>
@@ -13787,7 +14981,7 @@
           </mc:Choice>
           <mc:Fallback>
             <w:pict>
-              <v:rect w14:anchorId="093E9505" id="_x0000_s1039" style="position:absolute;left:0;text-align:left;margin-left:31.2pt;margin-top:6.05pt;width:451.4pt;height:67.8pt;z-index:251673600;visibility:visible;mso-wrap-style:square;mso-width-percent:0;mso-height-percent:0;mso-wrap-distance-left:9pt;mso-wrap-distance-top:0;mso-wrap-distance-right:9pt;mso-wrap-distance-bottom:0;mso-position-horizontal:absolute;mso-position-horizontal-relative:margin;mso-position-vertical:absolute;mso-position-vertical-relative:text;mso-width-percent:0;mso-height-percent:0;mso-width-relative:margin;mso-height-relative:margin;v-text-anchor:middle" o:gfxdata="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" fillcolor="black [3213]" strokecolor="black [3213]" strokeweight="2pt">
+              <v:rect w14:anchorId="093E9505" id="_x0000_s1038" style="position:absolute;left:0;text-align:left;margin-left:31.2pt;margin-top:6.05pt;width:451.4pt;height:67.8pt;z-index:251673088;visibility:visible;mso-wrap-style:square;mso-width-percent:0;mso-height-percent:0;mso-wrap-distance-left:9pt;mso-wrap-distance-top:0;mso-wrap-distance-right:9pt;mso-wrap-distance-bottom:0;mso-position-horizontal:absolute;mso-position-horizontal-relative:margin;mso-position-vertical:absolute;mso-position-vertical-relative:text;mso-width-percent:0;mso-height-percent:0;mso-width-relative:margin;mso-height-relative:margin;v-text-anchor:middle" o:gfxdata="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" fillcolor="black [3213]" strokecolor="black [3213]" strokeweight="2pt">
                 <v:textbox>
                   <w:txbxContent>
                     <w:p>
@@ -13855,34 +15049,12 @@
         <w:tabs>
           <w:tab w:val="left" w:pos="4356"/>
         </w:tabs>
-      </w:pPr>
-    </w:p>
-    <w:p>
-      <w:pPr>
-        <w:tabs>
-          <w:tab w:val="left" w:pos="4356"/>
-        </w:tabs>
         <w:sectPr>
           <w:pgSz w:w="12240" w:h="15840"/>
           <w:pgMar w:top="1340" w:right="720" w:bottom="1360" w:left="1080" w:header="0" w:footer="1165" w:gutter="0"/>
           <w:cols w:space="720"/>
         </w:sectPr>
       </w:pPr>
-      <w:r>
-        <w:tab/>
-      </w:r>
-    </w:p>
-    <w:p>
-      <w:pPr>
-        <w:tabs>
-          <w:tab w:val="left" w:pos="4356"/>
-        </w:tabs>
-        <w:sectPr>
-          <w:pgSz w:w="12240" w:h="15840"/>
-          <w:pgMar w:top="1340" w:right="720" w:bottom="1360" w:left="1080" w:header="0" w:footer="1165" w:gutter="0"/>
-          <w:cols w:space="720"/>
-        </w:sectPr>
-      </w:pPr>
     </w:p>
     <w:p>
       <w:pPr>
@@ -13890,7 +15062,7 @@
         <w:ind w:left="0" w:firstLine="622"/>
       </w:pPr>
       <w:bookmarkStart w:id="25" w:name="_bookmark11"/>
-      <w:bookmarkStart w:id="26" w:name="_Toc234312465"/>
+      <w:bookmarkStart w:id="26" w:name="_Toc235059760"/>
       <w:bookmarkEnd w:id="25"/>
       <w:r>
         <w:lastRenderedPageBreak/>
@@ -14886,7 +16058,7 @@
               <v:stroke joinstyle="miter"/>
               <v:path gradientshapeok="t" o:connecttype="rect"/>
             </v:shapetype>
-            <v:shape id="Textbox 1" o:spid="_x0000_s1040" type="#_x0000_t202" style="position:absolute;margin-left:543.95pt;margin-top:723.9pt;width:14.5pt;height:19.15pt;z-index:-16070656;visibility:visible;mso-wrap-style:square;mso-wrap-distance-left:0;mso-wrap-distance-top:0;mso-wrap-distance-right:0;mso-wrap-distance-bottom:0;mso-position-horizontal:absolute;mso-position-horizontal-relative:page;mso-position-vertical:absolute;mso-position-vertical-relative:page;v-text-anchor:top" o:gfxdata="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" filled="f" stroked="f">
+            <v:shape id="Textbox 1" o:spid="_x0000_s1039" type="#_x0000_t202" style="position:absolute;margin-left:543.95pt;margin-top:723.9pt;width:14.5pt;height:19.15pt;z-index:-16070656;visibility:visible;mso-wrap-style:square;mso-wrap-distance-left:0;mso-wrap-distance-top:0;mso-wrap-distance-right:0;mso-wrap-distance-bottom:0;mso-position-horizontal:absolute;mso-position-horizontal-relative:page;mso-position-vertical:absolute;mso-position-vertical-relative:page;v-text-anchor:top" o:gfxdata="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" filled="f" stroked="f">
               <v:textbox inset="0,0,0,0">
                 <w:txbxContent>
                   <w:p>
@@ -15048,7 +16220,7 @@
         </mc:Choice>
         <mc:Fallback>
           <w:pict>
-            <v:shape w14:anchorId="3E36AA15" id="Graphic 4" o:spid="_x0000_s1026" style="position:absolute;margin-left:86.45pt;margin-top:719.75pt;width:476.5pt;height:25.2pt;z-index:-251660288;visibility:visible;mso-wrap-style:square;mso-wrap-distance-left:0;mso-wrap-distance-top:0;mso-wrap-distance-right:0;mso-wrap-distance-bottom:0;mso-position-horizontal:absolute;mso-position-horizontal-relative:page;mso-position-vertical:absolute;mso-position-vertical-relative:page;v-text-anchor:top" coordsize="6051550,320040" o:gfxdata="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" path="m6051397,l5594197,,,12,,18605r5594197,l5594197,320040r457200,l6051397,xe" fillcolor="black" stroked="f">
+            <v:shape w14:anchorId="366A8BA6" id="Graphic 4" o:spid="_x0000_s1026" style="position:absolute;margin-left:86.45pt;margin-top:719.75pt;width:476.5pt;height:25.2pt;z-index:-251660288;visibility:visible;mso-wrap-style:square;mso-wrap-distance-left:0;mso-wrap-distance-top:0;mso-wrap-distance-right:0;mso-wrap-distance-bottom:0;mso-position-horizontal:absolute;mso-position-horizontal-relative:page;mso-position-vertical:absolute;mso-position-vertical-relative:page;v-text-anchor:top" coordsize="6051550,320040" o:gfxdata="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" path="m6051397,l5594197,,,12,,18605r5594197,l5594197,320040r457200,l6051397,xe" fillcolor="black" stroked="f">
               <v:path arrowok="t"/>
               <w10:wrap anchorx="page" anchory="page"/>
             </v:shape>
@@ -15162,7 +16334,7 @@
               <v:stroke joinstyle="miter"/>
               <v:path gradientshapeok="t" o:connecttype="rect"/>
             </v:shapetype>
-            <v:shape id="Textbox 5" o:spid="_x0000_s1041" type="#_x0000_t202" style="position:absolute;margin-left:538.4pt;margin-top:723.9pt;width:19.9pt;height:19.15pt;z-index:-251658240;visibility:visible;mso-wrap-style:square;mso-wrap-distance-left:0;mso-wrap-distance-top:0;mso-wrap-distance-right:0;mso-wrap-distance-bottom:0;mso-position-horizontal:absolute;mso-position-horizontal-relative:page;mso-position-vertical:absolute;mso-position-vertical-relative:page;v-text-anchor:top" o:gfxdata="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" filled="f" stroked="f">
+            <v:shape id="Textbox 5" o:spid="_x0000_s1040" type="#_x0000_t202" style="position:absolute;margin-left:538.4pt;margin-top:723.9pt;width:19.9pt;height:19.15pt;z-index:-251658240;visibility:visible;mso-wrap-style:square;mso-wrap-distance-left:0;mso-wrap-distance-top:0;mso-wrap-distance-right:0;mso-wrap-distance-bottom:0;mso-position-horizontal:absolute;mso-position-horizontal-relative:page;mso-position-vertical:absolute;mso-position-vertical-relative:page;v-text-anchor:top" o:gfxdata="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" filled="f" stroked="f">
               <v:textbox inset="0,0,0,0">
                 <w:txbxContent>
                   <w:p>
@@ -15482,6 +16654,119 @@
     </w:lvl>
   </w:abstractNum>
   <w:abstractNum w:abstractNumId="2" w15:restartNumberingAfterBreak="0">
+    <w:nsid w:val="104B4F01"/>
+    <w:multiLevelType w:val="hybridMultilevel"/>
+    <w:tmpl w:val="37DEAB3C"/>
+    <w:lvl w:ilvl="0" w:tplc="04090005">
+      <w:start w:val="1"/>
+      <w:numFmt w:val="bullet"/>
+      <w:lvlText w:val=""/>
+      <w:lvlJc w:val="left"/>
+      <w:pPr>
+        <w:ind w:left="2192" w:hanging="360"/>
+      </w:pPr>
+      <w:rPr>
+        <w:rFonts w:ascii="Wingdings" w:hAnsi="Wingdings" w:hint="default"/>
+      </w:rPr>
+    </w:lvl>
+    <w:lvl w:ilvl="1" w:tplc="04090003" w:tentative="1">
+      <w:start w:val="1"/>
+      <w:numFmt w:val="bullet"/>
+      <w:lvlText w:val="o"/>
+      <w:lvlJc w:val="left"/>
+      <w:pPr>
+        <w:ind w:left="2912" w:hanging="360"/>
+      </w:pPr>
+      <w:rPr>
+        <w:rFonts w:ascii="Courier New" w:hAnsi="Courier New" w:cs="Courier New" w:hint="default"/>
+      </w:rPr>
+    </w:lvl>
+    <w:lvl w:ilvl="2" w:tplc="04090005" w:tentative="1">
+      <w:start w:val="1"/>
+      <w:numFmt w:val="bullet"/>
+      <w:lvlText w:val=""/>
+      <w:lvlJc w:val="left"/>
+      <w:pPr>
+        <w:ind w:left="3632" w:hanging="360"/>
+      </w:pPr>
+      <w:rPr>
+        <w:rFonts w:ascii="Wingdings" w:hAnsi="Wingdings" w:hint="default"/>
+      </w:rPr>
+    </w:lvl>
+    <w:lvl w:ilvl="3" w:tplc="04090001" w:tentative="1">
+      <w:start w:val="1"/>
+      <w:numFmt w:val="bullet"/>
+      <w:lvlText w:val=""/>
+      <w:lvlJc w:val="left"/>
+      <w:pPr>
+        <w:ind w:left="4352" w:hanging="360"/>
+      </w:pPr>
+      <w:rPr>
+        <w:rFonts w:ascii="Symbol" w:hAnsi="Symbol" w:hint="default"/>
+      </w:rPr>
+    </w:lvl>
+    <w:lvl w:ilvl="4" w:tplc="04090003" w:tentative="1">
+      <w:start w:val="1"/>
+      <w:numFmt w:val="bullet"/>
+      <w:lvlText w:val="o"/>
+      <w:lvlJc w:val="left"/>
+      <w:pPr>
+        <w:ind w:left="5072" w:hanging="360"/>
+      </w:pPr>
+      <w:rPr>
+        <w:rFonts w:ascii="Courier New" w:hAnsi="Courier New" w:cs="Courier New" w:hint="default"/>
+      </w:rPr>
+    </w:lvl>
+    <w:lvl w:ilvl="5" w:tplc="04090005" w:tentative="1">
+      <w:start w:val="1"/>
+      <w:numFmt w:val="bullet"/>
+      <w:lvlText w:val=""/>
+      <w:lvlJc w:val="left"/>
+      <w:pPr>
+        <w:ind w:left="5792" w:hanging="360"/>
+      </w:pPr>
+      <w:rPr>
+        <w:rFonts w:ascii="Wingdings" w:hAnsi="Wingdings" w:hint="default"/>
+      </w:rPr>
+    </w:lvl>
+    <w:lvl w:ilvl="6" w:tplc="04090001" w:tentative="1">
+      <w:start w:val="1"/>
+      <w:numFmt w:val="bullet"/>
+      <w:lvlText w:val=""/>
+      <w:lvlJc w:val="left"/>
+      <w:pPr>
+        <w:ind w:left="6512" w:hanging="360"/>
+      </w:pPr>
+      <w:rPr>
+        <w:rFonts w:ascii="Symbol" w:hAnsi="Symbol" w:hint="default"/>
+      </w:rPr>
+    </w:lvl>
+    <w:lvl w:ilvl="7" w:tplc="04090003" w:tentative="1">
+      <w:start w:val="1"/>
+      <w:numFmt w:val="bullet"/>
+      <w:lvlText w:val="o"/>
+      <w:lvlJc w:val="left"/>
+      <w:pPr>
+        <w:ind w:left="7232" w:hanging="360"/>
+      </w:pPr>
+      <w:rPr>
+        <w:rFonts w:ascii="Courier New" w:hAnsi="Courier New" w:cs="Courier New" w:hint="default"/>
+      </w:rPr>
+    </w:lvl>
+    <w:lvl w:ilvl="8" w:tplc="04090005" w:tentative="1">
+      <w:start w:val="1"/>
+      <w:numFmt w:val="bullet"/>
+      <w:lvlText w:val=""/>
+      <w:lvlJc w:val="left"/>
+      <w:pPr>
+        <w:ind w:left="7952" w:hanging="360"/>
+      </w:pPr>
+      <w:rPr>
+        <w:rFonts w:ascii="Wingdings" w:hAnsi="Wingdings" w:hint="default"/>
+      </w:rPr>
+    </w:lvl>
+  </w:abstractNum>
+  <w:abstractNum w:abstractNumId="3" w15:restartNumberingAfterBreak="0">
     <w:nsid w:val="11325252"/>
     <w:multiLevelType w:val="hybridMultilevel"/>
     <w:tmpl w:val="C390F4C0"/>
@@ -15603,7 +16888,7 @@
       </w:rPr>
     </w:lvl>
   </w:abstractNum>
-  <w:abstractNum w:abstractNumId="3" w15:restartNumberingAfterBreak="0">
+  <w:abstractNum w:abstractNumId="4" w15:restartNumberingAfterBreak="0">
     <w:nsid w:val="119F3919"/>
     <w:multiLevelType w:val="hybridMultilevel"/>
     <w:tmpl w:val="4C34D9CA"/>
@@ -15689,7 +16974,7 @@
       </w:pPr>
     </w:lvl>
   </w:abstractNum>
-  <w:abstractNum w:abstractNumId="4" w15:restartNumberingAfterBreak="0">
+  <w:abstractNum w:abstractNumId="5" w15:restartNumberingAfterBreak="0">
     <w:nsid w:val="1520204F"/>
     <w:multiLevelType w:val="hybridMultilevel"/>
     <w:tmpl w:val="35DE1196"/>
@@ -15813,7 +17098,7 @@
       </w:rPr>
     </w:lvl>
   </w:abstractNum>
-  <w:abstractNum w:abstractNumId="5" w15:restartNumberingAfterBreak="0">
+  <w:abstractNum w:abstractNumId="6" w15:restartNumberingAfterBreak="0">
     <w:nsid w:val="16FA36DE"/>
     <w:multiLevelType w:val="hybridMultilevel"/>
     <w:tmpl w:val="630C3A36"/>
@@ -15899,7 +17184,7 @@
       </w:pPr>
     </w:lvl>
   </w:abstractNum>
-  <w:abstractNum w:abstractNumId="6" w15:restartNumberingAfterBreak="0">
+  <w:abstractNum w:abstractNumId="7" w15:restartNumberingAfterBreak="0">
     <w:nsid w:val="1A155CB2"/>
     <w:multiLevelType w:val="hybridMultilevel"/>
     <w:tmpl w:val="CD0CC9CE"/>
@@ -15985,7 +17270,7 @@
       </w:pPr>
     </w:lvl>
   </w:abstractNum>
-  <w:abstractNum w:abstractNumId="7" w15:restartNumberingAfterBreak="0">
+  <w:abstractNum w:abstractNumId="8" w15:restartNumberingAfterBreak="0">
     <w:nsid w:val="262F0258"/>
     <w:multiLevelType w:val="hybridMultilevel"/>
     <w:tmpl w:val="93A0F5D6"/>
@@ -16115,7 +17400,7 @@
       </w:rPr>
     </w:lvl>
   </w:abstractNum>
-  <w:abstractNum w:abstractNumId="8" w15:restartNumberingAfterBreak="0">
+  <w:abstractNum w:abstractNumId="9" w15:restartNumberingAfterBreak="0">
     <w:nsid w:val="332315B1"/>
     <w:multiLevelType w:val="hybridMultilevel"/>
     <w:tmpl w:val="81681AB6"/>
@@ -16201,7 +17486,269 @@
       </w:pPr>
     </w:lvl>
   </w:abstractNum>
-  <w:abstractNum w:abstractNumId="9" w15:restartNumberingAfterBreak="0">
+  <w:abstractNum w:abstractNumId="10" w15:restartNumberingAfterBreak="0">
+    <w:nsid w:val="39B92D02"/>
+    <w:multiLevelType w:val="hybridMultilevel"/>
+    <w:tmpl w:val="AD24D018"/>
+    <w:lvl w:ilvl="0" w:tplc="04090005">
+      <w:start w:val="1"/>
+      <w:numFmt w:val="bullet"/>
+      <w:lvlText w:val=""/>
+      <w:lvlJc w:val="left"/>
+      <w:pPr>
+        <w:ind w:left="1342" w:hanging="360"/>
+      </w:pPr>
+      <w:rPr>
+        <w:rFonts w:ascii="Wingdings" w:hAnsi="Wingdings" w:hint="default"/>
+      </w:rPr>
+    </w:lvl>
+    <w:lvl w:ilvl="1" w:tplc="04090003" w:tentative="1">
+      <w:start w:val="1"/>
+      <w:numFmt w:val="bullet"/>
+      <w:lvlText w:val="o"/>
+      <w:lvlJc w:val="left"/>
+      <w:pPr>
+        <w:ind w:left="2062" w:hanging="360"/>
+      </w:pPr>
+      <w:rPr>
+        <w:rFonts w:ascii="Courier New" w:hAnsi="Courier New" w:cs="Courier New" w:hint="default"/>
+      </w:rPr>
+    </w:lvl>
+    <w:lvl w:ilvl="2" w:tplc="04090005" w:tentative="1">
+      <w:start w:val="1"/>
+      <w:numFmt w:val="bullet"/>
+      <w:lvlText w:val=""/>
+      <w:lvlJc w:val="left"/>
+      <w:pPr>
+        <w:ind w:left="2782" w:hanging="360"/>
+      </w:pPr>
+      <w:rPr>
+        <w:rFonts w:ascii="Wingdings" w:hAnsi="Wingdings" w:hint="default"/>
+      </w:rPr>
+    </w:lvl>
+    <w:lvl w:ilvl="3" w:tplc="04090001" w:tentative="1">
+      <w:start w:val="1"/>
+      <w:numFmt w:val="bullet"/>
+      <w:lvlText w:val=""/>
+      <w:lvlJc w:val="left"/>
+      <w:pPr>
+        <w:ind w:left="3502" w:hanging="360"/>
+      </w:pPr>
+      <w:rPr>
+        <w:rFonts w:ascii="Symbol" w:hAnsi="Symbol" w:hint="default"/>
+      </w:rPr>
+    </w:lvl>
+    <w:lvl w:ilvl="4" w:tplc="04090003" w:tentative="1">
+      <w:start w:val="1"/>
+      <w:numFmt w:val="bullet"/>
+      <w:lvlText w:val="o"/>
+      <w:lvlJc w:val="left"/>
+      <w:pPr>
+        <w:ind w:left="4222" w:hanging="360"/>
+      </w:pPr>
+      <w:rPr>
+        <w:rFonts w:ascii="Courier New" w:hAnsi="Courier New" w:cs="Courier New" w:hint="default"/>
+      </w:rPr>
+    </w:lvl>
+    <w:lvl w:ilvl="5" w:tplc="04090005" w:tentative="1">
+      <w:start w:val="1"/>
+      <w:numFmt w:val="bullet"/>
+      <w:lvlText w:val=""/>
+      <w:lvlJc w:val="left"/>
+      <w:pPr>
+        <w:ind w:left="4942" w:hanging="360"/>
+      </w:pPr>
+      <w:rPr>
+        <w:rFonts w:ascii="Wingdings" w:hAnsi="Wingdings" w:hint="default"/>
+      </w:rPr>
+    </w:lvl>
+    <w:lvl w:ilvl="6" w:tplc="04090001" w:tentative="1">
+      <w:start w:val="1"/>
+      <w:numFmt w:val="bullet"/>
+      <w:lvlText w:val=""/>
+      <w:lvlJc w:val="left"/>
+      <w:pPr>
+        <w:ind w:left="5662" w:hanging="360"/>
+      </w:pPr>
+      <w:rPr>
+        <w:rFonts w:ascii="Symbol" w:hAnsi="Symbol" w:hint="default"/>
+      </w:rPr>
+    </w:lvl>
+    <w:lvl w:ilvl="7" w:tplc="04090003" w:tentative="1">
+      <w:start w:val="1"/>
+      <w:numFmt w:val="bullet"/>
+      <w:lvlText w:val="o"/>
+      <w:lvlJc w:val="left"/>
+      <w:pPr>
+        <w:ind w:left="6382" w:hanging="360"/>
+      </w:pPr>
+      <w:rPr>
+        <w:rFonts w:ascii="Courier New" w:hAnsi="Courier New" w:cs="Courier New" w:hint="default"/>
+      </w:rPr>
+    </w:lvl>
+    <w:lvl w:ilvl="8" w:tplc="04090005" w:tentative="1">
+      <w:start w:val="1"/>
+      <w:numFmt w:val="bullet"/>
+      <w:lvlText w:val=""/>
+      <w:lvlJc w:val="left"/>
+      <w:pPr>
+        <w:ind w:left="7102" w:hanging="360"/>
+      </w:pPr>
+      <w:rPr>
+        <w:rFonts w:ascii="Wingdings" w:hAnsi="Wingdings" w:hint="default"/>
+      </w:rPr>
+    </w:lvl>
+  </w:abstractNum>
+  <w:abstractNum w:abstractNumId="11" w15:restartNumberingAfterBreak="0">
+    <w:nsid w:val="3E44671B"/>
+    <w:multiLevelType w:val="multilevel"/>
+    <w:tmpl w:val="6486FDDE"/>
+    <w:lvl w:ilvl="0">
+      <w:start w:val="1"/>
+      <w:numFmt w:val="bullet"/>
+      <w:lvlText w:val=""/>
+      <w:lvlJc w:val="left"/>
+      <w:pPr>
+        <w:tabs>
+          <w:tab w:val="num" w:pos="720"/>
+        </w:tabs>
+        <w:ind w:left="720" w:hanging="360"/>
+      </w:pPr>
+      <w:rPr>
+        <w:rFonts w:ascii="Symbol" w:hAnsi="Symbol" w:hint="default"/>
+        <w:sz w:val="20"/>
+      </w:rPr>
+    </w:lvl>
+    <w:lvl w:ilvl="1" w:tentative="1">
+      <w:start w:val="1"/>
+      <w:numFmt w:val="bullet"/>
+      <w:lvlText w:val="o"/>
+      <w:lvlJc w:val="left"/>
+      <w:pPr>
+        <w:tabs>
+          <w:tab w:val="num" w:pos="1440"/>
+        </w:tabs>
+        <w:ind w:left="1440" w:hanging="360"/>
+      </w:pPr>
+      <w:rPr>
+        <w:rFonts w:ascii="Courier New" w:hAnsi="Courier New" w:hint="default"/>
+        <w:sz w:val="20"/>
+      </w:rPr>
+    </w:lvl>
+    <w:lvl w:ilvl="2" w:tentative="1">
+      <w:start w:val="1"/>
+      <w:numFmt w:val="bullet"/>
+      <w:lvlText w:val=""/>
+      <w:lvlJc w:val="left"/>
+      <w:pPr>
+        <w:tabs>
+          <w:tab w:val="num" w:pos="2160"/>
+        </w:tabs>
+        <w:ind w:left="2160" w:hanging="360"/>
+      </w:pPr>
+      <w:rPr>
+        <w:rFonts w:ascii="Wingdings" w:hAnsi="Wingdings" w:hint="default"/>
+        <w:sz w:val="20"/>
+      </w:rPr>
+    </w:lvl>
+    <w:lvl w:ilvl="3" w:tentative="1">
+      <w:start w:val="1"/>
+      <w:numFmt w:val="bullet"/>
+      <w:lvlText w:val=""/>
+      <w:lvlJc w:val="left"/>
+      <w:pPr>
+        <w:tabs>
+          <w:tab w:val="num" w:pos="2880"/>
+        </w:tabs>
+        <w:ind w:left="2880" w:hanging="360"/>
+      </w:pPr>
+      <w:rPr>
+        <w:rFonts w:ascii="Wingdings" w:hAnsi="Wingdings" w:hint="default"/>
+        <w:sz w:val="20"/>
+      </w:rPr>
+    </w:lvl>
+    <w:lvl w:ilvl="4" w:tentative="1">
+      <w:start w:val="1"/>
+      <w:numFmt w:val="bullet"/>
+      <w:lvlText w:val=""/>
+      <w:lvlJc w:val="left"/>
+      <w:pPr>
+        <w:tabs>
+          <w:tab w:val="num" w:pos="3600"/>
+        </w:tabs>
+        <w:ind w:left="3600" w:hanging="360"/>
+      </w:pPr>
+      <w:rPr>
+        <w:rFonts w:ascii="Wingdings" w:hAnsi="Wingdings" w:hint="default"/>
+        <w:sz w:val="20"/>
+      </w:rPr>
+    </w:lvl>
+    <w:lvl w:ilvl="5" w:tentative="1">
+      <w:start w:val="1"/>
+      <w:numFmt w:val="bullet"/>
+      <w:lvlText w:val=""/>
+      <w:lvlJc w:val="left"/>
+      <w:pPr>
+        <w:tabs>
+          <w:tab w:val="num" w:pos="4320"/>
+        </w:tabs>
+        <w:ind w:left="4320" w:hanging="360"/>
+      </w:pPr>
+      <w:rPr>
+        <w:rFonts w:ascii="Wingdings" w:hAnsi="Wingdings" w:hint="default"/>
+        <w:sz w:val="20"/>
+      </w:rPr>
+    </w:lvl>
+    <w:lvl w:ilvl="6" w:tentative="1">
+      <w:start w:val="1"/>
+      <w:numFmt w:val="bullet"/>
+      <w:lvlText w:val=""/>
+      <w:lvlJc w:val="left"/>
+      <w:pPr>
+        <w:tabs>
+          <w:tab w:val="num" w:pos="5040"/>
+        </w:tabs>
+        <w:ind w:left="5040" w:hanging="360"/>
+      </w:pPr>
+      <w:rPr>
+        <w:rFonts w:ascii="Wingdings" w:hAnsi="Wingdings" w:hint="default"/>
+        <w:sz w:val="20"/>
+      </w:rPr>
+    </w:lvl>
+    <w:lvl w:ilvl="7" w:tentative="1">
+      <w:start w:val="1"/>
+      <w:numFmt w:val="bullet"/>
+      <w:lvlText w:val=""/>
+      <w:lvlJc w:val="left"/>
+      <w:pPr>
+        <w:tabs>
+          <w:tab w:val="num" w:pos="5760"/>
+        </w:tabs>
+        <w:ind w:left="5760" w:hanging="360"/>
+      </w:pPr>
+      <w:rPr>
+        <w:rFonts w:ascii="Wingdings" w:hAnsi="Wingdings" w:hint="default"/>
+        <w:sz w:val="20"/>
+      </w:rPr>
+    </w:lvl>
+    <w:lvl w:ilvl="8" w:tentative="1">
+      <w:start w:val="1"/>
+      <w:numFmt w:val="bullet"/>
+      <w:lvlText w:val=""/>
+      <w:lvlJc w:val="left"/>
+      <w:pPr>
+        <w:tabs>
+          <w:tab w:val="num" w:pos="6480"/>
+        </w:tabs>
+        <w:ind w:left="6480" w:hanging="360"/>
+      </w:pPr>
+      <w:rPr>
+        <w:rFonts w:ascii="Wingdings" w:hAnsi="Wingdings" w:hint="default"/>
+        <w:sz w:val="20"/>
+      </w:rPr>
+    </w:lvl>
+  </w:abstractNum>
+  <w:abstractNum w:abstractNumId="12" w15:restartNumberingAfterBreak="0">
     <w:nsid w:val="3F5735EE"/>
     <w:multiLevelType w:val="hybridMultilevel"/>
     <w:tmpl w:val="60262610"/>
@@ -16322,7 +17869,7 @@
       </w:rPr>
     </w:lvl>
   </w:abstractNum>
-  <w:abstractNum w:abstractNumId="10" w15:restartNumberingAfterBreak="0">
+  <w:abstractNum w:abstractNumId="13" w15:restartNumberingAfterBreak="0">
     <w:nsid w:val="45760E59"/>
     <w:multiLevelType w:val="hybridMultilevel"/>
     <w:tmpl w:val="34E8F56E"/>
@@ -16444,7 +17991,124 @@
       </w:rPr>
     </w:lvl>
   </w:abstractNum>
-  <w:abstractNum w:abstractNumId="11" w15:restartNumberingAfterBreak="0">
+  <w:abstractNum w:abstractNumId="14" w15:restartNumberingAfterBreak="0">
+    <w:nsid w:val="487861E0"/>
+    <w:multiLevelType w:val="multilevel"/>
+    <w:tmpl w:val="3E5487CE"/>
+    <w:lvl w:ilvl="0">
+      <w:start w:val="1"/>
+      <w:numFmt w:val="decimal"/>
+      <w:lvlText w:val="%1."/>
+      <w:lvlJc w:val="left"/>
+      <w:pPr>
+        <w:tabs>
+          <w:tab w:val="num" w:pos="720"/>
+        </w:tabs>
+        <w:ind w:left="720" w:hanging="360"/>
+      </w:pPr>
+    </w:lvl>
+    <w:lvl w:ilvl="1">
+      <w:start w:val="1"/>
+      <w:numFmt w:val="bullet"/>
+      <w:lvlText w:val="o"/>
+      <w:lvlJc w:val="left"/>
+      <w:pPr>
+        <w:tabs>
+          <w:tab w:val="num" w:pos="1440"/>
+        </w:tabs>
+        <w:ind w:left="1440" w:hanging="360"/>
+      </w:pPr>
+      <w:rPr>
+        <w:rFonts w:ascii="Courier New" w:hAnsi="Courier New" w:hint="default"/>
+        <w:sz w:val="20"/>
+      </w:rPr>
+    </w:lvl>
+    <w:lvl w:ilvl="2" w:tentative="1">
+      <w:start w:val="1"/>
+      <w:numFmt w:val="decimal"/>
+      <w:lvlText w:val="%3."/>
+      <w:lvlJc w:val="left"/>
+      <w:pPr>
+        <w:tabs>
+          <w:tab w:val="num" w:pos="2160"/>
+        </w:tabs>
+        <w:ind w:left="2160" w:hanging="360"/>
+      </w:pPr>
+    </w:lvl>
+    <w:lvl w:ilvl="3" w:tentative="1">
+      <w:start w:val="1"/>
+      <w:numFmt w:val="decimal"/>
+      <w:lvlText w:val="%4."/>
+      <w:lvlJc w:val="left"/>
+      <w:pPr>
+        <w:tabs>
+          <w:tab w:val="num" w:pos="2880"/>
+        </w:tabs>
+        <w:ind w:left="2880" w:hanging="360"/>
+      </w:pPr>
+    </w:lvl>
+    <w:lvl w:ilvl="4" w:tentative="1">
+      <w:start w:val="1"/>
+      <w:numFmt w:val="decimal"/>
+      <w:lvlText w:val="%5."/>
+      <w:lvlJc w:val="left"/>
+      <w:pPr>
+        <w:tabs>
+          <w:tab w:val="num" w:pos="3600"/>
+        </w:tabs>
+        <w:ind w:left="3600" w:hanging="360"/>
+      </w:pPr>
+    </w:lvl>
+    <w:lvl w:ilvl="5" w:tentative="1">
+      <w:start w:val="1"/>
+      <w:numFmt w:val="decimal"/>
+      <w:lvlText w:val="%6."/>
+      <w:lvlJc w:val="left"/>
+      <w:pPr>
+        <w:tabs>
+          <w:tab w:val="num" w:pos="4320"/>
+        </w:tabs>
+        <w:ind w:left="4320" w:hanging="360"/>
+      </w:pPr>
+    </w:lvl>
+    <w:lvl w:ilvl="6" w:tentative="1">
+      <w:start w:val="1"/>
+      <w:numFmt w:val="decimal"/>
+      <w:lvlText w:val="%7."/>
+      <w:lvlJc w:val="left"/>
+      <w:pPr>
+        <w:tabs>
+          <w:tab w:val="num" w:pos="5040"/>
+        </w:tabs>
+        <w:ind w:left="5040" w:hanging="360"/>
+      </w:pPr>
+    </w:lvl>
+    <w:lvl w:ilvl="7" w:tentative="1">
+      <w:start w:val="1"/>
+      <w:numFmt w:val="decimal"/>
+      <w:lvlText w:val="%8."/>
+      <w:lvlJc w:val="left"/>
+      <w:pPr>
+        <w:tabs>
+          <w:tab w:val="num" w:pos="5760"/>
+        </w:tabs>
+        <w:ind w:left="5760" w:hanging="360"/>
+      </w:pPr>
+    </w:lvl>
+    <w:lvl w:ilvl="8" w:tentative="1">
+      <w:start w:val="1"/>
+      <w:numFmt w:val="decimal"/>
+      <w:lvlText w:val="%9."/>
+      <w:lvlJc w:val="left"/>
+      <w:pPr>
+        <w:tabs>
+          <w:tab w:val="num" w:pos="6480"/>
+        </w:tabs>
+        <w:ind w:left="6480" w:hanging="360"/>
+      </w:pPr>
+    </w:lvl>
+  </w:abstractNum>
+  <w:abstractNum w:abstractNumId="15" w15:restartNumberingAfterBreak="0">
     <w:nsid w:val="4FCC1037"/>
     <w:multiLevelType w:val="hybridMultilevel"/>
     <w:tmpl w:val="630C3A36"/>
@@ -16530,7 +18194,7 @@
       </w:pPr>
     </w:lvl>
   </w:abstractNum>
-  <w:abstractNum w:abstractNumId="12" w15:restartNumberingAfterBreak="0">
+  <w:abstractNum w:abstractNumId="16" w15:restartNumberingAfterBreak="0">
     <w:nsid w:val="509949AD"/>
     <w:multiLevelType w:val="hybridMultilevel"/>
     <w:tmpl w:val="869A34F6"/>
@@ -16652,7 +18316,7 @@
       </w:rPr>
     </w:lvl>
   </w:abstractNum>
-  <w:abstractNum w:abstractNumId="13" w15:restartNumberingAfterBreak="0">
+  <w:abstractNum w:abstractNumId="17" w15:restartNumberingAfterBreak="0">
     <w:nsid w:val="51532487"/>
     <w:multiLevelType w:val="hybridMultilevel"/>
     <w:tmpl w:val="091A9E32"/>
@@ -16765,7 +18429,7 @@
       </w:rPr>
     </w:lvl>
   </w:abstractNum>
-  <w:abstractNum w:abstractNumId="14" w15:restartNumberingAfterBreak="0">
+  <w:abstractNum w:abstractNumId="18" w15:restartNumberingAfterBreak="0">
     <w:nsid w:val="55E443F3"/>
     <w:multiLevelType w:val="hybridMultilevel"/>
     <w:tmpl w:val="A368740C"/>
@@ -16886,7 +18550,7 @@
       </w:rPr>
     </w:lvl>
   </w:abstractNum>
-  <w:abstractNum w:abstractNumId="15" w15:restartNumberingAfterBreak="0">
+  <w:abstractNum w:abstractNumId="19" w15:restartNumberingAfterBreak="0">
     <w:nsid w:val="587379EE"/>
     <w:multiLevelType w:val="hybridMultilevel"/>
     <w:tmpl w:val="CDD272CC"/>
@@ -17008,7 +18672,7 @@
       </w:rPr>
     </w:lvl>
   </w:abstractNum>
-  <w:abstractNum w:abstractNumId="16" w15:restartNumberingAfterBreak="0">
+  <w:abstractNum w:abstractNumId="20" w15:restartNumberingAfterBreak="0">
     <w:nsid w:val="58992AD0"/>
     <w:multiLevelType w:val="hybridMultilevel"/>
     <w:tmpl w:val="4364D14C"/>
@@ -17130,7 +18794,7 @@
       </w:rPr>
     </w:lvl>
   </w:abstractNum>
-  <w:abstractNum w:abstractNumId="17" w15:restartNumberingAfterBreak="0">
+  <w:abstractNum w:abstractNumId="21" w15:restartNumberingAfterBreak="0">
     <w:nsid w:val="65FB255D"/>
     <w:multiLevelType w:val="hybridMultilevel"/>
     <w:tmpl w:val="2FEA6B80"/>
@@ -17251,7 +18915,7 @@
       </w:rPr>
     </w:lvl>
   </w:abstractNum>
-  <w:abstractNum w:abstractNumId="18" w15:restartNumberingAfterBreak="0">
+  <w:abstractNum w:abstractNumId="22" w15:restartNumberingAfterBreak="0">
     <w:nsid w:val="69AB03C5"/>
     <w:multiLevelType w:val="hybridMultilevel"/>
     <w:tmpl w:val="8E9EAC3E"/>
@@ -17374,7 +19038,156 @@
       </w:rPr>
     </w:lvl>
   </w:abstractNum>
-  <w:abstractNum w:abstractNumId="19" w15:restartNumberingAfterBreak="0">
+  <w:abstractNum w:abstractNumId="23" w15:restartNumberingAfterBreak="0">
+    <w:nsid w:val="6D21594F"/>
+    <w:multiLevelType w:val="multilevel"/>
+    <w:tmpl w:val="0EF08760"/>
+    <w:lvl w:ilvl="0">
+      <w:start w:val="1"/>
+      <w:numFmt w:val="bullet"/>
+      <w:lvlText w:val=""/>
+      <w:lvlJc w:val="left"/>
+      <w:pPr>
+        <w:tabs>
+          <w:tab w:val="num" w:pos="1080"/>
+        </w:tabs>
+        <w:ind w:left="1080" w:hanging="360"/>
+      </w:pPr>
+      <w:rPr>
+        <w:rFonts w:ascii="Symbol" w:hAnsi="Symbol" w:hint="default"/>
+        <w:sz w:val="20"/>
+      </w:rPr>
+    </w:lvl>
+    <w:lvl w:ilvl="1" w:tentative="1">
+      <w:start w:val="1"/>
+      <w:numFmt w:val="bullet"/>
+      <w:lvlText w:val="o"/>
+      <w:lvlJc w:val="left"/>
+      <w:pPr>
+        <w:tabs>
+          <w:tab w:val="num" w:pos="1800"/>
+        </w:tabs>
+        <w:ind w:left="1800" w:hanging="360"/>
+      </w:pPr>
+      <w:rPr>
+        <w:rFonts w:ascii="Courier New" w:hAnsi="Courier New" w:hint="default"/>
+        <w:sz w:val="20"/>
+      </w:rPr>
+    </w:lvl>
+    <w:lvl w:ilvl="2" w:tentative="1">
+      <w:start w:val="1"/>
+      <w:numFmt w:val="bullet"/>
+      <w:lvlText w:val=""/>
+      <w:lvlJc w:val="left"/>
+      <w:pPr>
+        <w:tabs>
+          <w:tab w:val="num" w:pos="2520"/>
+        </w:tabs>
+        <w:ind w:left="2520" w:hanging="360"/>
+      </w:pPr>
+      <w:rPr>
+        <w:rFonts w:ascii="Wingdings" w:hAnsi="Wingdings" w:hint="default"/>
+        <w:sz w:val="20"/>
+      </w:rPr>
+    </w:lvl>
+    <w:lvl w:ilvl="3" w:tentative="1">
+      <w:start w:val="1"/>
+      <w:numFmt w:val="bullet"/>
+      <w:lvlText w:val=""/>
+      <w:lvlJc w:val="left"/>
+      <w:pPr>
+        <w:tabs>
+          <w:tab w:val="num" w:pos="3240"/>
+        </w:tabs>
+        <w:ind w:left="3240" w:hanging="360"/>
+      </w:pPr>
+      <w:rPr>
+        <w:rFonts w:ascii="Wingdings" w:hAnsi="Wingdings" w:hint="default"/>
+        <w:sz w:val="20"/>
+      </w:rPr>
+    </w:lvl>
+    <w:lvl w:ilvl="4" w:tentative="1">
+      <w:start w:val="1"/>
+      <w:numFmt w:val="bullet"/>
+      <w:lvlText w:val=""/>
+      <w:lvlJc w:val="left"/>
+      <w:pPr>
+        <w:tabs>
+          <w:tab w:val="num" w:pos="3960"/>
+        </w:tabs>
+        <w:ind w:left="3960" w:hanging="360"/>
+      </w:pPr>
+      <w:rPr>
+        <w:rFonts w:ascii="Wingdings" w:hAnsi="Wingdings" w:hint="default"/>
+        <w:sz w:val="20"/>
+      </w:rPr>
+    </w:lvl>
+    <w:lvl w:ilvl="5" w:tentative="1">
+      <w:start w:val="1"/>
+      <w:numFmt w:val="bullet"/>
+      <w:lvlText w:val=""/>
+      <w:lvlJc w:val="left"/>
+      <w:pPr>
+        <w:tabs>
+          <w:tab w:val="num" w:pos="4680"/>
+        </w:tabs>
+        <w:ind w:left="4680" w:hanging="360"/>
+      </w:pPr>
+      <w:rPr>
+        <w:rFonts w:ascii="Wingdings" w:hAnsi="Wingdings" w:hint="default"/>
+        <w:sz w:val="20"/>
+      </w:rPr>
+    </w:lvl>
+    <w:lvl w:ilvl="6" w:tentative="1">
+      <w:start w:val="1"/>
+      <w:numFmt w:val="bullet"/>
+      <w:lvlText w:val=""/>
+      <w:lvlJc w:val="left"/>
+      <w:pPr>
+        <w:tabs>
+          <w:tab w:val="num" w:pos="5400"/>
+        </w:tabs>
+        <w:ind w:left="5400" w:hanging="360"/>
+      </w:pPr>
+      <w:rPr>
+        <w:rFonts w:ascii="Wingdings" w:hAnsi="Wingdings" w:hint="default"/>
+        <w:sz w:val="20"/>
+      </w:rPr>
+    </w:lvl>
+    <w:lvl w:ilvl="7" w:tentative="1">
+      <w:start w:val="1"/>
+      <w:numFmt w:val="bullet"/>
+      <w:lvlText w:val=""/>
+      <w:lvlJc w:val="left"/>
+      <w:pPr>
+        <w:tabs>
+          <w:tab w:val="num" w:pos="6120"/>
+        </w:tabs>
+        <w:ind w:left="6120" w:hanging="360"/>
+      </w:pPr>
+      <w:rPr>
+        <w:rFonts w:ascii="Wingdings" w:hAnsi="Wingdings" w:hint="default"/>
+        <w:sz w:val="20"/>
+      </w:rPr>
+    </w:lvl>
+    <w:lvl w:ilvl="8" w:tentative="1">
+      <w:start w:val="1"/>
+      <w:numFmt w:val="bullet"/>
+      <w:lvlText w:val=""/>
+      <w:lvlJc w:val="left"/>
+      <w:pPr>
+        <w:tabs>
+          <w:tab w:val="num" w:pos="6840"/>
+        </w:tabs>
+        <w:ind w:left="6840" w:hanging="360"/>
+      </w:pPr>
+      <w:rPr>
+        <w:rFonts w:ascii="Wingdings" w:hAnsi="Wingdings" w:hint="default"/>
+        <w:sz w:val="20"/>
+      </w:rPr>
+    </w:lvl>
+  </w:abstractNum>
+  <w:abstractNum w:abstractNumId="24" w15:restartNumberingAfterBreak="0">
     <w:nsid w:val="6FA261BF"/>
     <w:multiLevelType w:val="hybridMultilevel"/>
     <w:tmpl w:val="A69E9478"/>
@@ -17463,7 +19276,7 @@
       </w:pPr>
     </w:lvl>
   </w:abstractNum>
-  <w:abstractNum w:abstractNumId="20" w15:restartNumberingAfterBreak="0">
+  <w:abstractNum w:abstractNumId="25" w15:restartNumberingAfterBreak="0">
     <w:nsid w:val="70D15007"/>
     <w:multiLevelType w:val="hybridMultilevel"/>
     <w:tmpl w:val="C7D0ECD8"/>
@@ -17585,7 +19398,156 @@
       </w:rPr>
     </w:lvl>
   </w:abstractNum>
-  <w:abstractNum w:abstractNumId="21" w15:restartNumberingAfterBreak="0">
+  <w:abstractNum w:abstractNumId="26" w15:restartNumberingAfterBreak="0">
+    <w:nsid w:val="726B4C75"/>
+    <w:multiLevelType w:val="multilevel"/>
+    <w:tmpl w:val="9C064106"/>
+    <w:lvl w:ilvl="0">
+      <w:start w:val="1"/>
+      <w:numFmt w:val="bullet"/>
+      <w:lvlText w:val=""/>
+      <w:lvlJc w:val="left"/>
+      <w:pPr>
+        <w:tabs>
+          <w:tab w:val="num" w:pos="1080"/>
+        </w:tabs>
+        <w:ind w:left="1080" w:hanging="360"/>
+      </w:pPr>
+      <w:rPr>
+        <w:rFonts w:ascii="Symbol" w:hAnsi="Symbol" w:hint="default"/>
+        <w:sz w:val="20"/>
+      </w:rPr>
+    </w:lvl>
+    <w:lvl w:ilvl="1" w:tentative="1">
+      <w:start w:val="1"/>
+      <w:numFmt w:val="bullet"/>
+      <w:lvlText w:val="o"/>
+      <w:lvlJc w:val="left"/>
+      <w:pPr>
+        <w:tabs>
+          <w:tab w:val="num" w:pos="1800"/>
+        </w:tabs>
+        <w:ind w:left="1800" w:hanging="360"/>
+      </w:pPr>
+      <w:rPr>
+        <w:rFonts w:ascii="Courier New" w:hAnsi="Courier New" w:hint="default"/>
+        <w:sz w:val="20"/>
+      </w:rPr>
+    </w:lvl>
+    <w:lvl w:ilvl="2" w:tentative="1">
+      <w:start w:val="1"/>
+      <w:numFmt w:val="bullet"/>
+      <w:lvlText w:val=""/>
+      <w:lvlJc w:val="left"/>
+      <w:pPr>
+        <w:tabs>
+          <w:tab w:val="num" w:pos="2520"/>
+        </w:tabs>
+        <w:ind w:left="2520" w:hanging="360"/>
+      </w:pPr>
+      <w:rPr>
+        <w:rFonts w:ascii="Wingdings" w:hAnsi="Wingdings" w:hint="default"/>
+        <w:sz w:val="20"/>
+      </w:rPr>
+    </w:lvl>
+    <w:lvl w:ilvl="3" w:tentative="1">
+      <w:start w:val="1"/>
+      <w:numFmt w:val="bullet"/>
+      <w:lvlText w:val=""/>
+      <w:lvlJc w:val="left"/>
+      <w:pPr>
+        <w:tabs>
+          <w:tab w:val="num" w:pos="3240"/>
+        </w:tabs>
+        <w:ind w:left="3240" w:hanging="360"/>
+      </w:pPr>
+      <w:rPr>
+        <w:rFonts w:ascii="Wingdings" w:hAnsi="Wingdings" w:hint="default"/>
+        <w:sz w:val="20"/>
+      </w:rPr>
+    </w:lvl>
+    <w:lvl w:ilvl="4" w:tentative="1">
+      <w:start w:val="1"/>
+      <w:numFmt w:val="bullet"/>
+      <w:lvlText w:val=""/>
+      <w:lvlJc w:val="left"/>
+      <w:pPr>
+        <w:tabs>
+          <w:tab w:val="num" w:pos="3960"/>
+        </w:tabs>
+        <w:ind w:left="3960" w:hanging="360"/>
+      </w:pPr>
+      <w:rPr>
+        <w:rFonts w:ascii="Wingdings" w:hAnsi="Wingdings" w:hint="default"/>
+        <w:sz w:val="20"/>
+      </w:rPr>
+    </w:lvl>
+    <w:lvl w:ilvl="5" w:tentative="1">
+      <w:start w:val="1"/>
+      <w:numFmt w:val="bullet"/>
+      <w:lvlText w:val=""/>
+      <w:lvlJc w:val="left"/>
+      <w:pPr>
+        <w:tabs>
+          <w:tab w:val="num" w:pos="4680"/>
+        </w:tabs>
+        <w:ind w:left="4680" w:hanging="360"/>
+      </w:pPr>
+      <w:rPr>
+        <w:rFonts w:ascii="Wingdings" w:hAnsi="Wingdings" w:hint="default"/>
+        <w:sz w:val="20"/>
+      </w:rPr>
+    </w:lvl>
+    <w:lvl w:ilvl="6" w:tentative="1">
+      <w:start w:val="1"/>
+      <w:numFmt w:val="bullet"/>
+      <w:lvlText w:val=""/>
+      <w:lvlJc w:val="left"/>
+      <w:pPr>
+        <w:tabs>
+          <w:tab w:val="num" w:pos="5400"/>
+        </w:tabs>
+        <w:ind w:left="5400" w:hanging="360"/>
+      </w:pPr>
+      <w:rPr>
+        <w:rFonts w:ascii="Wingdings" w:hAnsi="Wingdings" w:hint="default"/>
+        <w:sz w:val="20"/>
+      </w:rPr>
+    </w:lvl>
+    <w:lvl w:ilvl="7" w:tentative="1">
+      <w:start w:val="1"/>
+      <w:numFmt w:val="bullet"/>
+      <w:lvlText w:val=""/>
+      <w:lvlJc w:val="left"/>
+      <w:pPr>
+        <w:tabs>
+          <w:tab w:val="num" w:pos="6120"/>
+        </w:tabs>
+        <w:ind w:left="6120" w:hanging="360"/>
+      </w:pPr>
+      <w:rPr>
+        <w:rFonts w:ascii="Wingdings" w:hAnsi="Wingdings" w:hint="default"/>
+        <w:sz w:val="20"/>
+      </w:rPr>
+    </w:lvl>
+    <w:lvl w:ilvl="8" w:tentative="1">
+      <w:start w:val="1"/>
+      <w:numFmt w:val="bullet"/>
+      <w:lvlText w:val=""/>
+      <w:lvlJc w:val="left"/>
+      <w:pPr>
+        <w:tabs>
+          <w:tab w:val="num" w:pos="6840"/>
+        </w:tabs>
+        <w:ind w:left="6840" w:hanging="360"/>
+      </w:pPr>
+      <w:rPr>
+        <w:rFonts w:ascii="Wingdings" w:hAnsi="Wingdings" w:hint="default"/>
+        <w:sz w:val="20"/>
+      </w:rPr>
+    </w:lvl>
+  </w:abstractNum>
+  <w:abstractNum w:abstractNumId="27" w15:restartNumberingAfterBreak="0">
     <w:nsid w:val="73FB41AE"/>
     <w:multiLevelType w:val="hybridMultilevel"/>
     <w:tmpl w:val="D6F62682"/>
@@ -17671,7 +19633,7 @@
       </w:pPr>
     </w:lvl>
   </w:abstractNum>
-  <w:abstractNum w:abstractNumId="22" w15:restartNumberingAfterBreak="0">
+  <w:abstractNum w:abstractNumId="28" w15:restartNumberingAfterBreak="0">
     <w:nsid w:val="75883D01"/>
     <w:multiLevelType w:val="hybridMultilevel"/>
     <w:tmpl w:val="08A4B7E4"/>
@@ -17757,7 +19719,7 @@
       </w:pPr>
     </w:lvl>
   </w:abstractNum>
-  <w:abstractNum w:abstractNumId="23" w15:restartNumberingAfterBreak="0">
+  <w:abstractNum w:abstractNumId="29" w15:restartNumberingAfterBreak="0">
     <w:nsid w:val="762008A4"/>
     <w:multiLevelType w:val="hybridMultilevel"/>
     <w:tmpl w:val="6EF299AA"/>
@@ -17878,7 +19840,7 @@
       </w:rPr>
     </w:lvl>
   </w:abstractNum>
-  <w:abstractNum w:abstractNumId="24" w15:restartNumberingAfterBreak="0">
+  <w:abstractNum w:abstractNumId="30" w15:restartNumberingAfterBreak="0">
     <w:nsid w:val="78104D44"/>
     <w:multiLevelType w:val="hybridMultilevel"/>
     <w:tmpl w:val="BAD05F3A"/>
@@ -17991,7 +19953,7 @@
       </w:rPr>
     </w:lvl>
   </w:abstractNum>
-  <w:abstractNum w:abstractNumId="25" w15:restartNumberingAfterBreak="0">
+  <w:abstractNum w:abstractNumId="31" w15:restartNumberingAfterBreak="0">
     <w:nsid w:val="7C761A78"/>
     <w:multiLevelType w:val="hybridMultilevel"/>
     <w:tmpl w:val="21981776"/>
@@ -18123,82 +20085,100 @@
     </w:lvl>
   </w:abstractNum>
   <w:num w:numId="1" w16cid:durableId="877090183">
-    <w:abstractNumId w:val="14"/>
+    <w:abstractNumId w:val="18"/>
   </w:num>
   <w:num w:numId="2" w16cid:durableId="475924124">
-    <w:abstractNumId w:val="10"/>
+    <w:abstractNumId w:val="13"/>
   </w:num>
   <w:num w:numId="3" w16cid:durableId="2012759613">
+    <w:abstractNumId w:val="20"/>
+  </w:num>
+  <w:num w:numId="4" w16cid:durableId="375391874">
+    <w:abstractNumId w:val="19"/>
+  </w:num>
+  <w:num w:numId="5" w16cid:durableId="1639528909">
+    <w:abstractNumId w:val="21"/>
+  </w:num>
+  <w:num w:numId="6" w16cid:durableId="1702585508">
     <w:abstractNumId w:val="16"/>
   </w:num>
-  <w:num w:numId="4" w16cid:durableId="375391874">
-    <w:abstractNumId w:val="15"/>
-  </w:num>
-  <w:num w:numId="5" w16cid:durableId="1639528909">
-    <w:abstractNumId w:val="17"/>
-  </w:num>
-  <w:num w:numId="6" w16cid:durableId="1702585508">
-    <w:abstractNumId w:val="12"/>
-  </w:num>
   <w:num w:numId="7" w16cid:durableId="942883525">
-    <w:abstractNumId w:val="18"/>
+    <w:abstractNumId w:val="22"/>
   </w:num>
   <w:num w:numId="8" w16cid:durableId="2026899589">
-    <w:abstractNumId w:val="7"/>
+    <w:abstractNumId w:val="8"/>
   </w:num>
   <w:num w:numId="9" w16cid:durableId="950280824">
     <w:abstractNumId w:val="1"/>
   </w:num>
   <w:num w:numId="10" w16cid:durableId="775909192">
+    <w:abstractNumId w:val="31"/>
+  </w:num>
+  <w:num w:numId="11" w16cid:durableId="957681745">
+    <w:abstractNumId w:val="29"/>
+  </w:num>
+  <w:num w:numId="12" w16cid:durableId="1191380890">
+    <w:abstractNumId w:val="12"/>
+  </w:num>
+  <w:num w:numId="13" w16cid:durableId="665783405">
+    <w:abstractNumId w:val="3"/>
+  </w:num>
+  <w:num w:numId="14" w16cid:durableId="1353148973">
     <w:abstractNumId w:val="25"/>
   </w:num>
-  <w:num w:numId="11" w16cid:durableId="957681745">
-    <w:abstractNumId w:val="23"/>
+  <w:num w:numId="15" w16cid:durableId="1025666829">
+    <w:abstractNumId w:val="4"/>
   </w:num>
-  <w:num w:numId="12" w16cid:durableId="1191380890">
+  <w:num w:numId="16" w16cid:durableId="1752657113">
+    <w:abstractNumId w:val="7"/>
+  </w:num>
+  <w:num w:numId="17" w16cid:durableId="703794347">
     <w:abstractNumId w:val="9"/>
   </w:num>
-  <w:num w:numId="13" w16cid:durableId="665783405">
-    <w:abstractNumId w:val="2"/>
-  </w:num>
-  <w:num w:numId="14" w16cid:durableId="1353148973">
-    <w:abstractNumId w:val="20"/>
-  </w:num>
-  <w:num w:numId="15" w16cid:durableId="1025666829">
-    <w:abstractNumId w:val="3"/>
-  </w:num>
-  <w:num w:numId="16" w16cid:durableId="1752657113">
-    <w:abstractNumId w:val="6"/>
-  </w:num>
-  <w:num w:numId="17" w16cid:durableId="703794347">
-    <w:abstractNumId w:val="8"/>
-  </w:num>
   <w:num w:numId="18" w16cid:durableId="2008820704">
-    <w:abstractNumId w:val="21"/>
+    <w:abstractNumId w:val="27"/>
   </w:num>
   <w:num w:numId="19" w16cid:durableId="306206851">
-    <w:abstractNumId w:val="11"/>
+    <w:abstractNumId w:val="15"/>
   </w:num>
   <w:num w:numId="20" w16cid:durableId="2042513559">
-    <w:abstractNumId w:val="19"/>
+    <w:abstractNumId w:val="24"/>
   </w:num>
   <w:num w:numId="21" w16cid:durableId="1963994991">
-    <w:abstractNumId w:val="24"/>
+    <w:abstractNumId w:val="30"/>
   </w:num>
   <w:num w:numId="22" w16cid:durableId="2117017027">
-    <w:abstractNumId w:val="22"/>
+    <w:abstractNumId w:val="28"/>
   </w:num>
   <w:num w:numId="23" w16cid:durableId="273439242">
     <w:abstractNumId w:val="0"/>
   </w:num>
   <w:num w:numId="24" w16cid:durableId="265311219">
+    <w:abstractNumId w:val="6"/>
+  </w:num>
+  <w:num w:numId="25" w16cid:durableId="190801601">
+    <w:abstractNumId w:val="17"/>
+  </w:num>
+  <w:num w:numId="26" w16cid:durableId="631524937">
     <w:abstractNumId w:val="5"/>
   </w:num>
-  <w:num w:numId="25" w16cid:durableId="190801601">
-    <w:abstractNumId w:val="13"/>
+  <w:num w:numId="27" w16cid:durableId="2022509727">
+    <w:abstractNumId w:val="11"/>
   </w:num>
-  <w:num w:numId="26" w16cid:durableId="631524937">
-    <w:abstractNumId w:val="4"/>
+  <w:num w:numId="28" w16cid:durableId="1884370034">
+    <w:abstractNumId w:val="23"/>
+  </w:num>
+  <w:num w:numId="29" w16cid:durableId="1977560038">
+    <w:abstractNumId w:val="26"/>
+  </w:num>
+  <w:num w:numId="30" w16cid:durableId="152643310">
+    <w:abstractNumId w:val="10"/>
+  </w:num>
+  <w:num w:numId="31" w16cid:durableId="765882178">
+    <w:abstractNumId w:val="14"/>
+  </w:num>
+  <w:num w:numId="32" w16cid:durableId="488790892">
+    <w:abstractNumId w:val="2"/>
   </w:num>
 </w:numbering>
 </file>
@@ -19007,6 +20987,17 @@
       <w:szCs w:val="20"/>
     </w:rPr>
   </w:style>
+  <w:style w:type="character" w:styleId="Textoennegrita">
+    <w:name w:val="Strong"/>
+    <w:basedOn w:val="Fuentedeprrafopredeter"/>
+    <w:uiPriority w:val="22"/>
+    <w:qFormat/>
+    <w:rsid w:val="00D70010"/>
+    <w:rPr>
+      <w:b/>
+      <w:bCs/>
+    </w:rPr>
+  </w:style>
 </w:styles>
 </file>
 

</xml_diff>